<commit_message>
docs: corrige orden de seccion de IA en Informe Tecnico
El encabezado 'Uso de herramientas de IA en el desarrollo' estaba insertado
despues de su contenido, dejando la seccion vacia y el texto bajo
'Responsabilidad'. Se mueve el encabezado antes de sus dos parrafos de
contenido para que la seccion quede completa.
</commit_message>
<xml_diff>
--- a/documentacion/Informe_Tecnico_LINE_APA.docx
+++ b/documentacion/Informe_Tecnico_LINE_APA.docx
@@ -5914,7 +5914,6 @@
           <w:i/>
           <w:color w:val="auto"/>
         </w:rPr>
-        <w:lastRenderedPageBreak/>
         <w:t>Selector de modelos y navegación</w:t>
       </w:r>
       <w:bookmarkEnd w:id="20"/>
@@ -5929,7 +5928,14 @@
         <w:rPr>
           <w:color w:val="auto"/>
         </w:rPr>
-        <w:t>La interfaz permite alternar entre CNN local (MobileNetV2), XGBoost y NVIDIA Nemotron, con el selector sincronizado entre la barra lateral y la pantalla de importación masiva. La navegación incluye las secciones de validación (análisis individual), importación masiva y soporte, con estados activos sincronizados.</w:t>
+        <w:t xml:space="preserve">La interfaz permite alternar entre CNN local (MobileNetV2), XGBoost y NVIDIA Nemotron, con el selector sincronizado entre la barra lateral y la pantalla de importación masiva. La navegación incluye las </w:t>
+      </w:r>
+      <w:r>
+        <w:rPr>
+          <w:color w:val="auto"/>
+        </w:rPr>
+        <w:lastRenderedPageBreak/>
+        <w:t>secciones de validación (análisis individual), importación masiva y soporte, con estados activos sincronizados.</w:t>
       </w:r>
     </w:p>
     <w:p>
@@ -6730,29 +6736,23 @@
         <w:rPr>
           <w:color w:val="auto"/>
         </w:rPr>
-        <w:t xml:space="preserve">La Tabla 5 resume el desempeño de los tres modelos evaluados sobre el conjunto de prueba (30% estratificado, semilla fija). Las métricas de la CNN corresponden a la fase de fine-tuning con umbral ajustado para recall; las de XGBoost corresponden al modelo final tras la búsqueda de hiperparámetros y </w:t>
+        <w:t>La Tabla 5 resume el desempeño de los tres modelos evaluados sobre el conjunto de prueba (30% estratificado, semilla fija). Las métricas de la CNN corresponden a la fase de fine-tuning con umbral ajustado para recall; las de XGBoost corresponden al modelo final tras la búsqueda de hiperparámetros y la validación cruzada de 5 particiones (AUC promedio en validación cruzada = 0.881, DE = 0.011, sin señales de sobreajuste).</w:t>
       </w:r>
+    </w:p>
+    <w:p>
+      <w:pPr>
+        <w:spacing w:before="200" w:after="80"/>
+        <w:rPr>
+          <w:color w:val="auto"/>
+        </w:rPr>
+      </w:pPr>
       <w:r>
         <w:rPr>
-          <w:color w:val="auto"/>
+          <w:i/>
+          <w:color w:val="auto"/>
+          <w:sz w:val="20"/>
         </w:rPr>
         <w:lastRenderedPageBreak/>
-        <w:t>la validación cruzada de 5 particiones (AUC promedio en validación cruzada = 0.881, DE = 0.011, sin señales de sobreajuste).</w:t>
-      </w:r>
-    </w:p>
-    <w:p>
-      <w:pPr>
-        <w:spacing w:before="200" w:after="80"/>
-        <w:rPr>
-          <w:color w:val="auto"/>
-        </w:rPr>
-      </w:pPr>
-      <w:r>
-        <w:rPr>
-          <w:i/>
-          <w:color w:val="auto"/>
-          <w:sz w:val="20"/>
-        </w:rPr>
         <w:t>Tabla 5. Comparación de desempeño entre modelos</w:t>
       </w:r>
     </w:p>
@@ -7401,14 +7401,7 @@
         <w:rPr>
           <w:color w:val="auto"/>
         </w:rPr>
-        <w:t xml:space="preserve">La implementación del sistema permitirá reducir las glosas mediante la detección temprana de servicios sin soporte, recuperar ingresos por la identificación de procedimientos no facturados y optimizar los </w:t>
-      </w:r>
-      <w:r>
-        <w:rPr>
-          <w:color w:val="auto"/>
-        </w:rPr>
-        <w:lastRenderedPageBreak/>
-        <w:t>recursos del equipo de auditoría al priorizar automáticamente los casos de mayor riesgo mediante el modelo XGBoost, en lugar de revisar la totalidad de las prefacturas de forma manual.</w:t>
+        <w:t>La implementación del sistema permitirá reducir las glosas mediante la detección temprana de servicios sin soporte, recuperar ingresos por la identificación de procedimientos no facturados y optimizar los recursos del equipo de auditoría al priorizar automáticamente los casos de mayor riesgo mediante el modelo XGBoost, en lugar de revisar la totalidad de las prefacturas de forma manual.</w:t>
       </w:r>
     </w:p>
     <w:p>
@@ -7561,32 +7554,29 @@
       </w:r>
     </w:p>
     <w:p>
-      <w:pPr/>
+      <w:pPr>
+        <w:pStyle w:val="Ttulo2"/>
+        <w:rPr>
+          <w:bCs w:val="0"/>
+          <w:color w:val="auto"/>
+        </w:rPr>
+      </w:pPr>
       <w:r>
         <w:rPr>
-          <w:b w:val="0"/>
-        </w:rPr>
+          <w:bCs w:val="0"/>
+          <w:color w:val="auto"/>
+        </w:rPr>
+        <w:t>Uso de herramientas de IA en el desarrollo</w:t>
+      </w:r>
+    </w:p>
+    <w:p>
+      <w:r>
         <w:t>El uso de estas herramientas no estaba prohibido por la institución educativa y se realizó en cumplimiento de las normas de integridad académica: todo el código, los análisis y las decisiones finales fueron revisados, corregidos y asumidos por el equipo.</w:t>
       </w:r>
     </w:p>
     <w:p>
-      <w:pPr/>
       <w:r>
-        <w:rPr>
-          <w:b w:val="0"/>
-        </w:rPr>
         <w:t>Durante el desarrollo del sistema se utilizaron herramientas de inteligencia artificial generativa como apoyo para el diseño de la interfaz, la revisión de código y la corrección de errores. Estas herramientas no participaron en la definición del alcance clínico, en el diseño metodológico de los modelos ni en la interpretación de los resultados, los cuales fueron definidos y validados por el equipo del proyecto.</w:t>
-      </w:r>
-    </w:p>
-    <w:p>
-      <w:pPr>
-        <w:pStyle w:val="Ttulo2"/>
-      </w:pPr>
-      <w:r>
-        <w:rPr>
-          <w:b w:val="0"/>
-        </w:rPr>
-        <w:t>Uso de herramientas de IA en el desarrollo</w:t>
       </w:r>
     </w:p>
     <w:p>
@@ -7633,6 +7623,7 @@
         <w:rPr>
           <w:color w:val="auto"/>
         </w:rPr>
+        <w:lastRenderedPageBreak/>
         <w:t>Documentación de cumplimiento</w:t>
       </w:r>
       <w:bookmarkEnd w:id="36"/>
@@ -7707,7 +7698,6 @@
         <w:rPr>
           <w:color w:val="auto"/>
         </w:rPr>
-        <w:lastRenderedPageBreak/>
         <w:t>Política de Retención y Supresión (POLITICA_RETENCION.md) — Plazos de retención por tipo de dato y mecanismos de eliminación segura.</w:t>
       </w:r>
     </w:p>
@@ -7916,6 +7906,7 @@
         <w:rPr>
           <w:color w:val="auto"/>
         </w:rPr>
+        <w:lastRenderedPageBreak/>
         <w:t>Estado actual y próximos pasos</w:t>
       </w:r>
       <w:bookmarkEnd w:id="39"/>

</xml_diff>

<commit_message>
docs: actualiza Informe Tecnico con TOC que incluye seccion de IA
Version re-guardada en Word: el indice ahora incluye la subseccion
'Uso de herramientas de IA en el desarrollo' con paginas recalculadas.
</commit_message>
<xml_diff>
--- a/documentacion/Informe_Tecnico_LINE_APA.docx
+++ b/documentacion/Informe_Tecnico_LINE_APA.docx
@@ -289,7 +289,7 @@
           <w:color w:val="auto"/>
         </w:rPr>
       </w:pPr>
-      <w:bookmarkStart w:id="0" w:name="_Toc236323997"/>
+      <w:bookmarkStart w:id="0" w:name="_Toc236395919"/>
       <w:r>
         <w:rPr>
           <w:color w:val="auto"/>
@@ -306,7 +306,14 @@
           <w:tab w:val="right" w:leader="dot" w:pos="9396"/>
         </w:tabs>
         <w:rPr>
+          <w:rFonts w:asciiTheme="minorHAnsi" w:eastAsiaTheme="minorEastAsia" w:hAnsiTheme="minorHAnsi"/>
           <w:noProof/>
+          <w:color w:val="auto"/>
+          <w:kern w:val="2"/>
+          <w:sz w:val="24"/>
+          <w:szCs w:val="24"/>
+          <w:lang w:val="es-CO" w:eastAsia="es-CO"/>
+          <w14:ligatures w14:val="standardContextual"/>
         </w:rPr>
       </w:pPr>
       <w:r>
@@ -327,7 +334,7 @@
         </w:rPr>
         <w:fldChar w:fldCharType="separate"/>
       </w:r>
-      <w:hyperlink w:anchor="_Toc236323997" w:history="1">
+      <w:hyperlink w:anchor="_Toc236395919" w:history="1">
         <w:r>
           <w:rPr>
             <w:rStyle w:val="Hipervnculo"/>
@@ -354,7 +361,7 @@
             <w:noProof/>
             <w:webHidden/>
           </w:rPr>
-          <w:instrText xml:space="preserve"> PAGEREF _Toc236323997 \h </w:instrText>
+          <w:instrText xml:space="preserve"> PAGEREF _Toc236395919 \h </w:instrText>
         </w:r>
         <w:r>
           <w:rPr>
@@ -392,10 +399,17 @@
           <w:tab w:val="right" w:leader="dot" w:pos="9396"/>
         </w:tabs>
         <w:rPr>
+          <w:rFonts w:asciiTheme="minorHAnsi" w:eastAsiaTheme="minorEastAsia" w:hAnsiTheme="minorHAnsi"/>
           <w:noProof/>
-        </w:rPr>
-      </w:pPr>
-      <w:hyperlink w:anchor="_Toc236323998" w:history="1">
+          <w:color w:val="auto"/>
+          <w:kern w:val="2"/>
+          <w:sz w:val="24"/>
+          <w:szCs w:val="24"/>
+          <w:lang w:val="es-CO" w:eastAsia="es-CO"/>
+          <w14:ligatures w14:val="standardContextual"/>
+        </w:rPr>
+      </w:pPr>
+      <w:hyperlink w:anchor="_Toc236395920" w:history="1">
         <w:r>
           <w:rPr>
             <w:rStyle w:val="Hipervnculo"/>
@@ -422,7 +436,7 @@
             <w:noProof/>
             <w:webHidden/>
           </w:rPr>
-          <w:instrText xml:space="preserve"> PAGEREF _Toc236323998 \h </w:instrText>
+          <w:instrText xml:space="preserve"> PAGEREF _Toc236395920 \h </w:instrText>
         </w:r>
         <w:r>
           <w:rPr>
@@ -460,10 +474,17 @@
           <w:tab w:val="right" w:leader="dot" w:pos="9396"/>
         </w:tabs>
         <w:rPr>
+          <w:rFonts w:asciiTheme="minorHAnsi" w:eastAsiaTheme="minorEastAsia" w:hAnsiTheme="minorHAnsi"/>
           <w:noProof/>
-        </w:rPr>
-      </w:pPr>
-      <w:hyperlink w:anchor="_Toc236323999" w:history="1">
+          <w:color w:val="auto"/>
+          <w:kern w:val="2"/>
+          <w:sz w:val="24"/>
+          <w:szCs w:val="24"/>
+          <w:lang w:val="es-CO" w:eastAsia="es-CO"/>
+          <w14:ligatures w14:val="standardContextual"/>
+        </w:rPr>
+      </w:pPr>
+      <w:hyperlink w:anchor="_Toc236395921" w:history="1">
         <w:r>
           <w:rPr>
             <w:rStyle w:val="Hipervnculo"/>
@@ -490,7 +511,7 @@
             <w:noProof/>
             <w:webHidden/>
           </w:rPr>
-          <w:instrText xml:space="preserve"> PAGEREF _Toc236323999 \h </w:instrText>
+          <w:instrText xml:space="preserve"> PAGEREF _Toc236395921 \h </w:instrText>
         </w:r>
         <w:r>
           <w:rPr>
@@ -528,10 +549,17 @@
           <w:tab w:val="right" w:leader="dot" w:pos="9396"/>
         </w:tabs>
         <w:rPr>
+          <w:rFonts w:asciiTheme="minorHAnsi" w:eastAsiaTheme="minorEastAsia" w:hAnsiTheme="minorHAnsi"/>
           <w:noProof/>
-        </w:rPr>
-      </w:pPr>
-      <w:hyperlink w:anchor="_Toc236324000" w:history="1">
+          <w:color w:val="auto"/>
+          <w:kern w:val="2"/>
+          <w:sz w:val="24"/>
+          <w:szCs w:val="24"/>
+          <w:lang w:val="es-CO" w:eastAsia="es-CO"/>
+          <w14:ligatures w14:val="standardContextual"/>
+        </w:rPr>
+      </w:pPr>
+      <w:hyperlink w:anchor="_Toc236395922" w:history="1">
         <w:r>
           <w:rPr>
             <w:rStyle w:val="Hipervnculo"/>
@@ -558,7 +586,7 @@
             <w:noProof/>
             <w:webHidden/>
           </w:rPr>
-          <w:instrText xml:space="preserve"> PAGEREF _Toc236324000 \h </w:instrText>
+          <w:instrText xml:space="preserve"> PAGEREF _Toc236395922 \h </w:instrText>
         </w:r>
         <w:r>
           <w:rPr>
@@ -596,10 +624,17 @@
           <w:tab w:val="right" w:leader="dot" w:pos="9396"/>
         </w:tabs>
         <w:rPr>
+          <w:rFonts w:asciiTheme="minorHAnsi" w:eastAsiaTheme="minorEastAsia" w:hAnsiTheme="minorHAnsi"/>
           <w:noProof/>
-        </w:rPr>
-      </w:pPr>
-      <w:hyperlink w:anchor="_Toc236324001" w:history="1">
+          <w:color w:val="auto"/>
+          <w:kern w:val="2"/>
+          <w:sz w:val="24"/>
+          <w:szCs w:val="24"/>
+          <w:lang w:val="es-CO" w:eastAsia="es-CO"/>
+          <w14:ligatures w14:val="standardContextual"/>
+        </w:rPr>
+      </w:pPr>
+      <w:hyperlink w:anchor="_Toc236395923" w:history="1">
         <w:r>
           <w:rPr>
             <w:rStyle w:val="Hipervnculo"/>
@@ -626,7 +661,7 @@
             <w:noProof/>
             <w:webHidden/>
           </w:rPr>
-          <w:instrText xml:space="preserve"> PAGEREF _Toc236324001 \h </w:instrText>
+          <w:instrText xml:space="preserve"> PAGEREF _Toc236395923 \h </w:instrText>
         </w:r>
         <w:r>
           <w:rPr>
@@ -664,10 +699,17 @@
           <w:tab w:val="right" w:leader="dot" w:pos="9396"/>
         </w:tabs>
         <w:rPr>
+          <w:rFonts w:asciiTheme="minorHAnsi" w:eastAsiaTheme="minorEastAsia" w:hAnsiTheme="minorHAnsi"/>
           <w:noProof/>
-        </w:rPr>
-      </w:pPr>
-      <w:hyperlink w:anchor="_Toc236324002" w:history="1">
+          <w:color w:val="auto"/>
+          <w:kern w:val="2"/>
+          <w:sz w:val="24"/>
+          <w:szCs w:val="24"/>
+          <w:lang w:val="es-CO" w:eastAsia="es-CO"/>
+          <w14:ligatures w14:val="standardContextual"/>
+        </w:rPr>
+      </w:pPr>
+      <w:hyperlink w:anchor="_Toc236395924" w:history="1">
         <w:r>
           <w:rPr>
             <w:rStyle w:val="Hipervnculo"/>
@@ -694,7 +736,7 @@
             <w:noProof/>
             <w:webHidden/>
           </w:rPr>
-          <w:instrText xml:space="preserve"> PAGEREF _Toc236324002 \h </w:instrText>
+          <w:instrText xml:space="preserve"> PAGEREF _Toc236395924 \h </w:instrText>
         </w:r>
         <w:r>
           <w:rPr>
@@ -732,10 +774,17 @@
           <w:tab w:val="right" w:leader="dot" w:pos="9396"/>
         </w:tabs>
         <w:rPr>
+          <w:rFonts w:asciiTheme="minorHAnsi" w:eastAsiaTheme="minorEastAsia" w:hAnsiTheme="minorHAnsi"/>
           <w:noProof/>
-        </w:rPr>
-      </w:pPr>
-      <w:hyperlink w:anchor="_Toc236324003" w:history="1">
+          <w:color w:val="auto"/>
+          <w:kern w:val="2"/>
+          <w:sz w:val="24"/>
+          <w:szCs w:val="24"/>
+          <w:lang w:val="es-CO" w:eastAsia="es-CO"/>
+          <w14:ligatures w14:val="standardContextual"/>
+        </w:rPr>
+      </w:pPr>
+      <w:hyperlink w:anchor="_Toc236395925" w:history="1">
         <w:r>
           <w:rPr>
             <w:rStyle w:val="Hipervnculo"/>
@@ -762,7 +811,7 @@
             <w:noProof/>
             <w:webHidden/>
           </w:rPr>
-          <w:instrText xml:space="preserve"> PAGEREF _Toc236324003 \h </w:instrText>
+          <w:instrText xml:space="preserve"> PAGEREF _Toc236395925 \h </w:instrText>
         </w:r>
         <w:r>
           <w:rPr>
@@ -800,10 +849,17 @@
           <w:tab w:val="right" w:leader="dot" w:pos="9396"/>
         </w:tabs>
         <w:rPr>
+          <w:rFonts w:asciiTheme="minorHAnsi" w:eastAsiaTheme="minorEastAsia" w:hAnsiTheme="minorHAnsi"/>
           <w:noProof/>
-        </w:rPr>
-      </w:pPr>
-      <w:hyperlink w:anchor="_Toc236324004" w:history="1">
+          <w:color w:val="auto"/>
+          <w:kern w:val="2"/>
+          <w:sz w:val="24"/>
+          <w:szCs w:val="24"/>
+          <w:lang w:val="es-CO" w:eastAsia="es-CO"/>
+          <w14:ligatures w14:val="standardContextual"/>
+        </w:rPr>
+      </w:pPr>
+      <w:hyperlink w:anchor="_Toc236395926" w:history="1">
         <w:r>
           <w:rPr>
             <w:rStyle w:val="Hipervnculo"/>
@@ -830,7 +886,7 @@
             <w:noProof/>
             <w:webHidden/>
           </w:rPr>
-          <w:instrText xml:space="preserve"> PAGEREF _Toc236324004 \h </w:instrText>
+          <w:instrText xml:space="preserve"> PAGEREF _Toc236395926 \h </w:instrText>
         </w:r>
         <w:r>
           <w:rPr>
@@ -868,10 +924,17 @@
           <w:tab w:val="right" w:leader="dot" w:pos="9396"/>
         </w:tabs>
         <w:rPr>
+          <w:rFonts w:asciiTheme="minorHAnsi" w:eastAsiaTheme="minorEastAsia" w:hAnsiTheme="minorHAnsi"/>
           <w:noProof/>
-        </w:rPr>
-      </w:pPr>
-      <w:hyperlink w:anchor="_Toc236324005" w:history="1">
+          <w:color w:val="auto"/>
+          <w:kern w:val="2"/>
+          <w:sz w:val="24"/>
+          <w:szCs w:val="24"/>
+          <w:lang w:val="es-CO" w:eastAsia="es-CO"/>
+          <w14:ligatures w14:val="standardContextual"/>
+        </w:rPr>
+      </w:pPr>
+      <w:hyperlink w:anchor="_Toc236395927" w:history="1">
         <w:r>
           <w:rPr>
             <w:rStyle w:val="Hipervnculo"/>
@@ -899,7 +962,7 @@
             <w:noProof/>
             <w:webHidden/>
           </w:rPr>
-          <w:instrText xml:space="preserve"> PAGEREF _Toc236324005 \h </w:instrText>
+          <w:instrText xml:space="preserve"> PAGEREF _Toc236395927 \h </w:instrText>
         </w:r>
         <w:r>
           <w:rPr>
@@ -937,10 +1000,17 @@
           <w:tab w:val="right" w:leader="dot" w:pos="9396"/>
         </w:tabs>
         <w:rPr>
+          <w:rFonts w:asciiTheme="minorHAnsi" w:eastAsiaTheme="minorEastAsia" w:hAnsiTheme="minorHAnsi"/>
           <w:noProof/>
-        </w:rPr>
-      </w:pPr>
-      <w:hyperlink w:anchor="_Toc236324006" w:history="1">
+          <w:color w:val="auto"/>
+          <w:kern w:val="2"/>
+          <w:sz w:val="24"/>
+          <w:szCs w:val="24"/>
+          <w:lang w:val="es-CO" w:eastAsia="es-CO"/>
+          <w14:ligatures w14:val="standardContextual"/>
+        </w:rPr>
+      </w:pPr>
+      <w:hyperlink w:anchor="_Toc236395928" w:history="1">
         <w:r>
           <w:rPr>
             <w:rStyle w:val="Hipervnculo"/>
@@ -967,7 +1037,7 @@
             <w:noProof/>
             <w:webHidden/>
           </w:rPr>
-          <w:instrText xml:space="preserve"> PAGEREF _Toc236324006 \h </w:instrText>
+          <w:instrText xml:space="preserve"> PAGEREF _Toc236395928 \h </w:instrText>
         </w:r>
         <w:r>
           <w:rPr>
@@ -1005,10 +1075,17 @@
           <w:tab w:val="right" w:leader="dot" w:pos="9396"/>
         </w:tabs>
         <w:rPr>
+          <w:rFonts w:asciiTheme="minorHAnsi" w:eastAsiaTheme="minorEastAsia" w:hAnsiTheme="minorHAnsi"/>
           <w:noProof/>
-        </w:rPr>
-      </w:pPr>
-      <w:hyperlink w:anchor="_Toc236324007" w:history="1">
+          <w:color w:val="auto"/>
+          <w:kern w:val="2"/>
+          <w:sz w:val="24"/>
+          <w:szCs w:val="24"/>
+          <w:lang w:val="es-CO" w:eastAsia="es-CO"/>
+          <w14:ligatures w14:val="standardContextual"/>
+        </w:rPr>
+      </w:pPr>
+      <w:hyperlink w:anchor="_Toc236395929" w:history="1">
         <w:r>
           <w:rPr>
             <w:rStyle w:val="Hipervnculo"/>
@@ -1035,7 +1112,7 @@
             <w:noProof/>
             <w:webHidden/>
           </w:rPr>
-          <w:instrText xml:space="preserve"> PAGEREF _Toc236324007 \h </w:instrText>
+          <w:instrText xml:space="preserve"> PAGEREF _Toc236395929 \h </w:instrText>
         </w:r>
         <w:r>
           <w:rPr>
@@ -1073,10 +1150,17 @@
           <w:tab w:val="right" w:leader="dot" w:pos="9396"/>
         </w:tabs>
         <w:rPr>
+          <w:rFonts w:asciiTheme="minorHAnsi" w:eastAsiaTheme="minorEastAsia" w:hAnsiTheme="minorHAnsi"/>
           <w:noProof/>
-        </w:rPr>
-      </w:pPr>
-      <w:hyperlink w:anchor="_Toc236324008" w:history="1">
+          <w:color w:val="auto"/>
+          <w:kern w:val="2"/>
+          <w:sz w:val="24"/>
+          <w:szCs w:val="24"/>
+          <w:lang w:val="es-CO" w:eastAsia="es-CO"/>
+          <w14:ligatures w14:val="standardContextual"/>
+        </w:rPr>
+      </w:pPr>
+      <w:hyperlink w:anchor="_Toc236395930" w:history="1">
         <w:r>
           <w:rPr>
             <w:rStyle w:val="Hipervnculo"/>
@@ -1103,7 +1187,7 @@
             <w:noProof/>
             <w:webHidden/>
           </w:rPr>
-          <w:instrText xml:space="preserve"> PAGEREF _Toc236324008 \h </w:instrText>
+          <w:instrText xml:space="preserve"> PAGEREF _Toc236395930 \h </w:instrText>
         </w:r>
         <w:r>
           <w:rPr>
@@ -1141,10 +1225,17 @@
           <w:tab w:val="right" w:leader="dot" w:pos="9396"/>
         </w:tabs>
         <w:rPr>
+          <w:rFonts w:asciiTheme="minorHAnsi" w:eastAsiaTheme="minorEastAsia" w:hAnsiTheme="minorHAnsi"/>
           <w:noProof/>
-        </w:rPr>
-      </w:pPr>
-      <w:hyperlink w:anchor="_Toc236324009" w:history="1">
+          <w:color w:val="auto"/>
+          <w:kern w:val="2"/>
+          <w:sz w:val="24"/>
+          <w:szCs w:val="24"/>
+          <w:lang w:val="es-CO" w:eastAsia="es-CO"/>
+          <w14:ligatures w14:val="standardContextual"/>
+        </w:rPr>
+      </w:pPr>
+      <w:hyperlink w:anchor="_Toc236395931" w:history="1">
         <w:r>
           <w:rPr>
             <w:rStyle w:val="Hipervnculo"/>
@@ -1171,7 +1262,7 @@
             <w:noProof/>
             <w:webHidden/>
           </w:rPr>
-          <w:instrText xml:space="preserve"> PAGEREF _Toc236324009 \h </w:instrText>
+          <w:instrText xml:space="preserve"> PAGEREF _Toc236395931 \h </w:instrText>
         </w:r>
         <w:r>
           <w:rPr>
@@ -1209,10 +1300,17 @@
           <w:tab w:val="right" w:leader="dot" w:pos="9396"/>
         </w:tabs>
         <w:rPr>
+          <w:rFonts w:asciiTheme="minorHAnsi" w:eastAsiaTheme="minorEastAsia" w:hAnsiTheme="minorHAnsi"/>
           <w:noProof/>
-        </w:rPr>
-      </w:pPr>
-      <w:hyperlink w:anchor="_Toc236324010" w:history="1">
+          <w:color w:val="auto"/>
+          <w:kern w:val="2"/>
+          <w:sz w:val="24"/>
+          <w:szCs w:val="24"/>
+          <w:lang w:val="es-CO" w:eastAsia="es-CO"/>
+          <w14:ligatures w14:val="standardContextual"/>
+        </w:rPr>
+      </w:pPr>
+      <w:hyperlink w:anchor="_Toc236395932" w:history="1">
         <w:r>
           <w:rPr>
             <w:rStyle w:val="Hipervnculo"/>
@@ -1239,7 +1337,7 @@
             <w:noProof/>
             <w:webHidden/>
           </w:rPr>
-          <w:instrText xml:space="preserve"> PAGEREF _Toc236324010 \h </w:instrText>
+          <w:instrText xml:space="preserve"> PAGEREF _Toc236395932 \h </w:instrText>
         </w:r>
         <w:r>
           <w:rPr>
@@ -1277,10 +1375,17 @@
           <w:tab w:val="right" w:leader="dot" w:pos="9396"/>
         </w:tabs>
         <w:rPr>
+          <w:rFonts w:asciiTheme="minorHAnsi" w:eastAsiaTheme="minorEastAsia" w:hAnsiTheme="minorHAnsi"/>
           <w:noProof/>
-        </w:rPr>
-      </w:pPr>
-      <w:hyperlink w:anchor="_Toc236324011" w:history="1">
+          <w:color w:val="auto"/>
+          <w:kern w:val="2"/>
+          <w:sz w:val="24"/>
+          <w:szCs w:val="24"/>
+          <w:lang w:val="es-CO" w:eastAsia="es-CO"/>
+          <w14:ligatures w14:val="standardContextual"/>
+        </w:rPr>
+      </w:pPr>
+      <w:hyperlink w:anchor="_Toc236395933" w:history="1">
         <w:r>
           <w:rPr>
             <w:rStyle w:val="Hipervnculo"/>
@@ -1307,7 +1412,7 @@
             <w:noProof/>
             <w:webHidden/>
           </w:rPr>
-          <w:instrText xml:space="preserve"> PAGEREF _Toc236324011 \h </w:instrText>
+          <w:instrText xml:space="preserve"> PAGEREF _Toc236395933 \h </w:instrText>
         </w:r>
         <w:r>
           <w:rPr>
@@ -1345,10 +1450,17 @@
           <w:tab w:val="right" w:leader="dot" w:pos="9396"/>
         </w:tabs>
         <w:rPr>
+          <w:rFonts w:asciiTheme="minorHAnsi" w:eastAsiaTheme="minorEastAsia" w:hAnsiTheme="minorHAnsi"/>
           <w:noProof/>
-        </w:rPr>
-      </w:pPr>
-      <w:hyperlink w:anchor="_Toc236324012" w:history="1">
+          <w:color w:val="auto"/>
+          <w:kern w:val="2"/>
+          <w:sz w:val="24"/>
+          <w:szCs w:val="24"/>
+          <w:lang w:val="es-CO" w:eastAsia="es-CO"/>
+          <w14:ligatures w14:val="standardContextual"/>
+        </w:rPr>
+      </w:pPr>
+      <w:hyperlink w:anchor="_Toc236395934" w:history="1">
         <w:r>
           <w:rPr>
             <w:rStyle w:val="Hipervnculo"/>
@@ -1375,7 +1487,7 @@
             <w:noProof/>
             <w:webHidden/>
           </w:rPr>
-          <w:instrText xml:space="preserve"> PAGEREF _Toc236324012 \h </w:instrText>
+          <w:instrText xml:space="preserve"> PAGEREF _Toc236395934 \h </w:instrText>
         </w:r>
         <w:r>
           <w:rPr>
@@ -1413,10 +1525,17 @@
           <w:tab w:val="right" w:leader="dot" w:pos="9396"/>
         </w:tabs>
         <w:rPr>
+          <w:rFonts w:asciiTheme="minorHAnsi" w:eastAsiaTheme="minorEastAsia" w:hAnsiTheme="minorHAnsi"/>
           <w:noProof/>
-        </w:rPr>
-      </w:pPr>
-      <w:hyperlink w:anchor="_Toc236324013" w:history="1">
+          <w:color w:val="auto"/>
+          <w:kern w:val="2"/>
+          <w:sz w:val="24"/>
+          <w:szCs w:val="24"/>
+          <w:lang w:val="es-CO" w:eastAsia="es-CO"/>
+          <w14:ligatures w14:val="standardContextual"/>
+        </w:rPr>
+      </w:pPr>
+      <w:hyperlink w:anchor="_Toc236395935" w:history="1">
         <w:r>
           <w:rPr>
             <w:rStyle w:val="Hipervnculo"/>
@@ -1443,7 +1562,7 @@
             <w:noProof/>
             <w:webHidden/>
           </w:rPr>
-          <w:instrText xml:space="preserve"> PAGEREF _Toc236324013 \h </w:instrText>
+          <w:instrText xml:space="preserve"> PAGEREF _Toc236395935 \h </w:instrText>
         </w:r>
         <w:r>
           <w:rPr>
@@ -1481,10 +1600,17 @@
           <w:tab w:val="right" w:leader="dot" w:pos="9396"/>
         </w:tabs>
         <w:rPr>
+          <w:rFonts w:asciiTheme="minorHAnsi" w:eastAsiaTheme="minorEastAsia" w:hAnsiTheme="minorHAnsi"/>
           <w:noProof/>
-        </w:rPr>
-      </w:pPr>
-      <w:hyperlink w:anchor="_Toc236324014" w:history="1">
+          <w:color w:val="auto"/>
+          <w:kern w:val="2"/>
+          <w:sz w:val="24"/>
+          <w:szCs w:val="24"/>
+          <w:lang w:val="es-CO" w:eastAsia="es-CO"/>
+          <w14:ligatures w14:val="standardContextual"/>
+        </w:rPr>
+      </w:pPr>
+      <w:hyperlink w:anchor="_Toc236395936" w:history="1">
         <w:r>
           <w:rPr>
             <w:rStyle w:val="Hipervnculo"/>
@@ -1511,7 +1637,7 @@
             <w:noProof/>
             <w:webHidden/>
           </w:rPr>
-          <w:instrText xml:space="preserve"> PAGEREF _Toc236324014 \h </w:instrText>
+          <w:instrText xml:space="preserve"> PAGEREF _Toc236395936 \h </w:instrText>
         </w:r>
         <w:r>
           <w:rPr>
@@ -1549,10 +1675,17 @@
           <w:tab w:val="right" w:leader="dot" w:pos="9396"/>
         </w:tabs>
         <w:rPr>
+          <w:rFonts w:asciiTheme="minorHAnsi" w:eastAsiaTheme="minorEastAsia" w:hAnsiTheme="minorHAnsi"/>
           <w:noProof/>
-        </w:rPr>
-      </w:pPr>
-      <w:hyperlink w:anchor="_Toc236324015" w:history="1">
+          <w:color w:val="auto"/>
+          <w:kern w:val="2"/>
+          <w:sz w:val="24"/>
+          <w:szCs w:val="24"/>
+          <w:lang w:val="es-CO" w:eastAsia="es-CO"/>
+          <w14:ligatures w14:val="standardContextual"/>
+        </w:rPr>
+      </w:pPr>
+      <w:hyperlink w:anchor="_Toc236395937" w:history="1">
         <w:r>
           <w:rPr>
             <w:rStyle w:val="Hipervnculo"/>
@@ -1580,7 +1713,7 @@
             <w:noProof/>
             <w:webHidden/>
           </w:rPr>
-          <w:instrText xml:space="preserve"> PAGEREF _Toc236324015 \h </w:instrText>
+          <w:instrText xml:space="preserve"> PAGEREF _Toc236395937 \h </w:instrText>
         </w:r>
         <w:r>
           <w:rPr>
@@ -1618,10 +1751,17 @@
           <w:tab w:val="right" w:leader="dot" w:pos="9396"/>
         </w:tabs>
         <w:rPr>
+          <w:rFonts w:asciiTheme="minorHAnsi" w:eastAsiaTheme="minorEastAsia" w:hAnsiTheme="minorHAnsi"/>
           <w:noProof/>
-        </w:rPr>
-      </w:pPr>
-      <w:hyperlink w:anchor="_Toc236324016" w:history="1">
+          <w:color w:val="auto"/>
+          <w:kern w:val="2"/>
+          <w:sz w:val="24"/>
+          <w:szCs w:val="24"/>
+          <w:lang w:val="es-CO" w:eastAsia="es-CO"/>
+          <w14:ligatures w14:val="standardContextual"/>
+        </w:rPr>
+      </w:pPr>
+      <w:hyperlink w:anchor="_Toc236395938" w:history="1">
         <w:r>
           <w:rPr>
             <w:rStyle w:val="Hipervnculo"/>
@@ -1649,7 +1789,7 @@
             <w:noProof/>
             <w:webHidden/>
           </w:rPr>
-          <w:instrText xml:space="preserve"> PAGEREF _Toc236324016 \h </w:instrText>
+          <w:instrText xml:space="preserve"> PAGEREF _Toc236395938 \h </w:instrText>
         </w:r>
         <w:r>
           <w:rPr>
@@ -1687,10 +1827,17 @@
           <w:tab w:val="right" w:leader="dot" w:pos="9396"/>
         </w:tabs>
         <w:rPr>
+          <w:rFonts w:asciiTheme="minorHAnsi" w:eastAsiaTheme="minorEastAsia" w:hAnsiTheme="minorHAnsi"/>
           <w:noProof/>
-        </w:rPr>
-      </w:pPr>
-      <w:hyperlink w:anchor="_Toc236324017" w:history="1">
+          <w:color w:val="auto"/>
+          <w:kern w:val="2"/>
+          <w:sz w:val="24"/>
+          <w:szCs w:val="24"/>
+          <w:lang w:val="es-CO" w:eastAsia="es-CO"/>
+          <w14:ligatures w14:val="standardContextual"/>
+        </w:rPr>
+      </w:pPr>
+      <w:hyperlink w:anchor="_Toc236395939" w:history="1">
         <w:r>
           <w:rPr>
             <w:rStyle w:val="Hipervnculo"/>
@@ -1718,7 +1865,7 @@
             <w:noProof/>
             <w:webHidden/>
           </w:rPr>
-          <w:instrText xml:space="preserve"> PAGEREF _Toc236324017 \h </w:instrText>
+          <w:instrText xml:space="preserve"> PAGEREF _Toc236395939 \h </w:instrText>
         </w:r>
         <w:r>
           <w:rPr>
@@ -1738,7 +1885,7 @@
             <w:noProof/>
             <w:webHidden/>
           </w:rPr>
-          <w:t>9</w:t>
+          <w:t>8</w:t>
         </w:r>
         <w:r>
           <w:rPr>
@@ -1756,10 +1903,17 @@
           <w:tab w:val="right" w:leader="dot" w:pos="9396"/>
         </w:tabs>
         <w:rPr>
+          <w:rFonts w:asciiTheme="minorHAnsi" w:eastAsiaTheme="minorEastAsia" w:hAnsiTheme="minorHAnsi"/>
           <w:noProof/>
-        </w:rPr>
-      </w:pPr>
-      <w:hyperlink w:anchor="_Toc236324018" w:history="1">
+          <w:color w:val="auto"/>
+          <w:kern w:val="2"/>
+          <w:sz w:val="24"/>
+          <w:szCs w:val="24"/>
+          <w:lang w:val="es-CO" w:eastAsia="es-CO"/>
+          <w14:ligatures w14:val="standardContextual"/>
+        </w:rPr>
+      </w:pPr>
+      <w:hyperlink w:anchor="_Toc236395940" w:history="1">
         <w:r>
           <w:rPr>
             <w:rStyle w:val="Hipervnculo"/>
@@ -1786,7 +1940,7 @@
             <w:noProof/>
             <w:webHidden/>
           </w:rPr>
-          <w:instrText xml:space="preserve"> PAGEREF _Toc236324018 \h </w:instrText>
+          <w:instrText xml:space="preserve"> PAGEREF _Toc236395940 \h </w:instrText>
         </w:r>
         <w:r>
           <w:rPr>
@@ -1824,10 +1978,17 @@
           <w:tab w:val="right" w:leader="dot" w:pos="9396"/>
         </w:tabs>
         <w:rPr>
+          <w:rFonts w:asciiTheme="minorHAnsi" w:eastAsiaTheme="minorEastAsia" w:hAnsiTheme="minorHAnsi"/>
           <w:noProof/>
-        </w:rPr>
-      </w:pPr>
-      <w:hyperlink w:anchor="_Toc236324019" w:history="1">
+          <w:color w:val="auto"/>
+          <w:kern w:val="2"/>
+          <w:sz w:val="24"/>
+          <w:szCs w:val="24"/>
+          <w:lang w:val="es-CO" w:eastAsia="es-CO"/>
+          <w14:ligatures w14:val="standardContextual"/>
+        </w:rPr>
+      </w:pPr>
+      <w:hyperlink w:anchor="_Toc236395941" w:history="1">
         <w:r>
           <w:rPr>
             <w:rStyle w:val="Hipervnculo"/>
@@ -1854,7 +2015,7 @@
             <w:noProof/>
             <w:webHidden/>
           </w:rPr>
-          <w:instrText xml:space="preserve"> PAGEREF _Toc236324019 \h </w:instrText>
+          <w:instrText xml:space="preserve"> PAGEREF _Toc236395941 \h </w:instrText>
         </w:r>
         <w:r>
           <w:rPr>
@@ -1892,10 +2053,17 @@
           <w:tab w:val="right" w:leader="dot" w:pos="9396"/>
         </w:tabs>
         <w:rPr>
+          <w:rFonts w:asciiTheme="minorHAnsi" w:eastAsiaTheme="minorEastAsia" w:hAnsiTheme="minorHAnsi"/>
           <w:noProof/>
-        </w:rPr>
-      </w:pPr>
-      <w:hyperlink w:anchor="_Toc236324020" w:history="1">
+          <w:color w:val="auto"/>
+          <w:kern w:val="2"/>
+          <w:sz w:val="24"/>
+          <w:szCs w:val="24"/>
+          <w:lang w:val="es-CO" w:eastAsia="es-CO"/>
+          <w14:ligatures w14:val="standardContextual"/>
+        </w:rPr>
+      </w:pPr>
+      <w:hyperlink w:anchor="_Toc236395942" w:history="1">
         <w:r>
           <w:rPr>
             <w:rStyle w:val="Hipervnculo"/>
@@ -1922,7 +2090,7 @@
             <w:noProof/>
             <w:webHidden/>
           </w:rPr>
-          <w:instrText xml:space="preserve"> PAGEREF _Toc236324020 \h </w:instrText>
+          <w:instrText xml:space="preserve"> PAGEREF _Toc236395942 \h </w:instrText>
         </w:r>
         <w:r>
           <w:rPr>
@@ -1960,10 +2128,17 @@
           <w:tab w:val="right" w:leader="dot" w:pos="9396"/>
         </w:tabs>
         <w:rPr>
+          <w:rFonts w:asciiTheme="minorHAnsi" w:eastAsiaTheme="minorEastAsia" w:hAnsiTheme="minorHAnsi"/>
           <w:noProof/>
-        </w:rPr>
-      </w:pPr>
-      <w:hyperlink w:anchor="_Toc236324021" w:history="1">
+          <w:color w:val="auto"/>
+          <w:kern w:val="2"/>
+          <w:sz w:val="24"/>
+          <w:szCs w:val="24"/>
+          <w:lang w:val="es-CO" w:eastAsia="es-CO"/>
+          <w14:ligatures w14:val="standardContextual"/>
+        </w:rPr>
+      </w:pPr>
+      <w:hyperlink w:anchor="_Toc236395943" w:history="1">
         <w:r>
           <w:rPr>
             <w:rStyle w:val="Hipervnculo"/>
@@ -1990,7 +2165,7 @@
             <w:noProof/>
             <w:webHidden/>
           </w:rPr>
-          <w:instrText xml:space="preserve"> PAGEREF _Toc236324021 \h </w:instrText>
+          <w:instrText xml:space="preserve"> PAGEREF _Toc236395943 \h </w:instrText>
         </w:r>
         <w:r>
           <w:rPr>
@@ -2028,10 +2203,17 @@
           <w:tab w:val="right" w:leader="dot" w:pos="9396"/>
         </w:tabs>
         <w:rPr>
+          <w:rFonts w:asciiTheme="minorHAnsi" w:eastAsiaTheme="minorEastAsia" w:hAnsiTheme="minorHAnsi"/>
           <w:noProof/>
-        </w:rPr>
-      </w:pPr>
-      <w:hyperlink w:anchor="_Toc236324022" w:history="1">
+          <w:color w:val="auto"/>
+          <w:kern w:val="2"/>
+          <w:sz w:val="24"/>
+          <w:szCs w:val="24"/>
+          <w:lang w:val="es-CO" w:eastAsia="es-CO"/>
+          <w14:ligatures w14:val="standardContextual"/>
+        </w:rPr>
+      </w:pPr>
+      <w:hyperlink w:anchor="_Toc236395944" w:history="1">
         <w:r>
           <w:rPr>
             <w:rStyle w:val="Hipervnculo"/>
@@ -2058,7 +2240,7 @@
             <w:noProof/>
             <w:webHidden/>
           </w:rPr>
-          <w:instrText xml:space="preserve"> PAGEREF _Toc236324022 \h </w:instrText>
+          <w:instrText xml:space="preserve"> PAGEREF _Toc236395944 \h </w:instrText>
         </w:r>
         <w:r>
           <w:rPr>
@@ -2096,10 +2278,17 @@
           <w:tab w:val="right" w:leader="dot" w:pos="9396"/>
         </w:tabs>
         <w:rPr>
+          <w:rFonts w:asciiTheme="minorHAnsi" w:eastAsiaTheme="minorEastAsia" w:hAnsiTheme="minorHAnsi"/>
           <w:noProof/>
-        </w:rPr>
-      </w:pPr>
-      <w:hyperlink w:anchor="_Toc236324023" w:history="1">
+          <w:color w:val="auto"/>
+          <w:kern w:val="2"/>
+          <w:sz w:val="24"/>
+          <w:szCs w:val="24"/>
+          <w:lang w:val="es-CO" w:eastAsia="es-CO"/>
+          <w14:ligatures w14:val="standardContextual"/>
+        </w:rPr>
+      </w:pPr>
+      <w:hyperlink w:anchor="_Toc236395945" w:history="1">
         <w:r>
           <w:rPr>
             <w:rStyle w:val="Hipervnculo"/>
@@ -2126,7 +2315,7 @@
             <w:noProof/>
             <w:webHidden/>
           </w:rPr>
-          <w:instrText xml:space="preserve"> PAGEREF _Toc236324023 \h </w:instrText>
+          <w:instrText xml:space="preserve"> PAGEREF _Toc236395945 \h </w:instrText>
         </w:r>
         <w:r>
           <w:rPr>
@@ -2164,10 +2353,17 @@
           <w:tab w:val="right" w:leader="dot" w:pos="9396"/>
         </w:tabs>
         <w:rPr>
+          <w:rFonts w:asciiTheme="minorHAnsi" w:eastAsiaTheme="minorEastAsia" w:hAnsiTheme="minorHAnsi"/>
           <w:noProof/>
-        </w:rPr>
-      </w:pPr>
-      <w:hyperlink w:anchor="_Toc236324024" w:history="1">
+          <w:color w:val="auto"/>
+          <w:kern w:val="2"/>
+          <w:sz w:val="24"/>
+          <w:szCs w:val="24"/>
+          <w:lang w:val="es-CO" w:eastAsia="es-CO"/>
+          <w14:ligatures w14:val="standardContextual"/>
+        </w:rPr>
+      </w:pPr>
+      <w:hyperlink w:anchor="_Toc236395946" w:history="1">
         <w:r>
           <w:rPr>
             <w:rStyle w:val="Hipervnculo"/>
@@ -2194,7 +2390,7 @@
             <w:noProof/>
             <w:webHidden/>
           </w:rPr>
-          <w:instrText xml:space="preserve"> PAGEREF _Toc236324024 \h </w:instrText>
+          <w:instrText xml:space="preserve"> PAGEREF _Toc236395946 \h </w:instrText>
         </w:r>
         <w:r>
           <w:rPr>
@@ -2232,10 +2428,17 @@
           <w:tab w:val="right" w:leader="dot" w:pos="9396"/>
         </w:tabs>
         <w:rPr>
+          <w:rFonts w:asciiTheme="minorHAnsi" w:eastAsiaTheme="minorEastAsia" w:hAnsiTheme="minorHAnsi"/>
           <w:noProof/>
-        </w:rPr>
-      </w:pPr>
-      <w:hyperlink w:anchor="_Toc236324025" w:history="1">
+          <w:color w:val="auto"/>
+          <w:kern w:val="2"/>
+          <w:sz w:val="24"/>
+          <w:szCs w:val="24"/>
+          <w:lang w:val="es-CO" w:eastAsia="es-CO"/>
+          <w14:ligatures w14:val="standardContextual"/>
+        </w:rPr>
+      </w:pPr>
+      <w:hyperlink w:anchor="_Toc236395947" w:history="1">
         <w:r>
           <w:rPr>
             <w:rStyle w:val="Hipervnculo"/>
@@ -2262,7 +2465,7 @@
             <w:noProof/>
             <w:webHidden/>
           </w:rPr>
-          <w:instrText xml:space="preserve"> PAGEREF _Toc236324025 \h </w:instrText>
+          <w:instrText xml:space="preserve"> PAGEREF _Toc236395947 \h </w:instrText>
         </w:r>
         <w:r>
           <w:rPr>
@@ -2300,10 +2503,17 @@
           <w:tab w:val="right" w:leader="dot" w:pos="9396"/>
         </w:tabs>
         <w:rPr>
+          <w:rFonts w:asciiTheme="minorHAnsi" w:eastAsiaTheme="minorEastAsia" w:hAnsiTheme="minorHAnsi"/>
           <w:noProof/>
-        </w:rPr>
-      </w:pPr>
-      <w:hyperlink w:anchor="_Toc236324026" w:history="1">
+          <w:color w:val="auto"/>
+          <w:kern w:val="2"/>
+          <w:sz w:val="24"/>
+          <w:szCs w:val="24"/>
+          <w:lang w:val="es-CO" w:eastAsia="es-CO"/>
+          <w14:ligatures w14:val="standardContextual"/>
+        </w:rPr>
+      </w:pPr>
+      <w:hyperlink w:anchor="_Toc236395948" w:history="1">
         <w:r>
           <w:rPr>
             <w:rStyle w:val="Hipervnculo"/>
@@ -2330,7 +2540,7 @@
             <w:noProof/>
             <w:webHidden/>
           </w:rPr>
-          <w:instrText xml:space="preserve"> PAGEREF _Toc236324026 \h </w:instrText>
+          <w:instrText xml:space="preserve"> PAGEREF _Toc236395948 \h </w:instrText>
         </w:r>
         <w:r>
           <w:rPr>
@@ -2368,10 +2578,17 @@
           <w:tab w:val="right" w:leader="dot" w:pos="9396"/>
         </w:tabs>
         <w:rPr>
+          <w:rFonts w:asciiTheme="minorHAnsi" w:eastAsiaTheme="minorEastAsia" w:hAnsiTheme="minorHAnsi"/>
           <w:noProof/>
-        </w:rPr>
-      </w:pPr>
-      <w:hyperlink w:anchor="_Toc236324027" w:history="1">
+          <w:color w:val="auto"/>
+          <w:kern w:val="2"/>
+          <w:sz w:val="24"/>
+          <w:szCs w:val="24"/>
+          <w:lang w:val="es-CO" w:eastAsia="es-CO"/>
+          <w14:ligatures w14:val="standardContextual"/>
+        </w:rPr>
+      </w:pPr>
+      <w:hyperlink w:anchor="_Toc236395949" w:history="1">
         <w:r>
           <w:rPr>
             <w:rStyle w:val="Hipervnculo"/>
@@ -2398,7 +2615,7 @@
             <w:noProof/>
             <w:webHidden/>
           </w:rPr>
-          <w:instrText xml:space="preserve"> PAGEREF _Toc236324027 \h </w:instrText>
+          <w:instrText xml:space="preserve"> PAGEREF _Toc236395949 \h </w:instrText>
         </w:r>
         <w:r>
           <w:rPr>
@@ -2418,7 +2635,7 @@
             <w:noProof/>
             <w:webHidden/>
           </w:rPr>
-          <w:t>13</w:t>
+          <w:t>12</w:t>
         </w:r>
         <w:r>
           <w:rPr>
@@ -2436,10 +2653,17 @@
           <w:tab w:val="right" w:leader="dot" w:pos="9396"/>
         </w:tabs>
         <w:rPr>
+          <w:rFonts w:asciiTheme="minorHAnsi" w:eastAsiaTheme="minorEastAsia" w:hAnsiTheme="minorHAnsi"/>
           <w:noProof/>
-        </w:rPr>
-      </w:pPr>
-      <w:hyperlink w:anchor="_Toc236324028" w:history="1">
+          <w:color w:val="auto"/>
+          <w:kern w:val="2"/>
+          <w:sz w:val="24"/>
+          <w:szCs w:val="24"/>
+          <w:lang w:val="es-CO" w:eastAsia="es-CO"/>
+          <w14:ligatures w14:val="standardContextual"/>
+        </w:rPr>
+      </w:pPr>
+      <w:hyperlink w:anchor="_Toc236395950" w:history="1">
         <w:r>
           <w:rPr>
             <w:rStyle w:val="Hipervnculo"/>
@@ -2466,7 +2690,7 @@
             <w:noProof/>
             <w:webHidden/>
           </w:rPr>
-          <w:instrText xml:space="preserve"> PAGEREF _Toc236324028 \h </w:instrText>
+          <w:instrText xml:space="preserve"> PAGEREF _Toc236395950 \h </w:instrText>
         </w:r>
         <w:r>
           <w:rPr>
@@ -2486,7 +2710,7 @@
             <w:noProof/>
             <w:webHidden/>
           </w:rPr>
-          <w:t>13</w:t>
+          <w:t>12</w:t>
         </w:r>
         <w:r>
           <w:rPr>
@@ -2504,10 +2728,17 @@
           <w:tab w:val="right" w:leader="dot" w:pos="9396"/>
         </w:tabs>
         <w:rPr>
+          <w:rFonts w:asciiTheme="minorHAnsi" w:eastAsiaTheme="minorEastAsia" w:hAnsiTheme="minorHAnsi"/>
           <w:noProof/>
-        </w:rPr>
-      </w:pPr>
-      <w:hyperlink w:anchor="_Toc236324029" w:history="1">
+          <w:color w:val="auto"/>
+          <w:kern w:val="2"/>
+          <w:sz w:val="24"/>
+          <w:szCs w:val="24"/>
+          <w:lang w:val="es-CO" w:eastAsia="es-CO"/>
+          <w14:ligatures w14:val="standardContextual"/>
+        </w:rPr>
+      </w:pPr>
+      <w:hyperlink w:anchor="_Toc236395951" w:history="1">
         <w:r>
           <w:rPr>
             <w:rStyle w:val="Hipervnculo"/>
@@ -2534,7 +2765,7 @@
             <w:noProof/>
             <w:webHidden/>
           </w:rPr>
-          <w:instrText xml:space="preserve"> PAGEREF _Toc236324029 \h </w:instrText>
+          <w:instrText xml:space="preserve"> PAGEREF _Toc236395951 \h </w:instrText>
         </w:r>
         <w:r>
           <w:rPr>
@@ -2554,7 +2785,7 @@
             <w:noProof/>
             <w:webHidden/>
           </w:rPr>
-          <w:t>13</w:t>
+          <w:t>12</w:t>
         </w:r>
         <w:r>
           <w:rPr>
@@ -2572,10 +2803,17 @@
           <w:tab w:val="right" w:leader="dot" w:pos="9396"/>
         </w:tabs>
         <w:rPr>
+          <w:rFonts w:asciiTheme="minorHAnsi" w:eastAsiaTheme="minorEastAsia" w:hAnsiTheme="minorHAnsi"/>
           <w:noProof/>
-        </w:rPr>
-      </w:pPr>
-      <w:hyperlink w:anchor="_Toc236324030" w:history="1">
+          <w:color w:val="auto"/>
+          <w:kern w:val="2"/>
+          <w:sz w:val="24"/>
+          <w:szCs w:val="24"/>
+          <w:lang w:val="es-CO" w:eastAsia="es-CO"/>
+          <w14:ligatures w14:val="standardContextual"/>
+        </w:rPr>
+      </w:pPr>
+      <w:hyperlink w:anchor="_Toc236395952" w:history="1">
         <w:r>
           <w:rPr>
             <w:rStyle w:val="Hipervnculo"/>
@@ -2602,7 +2840,7 @@
             <w:noProof/>
             <w:webHidden/>
           </w:rPr>
-          <w:instrText xml:space="preserve"> PAGEREF _Toc236324030 \h </w:instrText>
+          <w:instrText xml:space="preserve"> PAGEREF _Toc236395952 \h </w:instrText>
         </w:r>
         <w:r>
           <w:rPr>
@@ -2622,7 +2860,7 @@
             <w:noProof/>
             <w:webHidden/>
           </w:rPr>
-          <w:t>13</w:t>
+          <w:t>12</w:t>
         </w:r>
         <w:r>
           <w:rPr>
@@ -2640,10 +2878,17 @@
           <w:tab w:val="right" w:leader="dot" w:pos="9396"/>
         </w:tabs>
         <w:rPr>
+          <w:rFonts w:asciiTheme="minorHAnsi" w:eastAsiaTheme="minorEastAsia" w:hAnsiTheme="minorHAnsi"/>
           <w:noProof/>
-        </w:rPr>
-      </w:pPr>
-      <w:hyperlink w:anchor="_Toc236324031" w:history="1">
+          <w:color w:val="auto"/>
+          <w:kern w:val="2"/>
+          <w:sz w:val="24"/>
+          <w:szCs w:val="24"/>
+          <w:lang w:val="es-CO" w:eastAsia="es-CO"/>
+          <w14:ligatures w14:val="standardContextual"/>
+        </w:rPr>
+      </w:pPr>
+      <w:hyperlink w:anchor="_Toc236395953" w:history="1">
         <w:r>
           <w:rPr>
             <w:rStyle w:val="Hipervnculo"/>
@@ -2670,7 +2915,7 @@
             <w:noProof/>
             <w:webHidden/>
           </w:rPr>
-          <w:instrText xml:space="preserve"> PAGEREF _Toc236324031 \h </w:instrText>
+          <w:instrText xml:space="preserve"> PAGEREF _Toc236395953 \h </w:instrText>
         </w:r>
         <w:r>
           <w:rPr>
@@ -2690,7 +2935,82 @@
             <w:noProof/>
             <w:webHidden/>
           </w:rPr>
-          <w:t>13</w:t>
+          <w:t>12</w:t>
+        </w:r>
+        <w:r>
+          <w:rPr>
+            <w:noProof/>
+            <w:webHidden/>
+          </w:rPr>
+          <w:fldChar w:fldCharType="end"/>
+        </w:r>
+      </w:hyperlink>
+    </w:p>
+    <w:p>
+      <w:pPr>
+        <w:pStyle w:val="TDC2"/>
+        <w:tabs>
+          <w:tab w:val="right" w:leader="dot" w:pos="9396"/>
+        </w:tabs>
+        <w:rPr>
+          <w:rFonts w:asciiTheme="minorHAnsi" w:eastAsiaTheme="minorEastAsia" w:hAnsiTheme="minorHAnsi"/>
+          <w:noProof/>
+          <w:color w:val="auto"/>
+          <w:kern w:val="2"/>
+          <w:sz w:val="24"/>
+          <w:szCs w:val="24"/>
+          <w:lang w:val="es-CO" w:eastAsia="es-CO"/>
+          <w14:ligatures w14:val="standardContextual"/>
+        </w:rPr>
+      </w:pPr>
+      <w:hyperlink w:anchor="_Toc236395954" w:history="1">
+        <w:r>
+          <w:rPr>
+            <w:rStyle w:val="Hipervnculo"/>
+            <w:noProof/>
+          </w:rPr>
+          <w:t>Uso de herramientas de IA en el desarrollo</w:t>
+        </w:r>
+        <w:r>
+          <w:rPr>
+            <w:noProof/>
+            <w:webHidden/>
+          </w:rPr>
+          <w:tab/>
+        </w:r>
+        <w:r>
+          <w:rPr>
+            <w:noProof/>
+            <w:webHidden/>
+          </w:rPr>
+          <w:fldChar w:fldCharType="begin"/>
+        </w:r>
+        <w:r>
+          <w:rPr>
+            <w:noProof/>
+            <w:webHidden/>
+          </w:rPr>
+          <w:instrText xml:space="preserve"> PAGEREF _Toc236395954 \h </w:instrText>
+        </w:r>
+        <w:r>
+          <w:rPr>
+            <w:noProof/>
+            <w:webHidden/>
+          </w:rPr>
+        </w:r>
+        <w:r>
+          <w:rPr>
+            <w:noProof/>
+            <w:webHidden/>
+          </w:rPr>
+          <w:fldChar w:fldCharType="separate"/>
+        </w:r>
+        <w:r>
+          <w:rPr>
+            <w:noProof/>
+            <w:webHidden/>
+          </w:rPr>
+          <w:t>12</w:t>
         </w:r>
         <w:r>
           <w:rPr>
@@ -2708,10 +3028,17 @@
           <w:tab w:val="right" w:leader="dot" w:pos="9396"/>
         </w:tabs>
         <w:rPr>
+          <w:rFonts w:asciiTheme="minorHAnsi" w:eastAsiaTheme="minorEastAsia" w:hAnsiTheme="minorHAnsi"/>
           <w:noProof/>
-        </w:rPr>
-      </w:pPr>
-      <w:hyperlink w:anchor="_Toc236324032" w:history="1">
+          <w:color w:val="auto"/>
+          <w:kern w:val="2"/>
+          <w:sz w:val="24"/>
+          <w:szCs w:val="24"/>
+          <w:lang w:val="es-CO" w:eastAsia="es-CO"/>
+          <w14:ligatures w14:val="standardContextual"/>
+        </w:rPr>
+      </w:pPr>
+      <w:hyperlink w:anchor="_Toc236395955" w:history="1">
         <w:r>
           <w:rPr>
             <w:rStyle w:val="Hipervnculo"/>
@@ -2738,7 +3065,7 @@
             <w:noProof/>
             <w:webHidden/>
           </w:rPr>
-          <w:instrText xml:space="preserve"> PAGEREF _Toc236324032 \h </w:instrText>
+          <w:instrText xml:space="preserve"> PAGEREF _Toc236395955 \h </w:instrText>
         </w:r>
         <w:r>
           <w:rPr>
@@ -2758,7 +3085,7 @@
             <w:noProof/>
             <w:webHidden/>
           </w:rPr>
-          <w:t>13</w:t>
+          <w:t>12</w:t>
         </w:r>
         <w:r>
           <w:rPr>
@@ -2776,10 +3103,17 @@
           <w:tab w:val="right" w:leader="dot" w:pos="9396"/>
         </w:tabs>
         <w:rPr>
+          <w:rFonts w:asciiTheme="minorHAnsi" w:eastAsiaTheme="minorEastAsia" w:hAnsiTheme="minorHAnsi"/>
           <w:noProof/>
-        </w:rPr>
-      </w:pPr>
-      <w:hyperlink w:anchor="_Toc236324033" w:history="1">
+          <w:color w:val="auto"/>
+          <w:kern w:val="2"/>
+          <w:sz w:val="24"/>
+          <w:szCs w:val="24"/>
+          <w:lang w:val="es-CO" w:eastAsia="es-CO"/>
+          <w14:ligatures w14:val="standardContextual"/>
+        </w:rPr>
+      </w:pPr>
+      <w:hyperlink w:anchor="_Toc236395956" w:history="1">
         <w:r>
           <w:rPr>
             <w:rStyle w:val="Hipervnculo"/>
@@ -2806,7 +3140,7 @@
             <w:noProof/>
             <w:webHidden/>
           </w:rPr>
-          <w:instrText xml:space="preserve"> PAGEREF _Toc236324033 \h </w:instrText>
+          <w:instrText xml:space="preserve"> PAGEREF _Toc236395956 \h </w:instrText>
         </w:r>
         <w:r>
           <w:rPr>
@@ -2844,10 +3178,17 @@
           <w:tab w:val="right" w:leader="dot" w:pos="9396"/>
         </w:tabs>
         <w:rPr>
+          <w:rFonts w:asciiTheme="minorHAnsi" w:eastAsiaTheme="minorEastAsia" w:hAnsiTheme="minorHAnsi"/>
           <w:noProof/>
-        </w:rPr>
-      </w:pPr>
-      <w:hyperlink w:anchor="_Toc236324034" w:history="1">
+          <w:color w:val="auto"/>
+          <w:kern w:val="2"/>
+          <w:sz w:val="24"/>
+          <w:szCs w:val="24"/>
+          <w:lang w:val="es-CO" w:eastAsia="es-CO"/>
+          <w14:ligatures w14:val="standardContextual"/>
+        </w:rPr>
+      </w:pPr>
+      <w:hyperlink w:anchor="_Toc236395957" w:history="1">
         <w:r>
           <w:rPr>
             <w:rStyle w:val="Hipervnculo"/>
@@ -2874,7 +3215,7 @@
             <w:noProof/>
             <w:webHidden/>
           </w:rPr>
-          <w:instrText xml:space="preserve"> PAGEREF _Toc236324034 \h </w:instrText>
+          <w:instrText xml:space="preserve"> PAGEREF _Toc236395957 \h </w:instrText>
         </w:r>
         <w:r>
           <w:rPr>
@@ -2894,7 +3235,7 @@
             <w:noProof/>
             <w:webHidden/>
           </w:rPr>
-          <w:t>14</w:t>
+          <w:t>13</w:t>
         </w:r>
         <w:r>
           <w:rPr>
@@ -2912,10 +3253,17 @@
           <w:tab w:val="right" w:leader="dot" w:pos="9396"/>
         </w:tabs>
         <w:rPr>
+          <w:rFonts w:asciiTheme="minorHAnsi" w:eastAsiaTheme="minorEastAsia" w:hAnsiTheme="minorHAnsi"/>
           <w:noProof/>
-        </w:rPr>
-      </w:pPr>
-      <w:hyperlink w:anchor="_Toc236324035" w:history="1">
+          <w:color w:val="auto"/>
+          <w:kern w:val="2"/>
+          <w:sz w:val="24"/>
+          <w:szCs w:val="24"/>
+          <w:lang w:val="es-CO" w:eastAsia="es-CO"/>
+          <w14:ligatures w14:val="standardContextual"/>
+        </w:rPr>
+      </w:pPr>
+      <w:hyperlink w:anchor="_Toc236395958" w:history="1">
         <w:r>
           <w:rPr>
             <w:rStyle w:val="Hipervnculo"/>
@@ -2942,7 +3290,7 @@
             <w:noProof/>
             <w:webHidden/>
           </w:rPr>
-          <w:instrText xml:space="preserve"> PAGEREF _Toc236324035 \h </w:instrText>
+          <w:instrText xml:space="preserve"> PAGEREF _Toc236395958 \h </w:instrText>
         </w:r>
         <w:r>
           <w:rPr>
@@ -2962,7 +3310,7 @@
             <w:noProof/>
             <w:webHidden/>
           </w:rPr>
-          <w:t>14</w:t>
+          <w:t>13</w:t>
         </w:r>
         <w:r>
           <w:rPr>
@@ -2980,10 +3328,17 @@
           <w:tab w:val="right" w:leader="dot" w:pos="9396"/>
         </w:tabs>
         <w:rPr>
+          <w:rFonts w:asciiTheme="minorHAnsi" w:eastAsiaTheme="minorEastAsia" w:hAnsiTheme="minorHAnsi"/>
           <w:noProof/>
-        </w:rPr>
-      </w:pPr>
-      <w:hyperlink w:anchor="_Toc236324036" w:history="1">
+          <w:color w:val="auto"/>
+          <w:kern w:val="2"/>
+          <w:sz w:val="24"/>
+          <w:szCs w:val="24"/>
+          <w:lang w:val="es-CO" w:eastAsia="es-CO"/>
+          <w14:ligatures w14:val="standardContextual"/>
+        </w:rPr>
+      </w:pPr>
+      <w:hyperlink w:anchor="_Toc236395959" w:history="1">
         <w:r>
           <w:rPr>
             <w:rStyle w:val="Hipervnculo"/>
@@ -3010,7 +3365,7 @@
             <w:noProof/>
             <w:webHidden/>
           </w:rPr>
-          <w:instrText xml:space="preserve"> PAGEREF _Toc236324036 \h </w:instrText>
+          <w:instrText xml:space="preserve"> PAGEREF _Toc236395959 \h </w:instrText>
         </w:r>
         <w:r>
           <w:rPr>
@@ -3048,10 +3403,17 @@
           <w:tab w:val="right" w:leader="dot" w:pos="9396"/>
         </w:tabs>
         <w:rPr>
+          <w:rFonts w:asciiTheme="minorHAnsi" w:eastAsiaTheme="minorEastAsia" w:hAnsiTheme="minorHAnsi"/>
           <w:noProof/>
-        </w:rPr>
-      </w:pPr>
-      <w:hyperlink w:anchor="_Toc236324037" w:history="1">
+          <w:color w:val="auto"/>
+          <w:kern w:val="2"/>
+          <w:sz w:val="24"/>
+          <w:szCs w:val="24"/>
+          <w:lang w:val="es-CO" w:eastAsia="es-CO"/>
+          <w14:ligatures w14:val="standardContextual"/>
+        </w:rPr>
+      </w:pPr>
+      <w:hyperlink w:anchor="_Toc236395960" w:history="1">
         <w:r>
           <w:rPr>
             <w:rStyle w:val="Hipervnculo"/>
@@ -3078,7 +3440,7 @@
             <w:noProof/>
             <w:webHidden/>
           </w:rPr>
-          <w:instrText xml:space="preserve"> PAGEREF _Toc236324037 \h </w:instrText>
+          <w:instrText xml:space="preserve"> PAGEREF _Toc236395960 \h </w:instrText>
         </w:r>
         <w:r>
           <w:rPr>
@@ -3116,10 +3478,17 @@
           <w:tab w:val="right" w:leader="dot" w:pos="9396"/>
         </w:tabs>
         <w:rPr>
+          <w:rFonts w:asciiTheme="minorHAnsi" w:eastAsiaTheme="minorEastAsia" w:hAnsiTheme="minorHAnsi"/>
           <w:noProof/>
-        </w:rPr>
-      </w:pPr>
-      <w:hyperlink w:anchor="_Toc236324038" w:history="1">
+          <w:color w:val="auto"/>
+          <w:kern w:val="2"/>
+          <w:sz w:val="24"/>
+          <w:szCs w:val="24"/>
+          <w:lang w:val="es-CO" w:eastAsia="es-CO"/>
+          <w14:ligatures w14:val="standardContextual"/>
+        </w:rPr>
+      </w:pPr>
+      <w:hyperlink w:anchor="_Toc236395961" w:history="1">
         <w:r>
           <w:rPr>
             <w:rStyle w:val="Hipervnculo"/>
@@ -3146,7 +3515,7 @@
             <w:noProof/>
             <w:webHidden/>
           </w:rPr>
-          <w:instrText xml:space="preserve"> PAGEREF _Toc236324038 \h </w:instrText>
+          <w:instrText xml:space="preserve"> PAGEREF _Toc236395961 \h </w:instrText>
         </w:r>
         <w:r>
           <w:rPr>
@@ -3184,10 +3553,17 @@
           <w:tab w:val="right" w:leader="dot" w:pos="9396"/>
         </w:tabs>
         <w:rPr>
+          <w:rFonts w:asciiTheme="minorHAnsi" w:eastAsiaTheme="minorEastAsia" w:hAnsiTheme="minorHAnsi"/>
           <w:noProof/>
-        </w:rPr>
-      </w:pPr>
-      <w:hyperlink w:anchor="_Toc236324039" w:history="1">
+          <w:color w:val="auto"/>
+          <w:kern w:val="2"/>
+          <w:sz w:val="24"/>
+          <w:szCs w:val="24"/>
+          <w:lang w:val="es-CO" w:eastAsia="es-CO"/>
+          <w14:ligatures w14:val="standardContextual"/>
+        </w:rPr>
+      </w:pPr>
+      <w:hyperlink w:anchor="_Toc236395962" w:history="1">
         <w:r>
           <w:rPr>
             <w:rStyle w:val="Hipervnculo"/>
@@ -3214,7 +3590,7 @@
             <w:noProof/>
             <w:webHidden/>
           </w:rPr>
-          <w:instrText xml:space="preserve"> PAGEREF _Toc236324039 \h </w:instrText>
+          <w:instrText xml:space="preserve"> PAGEREF _Toc236395962 \h </w:instrText>
         </w:r>
         <w:r>
           <w:rPr>
@@ -3252,10 +3628,17 @@
           <w:tab w:val="right" w:leader="dot" w:pos="9396"/>
         </w:tabs>
         <w:rPr>
+          <w:rFonts w:asciiTheme="minorHAnsi" w:eastAsiaTheme="minorEastAsia" w:hAnsiTheme="minorHAnsi"/>
           <w:noProof/>
-        </w:rPr>
-      </w:pPr>
-      <w:hyperlink w:anchor="_Toc236324040" w:history="1">
+          <w:color w:val="auto"/>
+          <w:kern w:val="2"/>
+          <w:sz w:val="24"/>
+          <w:szCs w:val="24"/>
+          <w:lang w:val="es-CO" w:eastAsia="es-CO"/>
+          <w14:ligatures w14:val="standardContextual"/>
+        </w:rPr>
+      </w:pPr>
+      <w:hyperlink w:anchor="_Toc236395963" w:history="1">
         <w:r>
           <w:rPr>
             <w:rStyle w:val="Hipervnculo"/>
@@ -3282,7 +3665,7 @@
             <w:noProof/>
             <w:webHidden/>
           </w:rPr>
-          <w:instrText xml:space="preserve"> PAGEREF _Toc236324040 \h </w:instrText>
+          <w:instrText xml:space="preserve"> PAGEREF _Toc236395963 \h </w:instrText>
         </w:r>
         <w:r>
           <w:rPr>
@@ -3320,10 +3703,17 @@
           <w:tab w:val="right" w:leader="dot" w:pos="9396"/>
         </w:tabs>
         <w:rPr>
+          <w:rFonts w:asciiTheme="minorHAnsi" w:eastAsiaTheme="minorEastAsia" w:hAnsiTheme="minorHAnsi"/>
           <w:noProof/>
-        </w:rPr>
-      </w:pPr>
-      <w:hyperlink w:anchor="_Toc236324041" w:history="1">
+          <w:color w:val="auto"/>
+          <w:kern w:val="2"/>
+          <w:sz w:val="24"/>
+          <w:szCs w:val="24"/>
+          <w:lang w:val="es-CO" w:eastAsia="es-CO"/>
+          <w14:ligatures w14:val="standardContextual"/>
+        </w:rPr>
+      </w:pPr>
+      <w:hyperlink w:anchor="_Toc236395964" w:history="1">
         <w:r>
           <w:rPr>
             <w:rStyle w:val="Hipervnculo"/>
@@ -3350,7 +3740,7 @@
             <w:noProof/>
             <w:webHidden/>
           </w:rPr>
-          <w:instrText xml:space="preserve"> PAGEREF _Toc236324041 \h </w:instrText>
+          <w:instrText xml:space="preserve"> PAGEREF _Toc236395964 \h </w:instrText>
         </w:r>
         <w:r>
           <w:rPr>
@@ -3388,10 +3778,17 @@
           <w:tab w:val="right" w:leader="dot" w:pos="9396"/>
         </w:tabs>
         <w:rPr>
+          <w:rFonts w:asciiTheme="minorHAnsi" w:eastAsiaTheme="minorEastAsia" w:hAnsiTheme="minorHAnsi"/>
           <w:noProof/>
-        </w:rPr>
-      </w:pPr>
-      <w:hyperlink w:anchor="_Toc236324042" w:history="1">
+          <w:color w:val="auto"/>
+          <w:kern w:val="2"/>
+          <w:sz w:val="24"/>
+          <w:szCs w:val="24"/>
+          <w:lang w:val="es-CO" w:eastAsia="es-CO"/>
+          <w14:ligatures w14:val="standardContextual"/>
+        </w:rPr>
+      </w:pPr>
+      <w:hyperlink w:anchor="_Toc236395965" w:history="1">
         <w:r>
           <w:rPr>
             <w:rStyle w:val="Hipervnculo"/>
@@ -3418,7 +3815,7 @@
             <w:noProof/>
             <w:webHidden/>
           </w:rPr>
-          <w:instrText xml:space="preserve"> PAGEREF _Toc236324042 \h </w:instrText>
+          <w:instrText xml:space="preserve"> PAGEREF _Toc236395965 \h </w:instrText>
         </w:r>
         <w:r>
           <w:rPr>
@@ -3456,10 +3853,17 @@
           <w:tab w:val="right" w:leader="dot" w:pos="9396"/>
         </w:tabs>
         <w:rPr>
+          <w:rFonts w:asciiTheme="minorHAnsi" w:eastAsiaTheme="minorEastAsia" w:hAnsiTheme="minorHAnsi"/>
           <w:noProof/>
-        </w:rPr>
-      </w:pPr>
-      <w:hyperlink w:anchor="_Toc236324043" w:history="1">
+          <w:color w:val="auto"/>
+          <w:kern w:val="2"/>
+          <w:sz w:val="24"/>
+          <w:szCs w:val="24"/>
+          <w:lang w:val="es-CO" w:eastAsia="es-CO"/>
+          <w14:ligatures w14:val="standardContextual"/>
+        </w:rPr>
+      </w:pPr>
+      <w:hyperlink w:anchor="_Toc236395966" w:history="1">
         <w:r>
           <w:rPr>
             <w:rStyle w:val="Hipervnculo"/>
@@ -3486,7 +3890,7 @@
             <w:noProof/>
             <w:webHidden/>
           </w:rPr>
-          <w:instrText xml:space="preserve"> PAGEREF _Toc236324043 \h </w:instrText>
+          <w:instrText xml:space="preserve"> PAGEREF _Toc236395966 \h </w:instrText>
         </w:r>
         <w:r>
           <w:rPr>
@@ -3524,10 +3928,17 @@
           <w:tab w:val="right" w:leader="dot" w:pos="9396"/>
         </w:tabs>
         <w:rPr>
+          <w:rFonts w:asciiTheme="minorHAnsi" w:eastAsiaTheme="minorEastAsia" w:hAnsiTheme="minorHAnsi"/>
           <w:noProof/>
-        </w:rPr>
-      </w:pPr>
-      <w:hyperlink w:anchor="_Toc236324044" w:history="1">
+          <w:color w:val="auto"/>
+          <w:kern w:val="2"/>
+          <w:sz w:val="24"/>
+          <w:szCs w:val="24"/>
+          <w:lang w:val="es-CO" w:eastAsia="es-CO"/>
+          <w14:ligatures w14:val="standardContextual"/>
+        </w:rPr>
+      </w:pPr>
+      <w:hyperlink w:anchor="_Toc236395967" w:history="1">
         <w:r>
           <w:rPr>
             <w:rStyle w:val="Hipervnculo"/>
@@ -3554,7 +3965,7 @@
             <w:noProof/>
             <w:webHidden/>
           </w:rPr>
-          <w:instrText xml:space="preserve"> PAGEREF _Toc236324044 \h </w:instrText>
+          <w:instrText xml:space="preserve"> PAGEREF _Toc236395967 \h </w:instrText>
         </w:r>
         <w:r>
           <w:rPr>
@@ -3592,10 +4003,17 @@
           <w:tab w:val="right" w:leader="dot" w:pos="9396"/>
         </w:tabs>
         <w:rPr>
+          <w:rFonts w:asciiTheme="minorHAnsi" w:eastAsiaTheme="minorEastAsia" w:hAnsiTheme="minorHAnsi"/>
           <w:noProof/>
-        </w:rPr>
-      </w:pPr>
-      <w:hyperlink w:anchor="_Toc236324045" w:history="1">
+          <w:color w:val="auto"/>
+          <w:kern w:val="2"/>
+          <w:sz w:val="24"/>
+          <w:szCs w:val="24"/>
+          <w:lang w:val="es-CO" w:eastAsia="es-CO"/>
+          <w14:ligatures w14:val="standardContextual"/>
+        </w:rPr>
+      </w:pPr>
+      <w:hyperlink w:anchor="_Toc236395968" w:history="1">
         <w:r>
           <w:rPr>
             <w:rStyle w:val="Hipervnculo"/>
@@ -3622,7 +4040,7 @@
             <w:noProof/>
             <w:webHidden/>
           </w:rPr>
-          <w:instrText xml:space="preserve"> PAGEREF _Toc236324045 \h </w:instrText>
+          <w:instrText xml:space="preserve"> PAGEREF _Toc236395968 \h </w:instrText>
         </w:r>
         <w:r>
           <w:rPr>
@@ -3660,10 +4078,17 @@
           <w:tab w:val="right" w:leader="dot" w:pos="9396"/>
         </w:tabs>
         <w:rPr>
+          <w:rFonts w:asciiTheme="minorHAnsi" w:eastAsiaTheme="minorEastAsia" w:hAnsiTheme="minorHAnsi"/>
           <w:noProof/>
-        </w:rPr>
-      </w:pPr>
-      <w:hyperlink w:anchor="_Toc236324046" w:history="1">
+          <w:color w:val="auto"/>
+          <w:kern w:val="2"/>
+          <w:sz w:val="24"/>
+          <w:szCs w:val="24"/>
+          <w:lang w:val="es-CO" w:eastAsia="es-CO"/>
+          <w14:ligatures w14:val="standardContextual"/>
+        </w:rPr>
+      </w:pPr>
+      <w:hyperlink w:anchor="_Toc236395969" w:history="1">
         <w:r>
           <w:rPr>
             <w:rStyle w:val="Hipervnculo"/>
@@ -3690,7 +4115,7 @@
             <w:noProof/>
             <w:webHidden/>
           </w:rPr>
-          <w:instrText xml:space="preserve"> PAGEREF _Toc236324046 \h </w:instrText>
+          <w:instrText xml:space="preserve"> PAGEREF _Toc236395969 \h </w:instrText>
         </w:r>
         <w:r>
           <w:rPr>
@@ -3728,10 +4153,17 @@
           <w:tab w:val="right" w:leader="dot" w:pos="9396"/>
         </w:tabs>
         <w:rPr>
+          <w:rFonts w:asciiTheme="minorHAnsi" w:eastAsiaTheme="minorEastAsia" w:hAnsiTheme="minorHAnsi"/>
           <w:noProof/>
-        </w:rPr>
-      </w:pPr>
-      <w:hyperlink w:anchor="_Toc236324047" w:history="1">
+          <w:color w:val="auto"/>
+          <w:kern w:val="2"/>
+          <w:sz w:val="24"/>
+          <w:szCs w:val="24"/>
+          <w:lang w:val="es-CO" w:eastAsia="es-CO"/>
+          <w14:ligatures w14:val="standardContextual"/>
+        </w:rPr>
+      </w:pPr>
+      <w:hyperlink w:anchor="_Toc236395970" w:history="1">
         <w:r>
           <w:rPr>
             <w:rStyle w:val="Hipervnculo"/>
@@ -3758,7 +4190,7 @@
             <w:noProof/>
             <w:webHidden/>
           </w:rPr>
-          <w:instrText xml:space="preserve"> PAGEREF _Toc236324047 \h </w:instrText>
+          <w:instrText xml:space="preserve"> PAGEREF _Toc236395970 \h </w:instrText>
         </w:r>
         <w:r>
           <w:rPr>
@@ -3796,10 +4228,17 @@
           <w:tab w:val="right" w:leader="dot" w:pos="9396"/>
         </w:tabs>
         <w:rPr>
+          <w:rFonts w:asciiTheme="minorHAnsi" w:eastAsiaTheme="minorEastAsia" w:hAnsiTheme="minorHAnsi"/>
           <w:noProof/>
-        </w:rPr>
-      </w:pPr>
-      <w:hyperlink w:anchor="_Toc236324048" w:history="1">
+          <w:color w:val="auto"/>
+          <w:kern w:val="2"/>
+          <w:sz w:val="24"/>
+          <w:szCs w:val="24"/>
+          <w:lang w:val="es-CO" w:eastAsia="es-CO"/>
+          <w14:ligatures w14:val="standardContextual"/>
+        </w:rPr>
+      </w:pPr>
+      <w:hyperlink w:anchor="_Toc236395971" w:history="1">
         <w:r>
           <w:rPr>
             <w:rStyle w:val="Hipervnculo"/>
@@ -3826,7 +4265,7 @@
             <w:noProof/>
             <w:webHidden/>
           </w:rPr>
-          <w:instrText xml:space="preserve"> PAGEREF _Toc236324048 \h </w:instrText>
+          <w:instrText xml:space="preserve"> PAGEREF _Toc236395971 \h </w:instrText>
         </w:r>
         <w:r>
           <w:rPr>
@@ -3864,10 +4303,17 @@
           <w:tab w:val="right" w:leader="dot" w:pos="9396"/>
         </w:tabs>
         <w:rPr>
+          <w:rFonts w:asciiTheme="minorHAnsi" w:eastAsiaTheme="minorEastAsia" w:hAnsiTheme="minorHAnsi"/>
           <w:noProof/>
-        </w:rPr>
-      </w:pPr>
-      <w:hyperlink w:anchor="_Toc236324049" w:history="1">
+          <w:color w:val="auto"/>
+          <w:kern w:val="2"/>
+          <w:sz w:val="24"/>
+          <w:szCs w:val="24"/>
+          <w:lang w:val="es-CO" w:eastAsia="es-CO"/>
+          <w14:ligatures w14:val="standardContextual"/>
+        </w:rPr>
+      </w:pPr>
+      <w:hyperlink w:anchor="_Toc236395972" w:history="1">
         <w:r>
           <w:rPr>
             <w:rStyle w:val="Hipervnculo"/>
@@ -3894,7 +4340,7 @@
             <w:noProof/>
             <w:webHidden/>
           </w:rPr>
-          <w:instrText xml:space="preserve"> PAGEREF _Toc236324049 \h </w:instrText>
+          <w:instrText xml:space="preserve"> PAGEREF _Toc236395972 \h </w:instrText>
         </w:r>
         <w:r>
           <w:rPr>
@@ -3932,10 +4378,17 @@
           <w:tab w:val="right" w:leader="dot" w:pos="9396"/>
         </w:tabs>
         <w:rPr>
+          <w:rFonts w:asciiTheme="minorHAnsi" w:eastAsiaTheme="minorEastAsia" w:hAnsiTheme="minorHAnsi"/>
           <w:noProof/>
-        </w:rPr>
-      </w:pPr>
-      <w:hyperlink w:anchor="_Toc236324050" w:history="1">
+          <w:color w:val="auto"/>
+          <w:kern w:val="2"/>
+          <w:sz w:val="24"/>
+          <w:szCs w:val="24"/>
+          <w:lang w:val="es-CO" w:eastAsia="es-CO"/>
+          <w14:ligatures w14:val="standardContextual"/>
+        </w:rPr>
+      </w:pPr>
+      <w:hyperlink w:anchor="_Toc236395973" w:history="1">
         <w:r>
           <w:rPr>
             <w:rStyle w:val="Hipervnculo"/>
@@ -3962,7 +4415,7 @@
             <w:noProof/>
             <w:webHidden/>
           </w:rPr>
-          <w:instrText xml:space="preserve"> PAGEREF _Toc236324050 \h </w:instrText>
+          <w:instrText xml:space="preserve"> PAGEREF _Toc236395973 \h </w:instrText>
         </w:r>
         <w:r>
           <w:rPr>
@@ -4044,7 +4497,7 @@
           <w:color w:val="auto"/>
         </w:rPr>
       </w:pPr>
-      <w:bookmarkStart w:id="1" w:name="_Toc236323998"/>
+      <w:bookmarkStart w:id="1" w:name="_Toc236395920"/>
       <w:r>
         <w:rPr>
           <w:color w:val="auto"/>
@@ -4061,7 +4514,7 @@
           <w:color w:val="auto"/>
         </w:rPr>
       </w:pPr>
-      <w:bookmarkStart w:id="2" w:name="_Toc236323999"/>
+      <w:bookmarkStart w:id="2" w:name="_Toc236395921"/>
       <w:r>
         <w:rPr>
           <w:color w:val="auto"/>
@@ -4133,7 +4586,7 @@
           <w:color w:val="auto"/>
         </w:rPr>
       </w:pPr>
-      <w:bookmarkStart w:id="3" w:name="_Toc236324000"/>
+      <w:bookmarkStart w:id="3" w:name="_Toc236395922"/>
       <w:r>
         <w:rPr>
           <w:color w:val="auto"/>
@@ -4162,7 +4615,7 @@
           <w:color w:val="auto"/>
         </w:rPr>
       </w:pPr>
-      <w:bookmarkStart w:id="4" w:name="_Toc236324001"/>
+      <w:bookmarkStart w:id="4" w:name="_Toc236395923"/>
       <w:r>
         <w:rPr>
           <w:color w:val="auto"/>
@@ -4241,7 +4694,7 @@
           <w:color w:val="auto"/>
         </w:rPr>
       </w:pPr>
-      <w:bookmarkStart w:id="5" w:name="_Toc236324002"/>
+      <w:bookmarkStart w:id="5" w:name="_Toc236395924"/>
       <w:r>
         <w:rPr>
           <w:color w:val="auto"/>
@@ -4257,7 +4710,7 @@
           <w:color w:val="auto"/>
         </w:rPr>
       </w:pPr>
-      <w:bookmarkStart w:id="6" w:name="_Toc236324003"/>
+      <w:bookmarkStart w:id="6" w:name="_Toc236395925"/>
       <w:r>
         <w:rPr>
           <w:color w:val="auto"/>
@@ -4707,7 +5160,7 @@
           <w:color w:val="auto"/>
         </w:rPr>
       </w:pPr>
-      <w:bookmarkStart w:id="7" w:name="_Toc236324004"/>
+      <w:bookmarkStart w:id="7" w:name="_Toc236395926"/>
       <w:r>
         <w:rPr>
           <w:color w:val="auto"/>
@@ -4781,7 +5234,7 @@
           <w:color w:val="auto"/>
         </w:rPr>
       </w:pPr>
-      <w:bookmarkStart w:id="8" w:name="_Toc236324005"/>
+      <w:bookmarkStart w:id="8" w:name="_Toc236395927"/>
       <w:r>
         <w:rPr>
           <w:i/>
@@ -4811,7 +5264,7 @@
           <w:color w:val="auto"/>
         </w:rPr>
       </w:pPr>
-      <w:bookmarkStart w:id="9" w:name="_Toc236324006"/>
+      <w:bookmarkStart w:id="9" w:name="_Toc236395928"/>
       <w:r>
         <w:rPr>
           <w:color w:val="auto"/>
@@ -4933,7 +5386,7 @@
           <w:color w:val="auto"/>
         </w:rPr>
       </w:pPr>
-      <w:bookmarkStart w:id="10" w:name="_Toc236324007"/>
+      <w:bookmarkStart w:id="10" w:name="_Toc236395929"/>
       <w:r>
         <w:rPr>
           <w:color w:val="auto"/>
@@ -4963,7 +5416,7 @@
           <w:color w:val="auto"/>
         </w:rPr>
       </w:pPr>
-      <w:bookmarkStart w:id="11" w:name="_Toc236324008"/>
+      <w:bookmarkStart w:id="11" w:name="_Toc236395930"/>
       <w:r>
         <w:rPr>
           <w:color w:val="auto"/>
@@ -5018,7 +5471,7 @@
           <w:color w:val="auto"/>
         </w:rPr>
       </w:pPr>
-      <w:bookmarkStart w:id="12" w:name="_Toc236324009"/>
+      <w:bookmarkStart w:id="12" w:name="_Toc236395931"/>
       <w:r>
         <w:rPr>
           <w:color w:val="auto"/>
@@ -5060,7 +5513,7 @@
           <w:color w:val="auto"/>
         </w:rPr>
       </w:pPr>
-      <w:bookmarkStart w:id="13" w:name="_Toc236324010"/>
+      <w:bookmarkStart w:id="13" w:name="_Toc236395932"/>
       <w:r>
         <w:rPr>
           <w:color w:val="auto"/>
@@ -5109,7 +5562,7 @@
           <w:color w:val="auto"/>
         </w:rPr>
       </w:pPr>
-      <w:bookmarkStart w:id="14" w:name="_Toc236324011"/>
+      <w:bookmarkStart w:id="14" w:name="_Toc236395933"/>
       <w:r>
         <w:rPr>
           <w:color w:val="auto"/>
@@ -5167,7 +5620,7 @@
           <w:color w:val="auto"/>
         </w:rPr>
       </w:pPr>
-      <w:bookmarkStart w:id="15" w:name="_Toc236324012"/>
+      <w:bookmarkStart w:id="15" w:name="_Toc236395934"/>
       <w:r>
         <w:rPr>
           <w:color w:val="auto"/>
@@ -5184,7 +5637,7 @@
           <w:color w:val="auto"/>
         </w:rPr>
       </w:pPr>
-      <w:bookmarkStart w:id="16" w:name="_Toc236324013"/>
+      <w:bookmarkStart w:id="16" w:name="_Toc236395935"/>
       <w:r>
         <w:rPr>
           <w:color w:val="auto"/>
@@ -5695,7 +6148,7 @@
           <w:color w:val="auto"/>
         </w:rPr>
       </w:pPr>
-      <w:bookmarkStart w:id="17" w:name="_Toc236324014"/>
+      <w:bookmarkStart w:id="17" w:name="_Toc236395936"/>
       <w:r>
         <w:rPr>
           <w:color w:val="auto"/>
@@ -5724,7 +6177,7 @@
           <w:color w:val="auto"/>
         </w:rPr>
       </w:pPr>
-      <w:bookmarkStart w:id="18" w:name="_Toc236324015"/>
+      <w:bookmarkStart w:id="18" w:name="_Toc236395937"/>
       <w:r>
         <w:rPr>
           <w:i/>
@@ -5816,7 +6269,7 @@
           <w:color w:val="auto"/>
         </w:rPr>
       </w:pPr>
-      <w:bookmarkStart w:id="19" w:name="_Toc236324016"/>
+      <w:bookmarkStart w:id="19" w:name="_Toc236395938"/>
       <w:r>
         <w:rPr>
           <w:i/>
@@ -5908,7 +6361,7 @@
           <w:color w:val="auto"/>
         </w:rPr>
       </w:pPr>
-      <w:bookmarkStart w:id="20" w:name="_Toc236324017"/>
+      <w:bookmarkStart w:id="20" w:name="_Toc236395939"/>
       <w:r>
         <w:rPr>
           <w:i/>
@@ -5945,7 +6398,7 @@
           <w:color w:val="auto"/>
         </w:rPr>
       </w:pPr>
-      <w:bookmarkStart w:id="21" w:name="_Toc236324018"/>
+      <w:bookmarkStart w:id="21" w:name="_Toc236395940"/>
       <w:r>
         <w:rPr>
           <w:color w:val="auto"/>
@@ -6009,7 +6462,7 @@
           <w:color w:val="auto"/>
         </w:rPr>
       </w:pPr>
-      <w:bookmarkStart w:id="22" w:name="_Toc236324019"/>
+      <w:bookmarkStart w:id="22" w:name="_Toc236395941"/>
       <w:r>
         <w:rPr>
           <w:color w:val="auto"/>
@@ -6026,7 +6479,7 @@
           <w:color w:val="auto"/>
         </w:rPr>
       </w:pPr>
-      <w:bookmarkStart w:id="23" w:name="_Toc236324020"/>
+      <w:bookmarkStart w:id="23" w:name="_Toc236395942"/>
       <w:r>
         <w:rPr>
           <w:color w:val="auto"/>
@@ -6341,7 +6794,7 @@
           <w:color w:val="auto"/>
         </w:rPr>
       </w:pPr>
-      <w:bookmarkStart w:id="24" w:name="_Toc236324021"/>
+      <w:bookmarkStart w:id="24" w:name="_Toc236395943"/>
       <w:r>
         <w:rPr>
           <w:color w:val="auto"/>
@@ -6656,7 +7109,7 @@
           <w:color w:val="auto"/>
         </w:rPr>
       </w:pPr>
-      <w:bookmarkStart w:id="25" w:name="_Toc236324022"/>
+      <w:bookmarkStart w:id="25" w:name="_Toc236395944"/>
       <w:r>
         <w:rPr>
           <w:color w:val="auto"/>
@@ -6717,7 +7170,7 @@
           <w:color w:val="auto"/>
         </w:rPr>
       </w:pPr>
-      <w:bookmarkStart w:id="26" w:name="_Toc236324023"/>
+      <w:bookmarkStart w:id="26" w:name="_Toc236395945"/>
       <w:r>
         <w:rPr>
           <w:color w:val="auto"/>
@@ -7311,7 +7764,7 @@
           <w:color w:val="auto"/>
         </w:rPr>
       </w:pPr>
-      <w:bookmarkStart w:id="27" w:name="_Toc236324024"/>
+      <w:bookmarkStart w:id="27" w:name="_Toc236395946"/>
       <w:r>
         <w:rPr>
           <w:color w:val="auto"/>
@@ -7353,7 +7806,7 @@
           <w:color w:val="auto"/>
         </w:rPr>
       </w:pPr>
-      <w:bookmarkStart w:id="28" w:name="_Toc236324025"/>
+      <w:bookmarkStart w:id="28" w:name="_Toc236395947"/>
       <w:r>
         <w:rPr>
           <w:color w:val="auto"/>
@@ -7382,7 +7835,7 @@
           <w:color w:val="auto"/>
         </w:rPr>
       </w:pPr>
-      <w:bookmarkStart w:id="29" w:name="_Toc236324026"/>
+      <w:bookmarkStart w:id="29" w:name="_Toc236395948"/>
       <w:r>
         <w:rPr>
           <w:color w:val="auto"/>
@@ -7427,7 +7880,7 @@
           <w:color w:val="auto"/>
         </w:rPr>
       </w:pPr>
-      <w:bookmarkStart w:id="30" w:name="_Toc236324027"/>
+      <w:bookmarkStart w:id="30" w:name="_Toc236395949"/>
       <w:r>
         <w:rPr>
           <w:color w:val="auto"/>
@@ -7444,7 +7897,7 @@
           <w:color w:val="auto"/>
         </w:rPr>
       </w:pPr>
-      <w:bookmarkStart w:id="31" w:name="_Toc236324028"/>
+      <w:bookmarkStart w:id="31" w:name="_Toc236395950"/>
       <w:r>
         <w:rPr>
           <w:color w:val="auto"/>
@@ -7473,7 +7926,7 @@
           <w:color w:val="auto"/>
         </w:rPr>
       </w:pPr>
-      <w:bookmarkStart w:id="32" w:name="_Toc236324029"/>
+      <w:bookmarkStart w:id="32" w:name="_Toc236395951"/>
       <w:r>
         <w:rPr>
           <w:color w:val="auto"/>
@@ -7502,7 +7955,7 @@
           <w:color w:val="auto"/>
         </w:rPr>
       </w:pPr>
-      <w:bookmarkStart w:id="33" w:name="_Toc236324030"/>
+      <w:bookmarkStart w:id="33" w:name="_Toc236395952"/>
       <w:r>
         <w:rPr>
           <w:color w:val="auto"/>
@@ -7531,7 +7984,7 @@
           <w:color w:val="auto"/>
         </w:rPr>
       </w:pPr>
-      <w:bookmarkStart w:id="34" w:name="_Toc236324031"/>
+      <w:bookmarkStart w:id="34" w:name="_Toc236395953"/>
       <w:r>
         <w:rPr>
           <w:color w:val="auto"/>
@@ -7561,6 +8014,7 @@
           <w:color w:val="auto"/>
         </w:rPr>
       </w:pPr>
+      <w:bookmarkStart w:id="35" w:name="_Toc236395954"/>
       <w:r>
         <w:rPr>
           <w:bCs w:val="0"/>
@@ -7568,6 +8022,7 @@
         </w:rPr>
         <w:t>Uso de herramientas de IA en el desarrollo</w:t>
       </w:r>
+      <w:bookmarkEnd w:id="35"/>
     </w:p>
     <w:p>
       <w:r>
@@ -7589,14 +8044,14 @@
           <w:color w:val="auto"/>
         </w:rPr>
       </w:pPr>
-      <w:bookmarkStart w:id="35" w:name="_Toc236324032"/>
+      <w:bookmarkStart w:id="36" w:name="_Toc236395955"/>
       <w:r>
         <w:rPr>
           <w:color w:val="auto"/>
         </w:rPr>
         <w:t>Cumplimiento normativo (Ley 1581/2012 e ISO/IEC 27001:2022)</w:t>
       </w:r>
-      <w:bookmarkEnd w:id="35"/>
+      <w:bookmarkEnd w:id="36"/>
     </w:p>
     <w:p>
       <w:pPr>
@@ -7618,7 +8073,7 @@
           <w:color w:val="auto"/>
         </w:rPr>
       </w:pPr>
-      <w:bookmarkStart w:id="36" w:name="_Toc236324033"/>
+      <w:bookmarkStart w:id="37" w:name="_Toc236395956"/>
       <w:r>
         <w:rPr>
           <w:color w:val="auto"/>
@@ -7626,7 +8081,7 @@
         <w:lastRenderedPageBreak/>
         <w:t>Documentación de cumplimiento</w:t>
       </w:r>
-      <w:bookmarkEnd w:id="36"/>
+      <w:bookmarkEnd w:id="37"/>
     </w:p>
     <w:p>
       <w:pPr>
@@ -7738,14 +8193,14 @@
           <w:color w:val="auto"/>
         </w:rPr>
       </w:pPr>
-      <w:bookmarkStart w:id="37" w:name="_Toc236324034"/>
+      <w:bookmarkStart w:id="38" w:name="_Toc236395957"/>
       <w:r>
         <w:rPr>
           <w:color w:val="auto"/>
         </w:rPr>
         <w:t>Controles técnicos implementados</w:t>
       </w:r>
-      <w:bookmarkEnd w:id="37"/>
+      <w:bookmarkEnd w:id="38"/>
     </w:p>
     <w:p>
       <w:pPr>
@@ -7827,14 +8282,14 @@
           <w:color w:val="auto"/>
         </w:rPr>
       </w:pPr>
-      <w:bookmarkStart w:id="38" w:name="_Toc236324035"/>
+      <w:bookmarkStart w:id="39" w:name="_Toc236395958"/>
       <w:r>
         <w:rPr>
           <w:color w:val="auto"/>
         </w:rPr>
         <w:t>Actualizaciones en el frontend</w:t>
       </w:r>
-      <w:bookmarkEnd w:id="38"/>
+      <w:bookmarkEnd w:id="39"/>
     </w:p>
     <w:p>
       <w:pPr>
@@ -7901,7 +8356,7 @@
           <w:color w:val="auto"/>
         </w:rPr>
       </w:pPr>
-      <w:bookmarkStart w:id="39" w:name="_Toc236324036"/>
+      <w:bookmarkStart w:id="40" w:name="_Toc236395959"/>
       <w:r>
         <w:rPr>
           <w:color w:val="auto"/>
@@ -7909,7 +8364,7 @@
         <w:lastRenderedPageBreak/>
         <w:t>Estado actual y próximos pasos</w:t>
       </w:r>
-      <w:bookmarkEnd w:id="39"/>
+      <w:bookmarkEnd w:id="40"/>
     </w:p>
     <w:p>
       <w:pPr>
@@ -7960,7 +8415,7 @@
           <w:color w:val="auto"/>
         </w:rPr>
       </w:pPr>
-      <w:bookmarkStart w:id="40" w:name="_Toc236324037"/>
+      <w:bookmarkStart w:id="41" w:name="_Toc236395960"/>
       <w:r>
         <w:rPr>
           <w:color w:val="auto"/>
@@ -7968,7 +8423,7 @@
         <w:lastRenderedPageBreak/>
         <w:t>Enlaces y recursos</w:t>
       </w:r>
-      <w:bookmarkEnd w:id="40"/>
+      <w:bookmarkEnd w:id="41"/>
     </w:p>
     <w:p>
       <w:pPr>
@@ -8059,14 +8514,14 @@
           <w:color w:val="auto"/>
         </w:rPr>
       </w:pPr>
-      <w:bookmarkStart w:id="41" w:name="_Toc236324038"/>
+      <w:bookmarkStart w:id="42" w:name="_Toc236395961"/>
       <w:r>
         <w:rPr>
           <w:color w:val="auto"/>
         </w:rPr>
         <w:t>Equipo SICortex</w:t>
       </w:r>
-      <w:bookmarkEnd w:id="41"/>
+      <w:bookmarkEnd w:id="42"/>
     </w:p>
     <w:p>
       <w:pPr>
@@ -8075,14 +8530,14 @@
           <w:color w:val="auto"/>
         </w:rPr>
       </w:pPr>
-      <w:bookmarkStart w:id="42" w:name="_Toc236324039"/>
+      <w:bookmarkStart w:id="43" w:name="_Toc236395962"/>
       <w:r>
         <w:rPr>
           <w:color w:val="auto"/>
         </w:rPr>
         <w:t>Jefersson Aldair Oliveros (líder del proyecto)</w:t>
       </w:r>
-      <w:bookmarkEnd w:id="42"/>
+      <w:bookmarkEnd w:id="43"/>
     </w:p>
     <w:p>
       <w:pPr>
@@ -8104,14 +8559,14 @@
           <w:color w:val="auto"/>
         </w:rPr>
       </w:pPr>
-      <w:bookmarkStart w:id="43" w:name="_Toc236324040"/>
+      <w:bookmarkStart w:id="44" w:name="_Toc236395963"/>
       <w:r>
         <w:rPr>
           <w:color w:val="auto"/>
         </w:rPr>
         <w:t>Jazmine Acosta</w:t>
       </w:r>
-      <w:bookmarkEnd w:id="43"/>
+      <w:bookmarkEnd w:id="44"/>
     </w:p>
     <w:p>
       <w:pPr>
@@ -8133,14 +8588,14 @@
           <w:color w:val="auto"/>
         </w:rPr>
       </w:pPr>
-      <w:bookmarkStart w:id="44" w:name="_Toc236324041"/>
+      <w:bookmarkStart w:id="45" w:name="_Toc236395964"/>
       <w:r>
         <w:rPr>
           <w:color w:val="auto"/>
         </w:rPr>
         <w:t>Isabella Andrea Cuesta Niebles</w:t>
       </w:r>
-      <w:bookmarkEnd w:id="44"/>
+      <w:bookmarkEnd w:id="45"/>
     </w:p>
     <w:p>
       <w:pPr>
@@ -8162,14 +8617,14 @@
           <w:color w:val="auto"/>
         </w:rPr>
       </w:pPr>
-      <w:bookmarkStart w:id="45" w:name="_Toc236324042"/>
+      <w:bookmarkStart w:id="46" w:name="_Toc236395965"/>
       <w:r>
         <w:rPr>
           <w:color w:val="auto"/>
         </w:rPr>
         <w:t>Catalina del Rocío Pantoja Ordóñez</w:t>
       </w:r>
-      <w:bookmarkEnd w:id="45"/>
+      <w:bookmarkEnd w:id="46"/>
     </w:p>
     <w:p>
       <w:pPr>
@@ -8191,14 +8646,14 @@
           <w:color w:val="auto"/>
         </w:rPr>
       </w:pPr>
-      <w:bookmarkStart w:id="46" w:name="_Toc236324043"/>
+      <w:bookmarkStart w:id="47" w:name="_Toc236395966"/>
       <w:r>
         <w:rPr>
           <w:color w:val="auto"/>
         </w:rPr>
         <w:t>Iván Yesid Cristancho Plata</w:t>
       </w:r>
-      <w:bookmarkEnd w:id="46"/>
+      <w:bookmarkEnd w:id="47"/>
     </w:p>
     <w:p>
       <w:pPr>
@@ -8236,7 +8691,7 @@
           <w:color w:val="auto"/>
         </w:rPr>
       </w:pPr>
-      <w:bookmarkStart w:id="47" w:name="_Toc236324044"/>
+      <w:bookmarkStart w:id="48" w:name="_Toc236395967"/>
       <w:r>
         <w:rPr>
           <w:color w:val="auto"/>
@@ -8244,7 +8699,7 @@
         <w:lastRenderedPageBreak/>
         <w:t>Cronograma de ejecución</w:t>
       </w:r>
-      <w:bookmarkEnd w:id="47"/>
+      <w:bookmarkEnd w:id="48"/>
     </w:p>
     <w:p>
       <w:pPr>
@@ -8253,14 +8708,14 @@
           <w:color w:val="auto"/>
         </w:rPr>
       </w:pPr>
-      <w:bookmarkStart w:id="48" w:name="_Toc236324045"/>
+      <w:bookmarkStart w:id="49" w:name="_Toc236395968"/>
       <w:r>
         <w:rPr>
           <w:color w:val="auto"/>
         </w:rPr>
         <w:t>Fase 1 (13-19 de julio): datos y modelos base — completado</w:t>
       </w:r>
-      <w:bookmarkEnd w:id="48"/>
+      <w:bookmarkEnd w:id="49"/>
     </w:p>
     <w:p>
       <w:pPr>
@@ -8329,14 +8784,14 @@
           <w:color w:val="auto"/>
         </w:rPr>
       </w:pPr>
-      <w:bookmarkStart w:id="49" w:name="_Toc236324046"/>
+      <w:bookmarkStart w:id="50" w:name="_Toc236395969"/>
       <w:r>
         <w:rPr>
           <w:color w:val="auto"/>
         </w:rPr>
         <w:t>Fase 2 (20-24 de julio): modelado avanzado — completado</w:t>
       </w:r>
-      <w:bookmarkEnd w:id="49"/>
+      <w:bookmarkEnd w:id="50"/>
     </w:p>
     <w:p>
       <w:pPr>
@@ -8375,14 +8830,14 @@
           <w:color w:val="auto"/>
         </w:rPr>
       </w:pPr>
-      <w:bookmarkStart w:id="50" w:name="_Toc236324047"/>
+      <w:bookmarkStart w:id="51" w:name="_Toc236395970"/>
       <w:r>
         <w:rPr>
           <w:color w:val="auto"/>
         </w:rPr>
         <w:t>Fase 3 (24-26 de julio): interfaz y batch — completado</w:t>
       </w:r>
-      <w:bookmarkEnd w:id="50"/>
+      <w:bookmarkEnd w:id="51"/>
     </w:p>
     <w:p>
       <w:pPr>
@@ -8436,14 +8891,14 @@
           <w:color w:val="auto"/>
         </w:rPr>
       </w:pPr>
-      <w:bookmarkStart w:id="51" w:name="_Toc236324048"/>
+      <w:bookmarkStart w:id="52" w:name="_Toc236395971"/>
       <w:r>
         <w:rPr>
           <w:color w:val="auto"/>
         </w:rPr>
         <w:t>Fase 4 (27 de julio - 2 de agosto): consolidación — completado</w:t>
       </w:r>
-      <w:bookmarkEnd w:id="51"/>
+      <w:bookmarkEnd w:id="52"/>
     </w:p>
     <w:p>
       <w:pPr>
@@ -8467,14 +8922,14 @@
           <w:color w:val="auto"/>
         </w:rPr>
       </w:pPr>
-      <w:bookmarkStart w:id="52" w:name="_Toc236324049"/>
+      <w:bookmarkStart w:id="53" w:name="_Toc236395972"/>
       <w:r>
         <w:rPr>
           <w:color w:val="auto"/>
         </w:rPr>
         <w:t>Fase 5 (3-4 de agosto): cierre — en progreso</w:t>
       </w:r>
-      <w:bookmarkEnd w:id="52"/>
+      <w:bookmarkEnd w:id="53"/>
     </w:p>
     <w:p>
       <w:pPr>
@@ -8501,14 +8956,14 @@
           <w:color w:val="auto"/>
         </w:rPr>
       </w:pPr>
-      <w:bookmarkStart w:id="53" w:name="_Toc236324050"/>
+      <w:bookmarkStart w:id="54" w:name="_Toc236395973"/>
       <w:r>
         <w:rPr>
           <w:color w:val="auto"/>
         </w:rPr>
         <w:t>Conclusiones</w:t>
       </w:r>
-      <w:bookmarkEnd w:id="53"/>
+      <w:bookmarkEnd w:id="54"/>
     </w:p>
     <w:p>
       <w:pPr>

</xml_diff>

<commit_message>
docs: sincroniza Informe Tecnico con TOC actualizado (seccion de IA)
</commit_message>
<xml_diff>
--- a/documentacion/Informe_Tecnico_LINE_APA.docx
+++ b/documentacion/Informe_Tecnico_LINE_APA.docx
@@ -289,7 +289,7 @@
           <w:color w:val="auto"/>
         </w:rPr>
       </w:pPr>
-      <w:bookmarkStart w:id="0" w:name="_Toc236323997"/>
+      <w:bookmarkStart w:id="0" w:name="_Toc236395919"/>
       <w:r>
         <w:rPr>
           <w:color w:val="auto"/>
@@ -306,7 +306,14 @@
           <w:tab w:val="right" w:leader="dot" w:pos="9396"/>
         </w:tabs>
         <w:rPr>
+          <w:rFonts w:asciiTheme="minorHAnsi" w:eastAsiaTheme="minorEastAsia" w:hAnsiTheme="minorHAnsi"/>
           <w:noProof/>
+          <w:color w:val="auto"/>
+          <w:kern w:val="2"/>
+          <w:sz w:val="24"/>
+          <w:szCs w:val="24"/>
+          <w:lang w:val="es-CO" w:eastAsia="es-CO"/>
+          <w14:ligatures w14:val="standardContextual"/>
         </w:rPr>
       </w:pPr>
       <w:r>
@@ -327,7 +334,7 @@
         </w:rPr>
         <w:fldChar w:fldCharType="separate"/>
       </w:r>
-      <w:hyperlink w:anchor="_Toc236323997" w:history="1">
+      <w:hyperlink w:anchor="_Toc236395919" w:history="1">
         <w:r>
           <w:rPr>
             <w:rStyle w:val="Hipervnculo"/>
@@ -354,7 +361,7 @@
             <w:noProof/>
             <w:webHidden/>
           </w:rPr>
-          <w:instrText xml:space="preserve"> PAGEREF _Toc236323997 \h </w:instrText>
+          <w:instrText xml:space="preserve"> PAGEREF _Toc236395919 \h </w:instrText>
         </w:r>
         <w:r>
           <w:rPr>
@@ -392,10 +399,17 @@
           <w:tab w:val="right" w:leader="dot" w:pos="9396"/>
         </w:tabs>
         <w:rPr>
+          <w:rFonts w:asciiTheme="minorHAnsi" w:eastAsiaTheme="minorEastAsia" w:hAnsiTheme="minorHAnsi"/>
           <w:noProof/>
-        </w:rPr>
-      </w:pPr>
-      <w:hyperlink w:anchor="_Toc236323998" w:history="1">
+          <w:color w:val="auto"/>
+          <w:kern w:val="2"/>
+          <w:sz w:val="24"/>
+          <w:szCs w:val="24"/>
+          <w:lang w:val="es-CO" w:eastAsia="es-CO"/>
+          <w14:ligatures w14:val="standardContextual"/>
+        </w:rPr>
+      </w:pPr>
+      <w:hyperlink w:anchor="_Toc236395920" w:history="1">
         <w:r>
           <w:rPr>
             <w:rStyle w:val="Hipervnculo"/>
@@ -422,7 +436,7 @@
             <w:noProof/>
             <w:webHidden/>
           </w:rPr>
-          <w:instrText xml:space="preserve"> PAGEREF _Toc236323998 \h </w:instrText>
+          <w:instrText xml:space="preserve"> PAGEREF _Toc236395920 \h </w:instrText>
         </w:r>
         <w:r>
           <w:rPr>
@@ -460,10 +474,17 @@
           <w:tab w:val="right" w:leader="dot" w:pos="9396"/>
         </w:tabs>
         <w:rPr>
+          <w:rFonts w:asciiTheme="minorHAnsi" w:eastAsiaTheme="minorEastAsia" w:hAnsiTheme="minorHAnsi"/>
           <w:noProof/>
-        </w:rPr>
-      </w:pPr>
-      <w:hyperlink w:anchor="_Toc236323999" w:history="1">
+          <w:color w:val="auto"/>
+          <w:kern w:val="2"/>
+          <w:sz w:val="24"/>
+          <w:szCs w:val="24"/>
+          <w:lang w:val="es-CO" w:eastAsia="es-CO"/>
+          <w14:ligatures w14:val="standardContextual"/>
+        </w:rPr>
+      </w:pPr>
+      <w:hyperlink w:anchor="_Toc236395921" w:history="1">
         <w:r>
           <w:rPr>
             <w:rStyle w:val="Hipervnculo"/>
@@ -490,7 +511,7 @@
             <w:noProof/>
             <w:webHidden/>
           </w:rPr>
-          <w:instrText xml:space="preserve"> PAGEREF _Toc236323999 \h </w:instrText>
+          <w:instrText xml:space="preserve"> PAGEREF _Toc236395921 \h </w:instrText>
         </w:r>
         <w:r>
           <w:rPr>
@@ -528,10 +549,17 @@
           <w:tab w:val="right" w:leader="dot" w:pos="9396"/>
         </w:tabs>
         <w:rPr>
+          <w:rFonts w:asciiTheme="minorHAnsi" w:eastAsiaTheme="minorEastAsia" w:hAnsiTheme="minorHAnsi"/>
           <w:noProof/>
-        </w:rPr>
-      </w:pPr>
-      <w:hyperlink w:anchor="_Toc236324000" w:history="1">
+          <w:color w:val="auto"/>
+          <w:kern w:val="2"/>
+          <w:sz w:val="24"/>
+          <w:szCs w:val="24"/>
+          <w:lang w:val="es-CO" w:eastAsia="es-CO"/>
+          <w14:ligatures w14:val="standardContextual"/>
+        </w:rPr>
+      </w:pPr>
+      <w:hyperlink w:anchor="_Toc236395922" w:history="1">
         <w:r>
           <w:rPr>
             <w:rStyle w:val="Hipervnculo"/>
@@ -558,7 +586,7 @@
             <w:noProof/>
             <w:webHidden/>
           </w:rPr>
-          <w:instrText xml:space="preserve"> PAGEREF _Toc236324000 \h </w:instrText>
+          <w:instrText xml:space="preserve"> PAGEREF _Toc236395922 \h </w:instrText>
         </w:r>
         <w:r>
           <w:rPr>
@@ -596,10 +624,17 @@
           <w:tab w:val="right" w:leader="dot" w:pos="9396"/>
         </w:tabs>
         <w:rPr>
+          <w:rFonts w:asciiTheme="minorHAnsi" w:eastAsiaTheme="minorEastAsia" w:hAnsiTheme="minorHAnsi"/>
           <w:noProof/>
-        </w:rPr>
-      </w:pPr>
-      <w:hyperlink w:anchor="_Toc236324001" w:history="1">
+          <w:color w:val="auto"/>
+          <w:kern w:val="2"/>
+          <w:sz w:val="24"/>
+          <w:szCs w:val="24"/>
+          <w:lang w:val="es-CO" w:eastAsia="es-CO"/>
+          <w14:ligatures w14:val="standardContextual"/>
+        </w:rPr>
+      </w:pPr>
+      <w:hyperlink w:anchor="_Toc236395923" w:history="1">
         <w:r>
           <w:rPr>
             <w:rStyle w:val="Hipervnculo"/>
@@ -626,7 +661,7 @@
             <w:noProof/>
             <w:webHidden/>
           </w:rPr>
-          <w:instrText xml:space="preserve"> PAGEREF _Toc236324001 \h </w:instrText>
+          <w:instrText xml:space="preserve"> PAGEREF _Toc236395923 \h </w:instrText>
         </w:r>
         <w:r>
           <w:rPr>
@@ -664,10 +699,17 @@
           <w:tab w:val="right" w:leader="dot" w:pos="9396"/>
         </w:tabs>
         <w:rPr>
+          <w:rFonts w:asciiTheme="minorHAnsi" w:eastAsiaTheme="minorEastAsia" w:hAnsiTheme="minorHAnsi"/>
           <w:noProof/>
-        </w:rPr>
-      </w:pPr>
-      <w:hyperlink w:anchor="_Toc236324002" w:history="1">
+          <w:color w:val="auto"/>
+          <w:kern w:val="2"/>
+          <w:sz w:val="24"/>
+          <w:szCs w:val="24"/>
+          <w:lang w:val="es-CO" w:eastAsia="es-CO"/>
+          <w14:ligatures w14:val="standardContextual"/>
+        </w:rPr>
+      </w:pPr>
+      <w:hyperlink w:anchor="_Toc236395924" w:history="1">
         <w:r>
           <w:rPr>
             <w:rStyle w:val="Hipervnculo"/>
@@ -694,7 +736,7 @@
             <w:noProof/>
             <w:webHidden/>
           </w:rPr>
-          <w:instrText xml:space="preserve"> PAGEREF _Toc236324002 \h </w:instrText>
+          <w:instrText xml:space="preserve"> PAGEREF _Toc236395924 \h </w:instrText>
         </w:r>
         <w:r>
           <w:rPr>
@@ -732,10 +774,17 @@
           <w:tab w:val="right" w:leader="dot" w:pos="9396"/>
         </w:tabs>
         <w:rPr>
+          <w:rFonts w:asciiTheme="minorHAnsi" w:eastAsiaTheme="minorEastAsia" w:hAnsiTheme="minorHAnsi"/>
           <w:noProof/>
-        </w:rPr>
-      </w:pPr>
-      <w:hyperlink w:anchor="_Toc236324003" w:history="1">
+          <w:color w:val="auto"/>
+          <w:kern w:val="2"/>
+          <w:sz w:val="24"/>
+          <w:szCs w:val="24"/>
+          <w:lang w:val="es-CO" w:eastAsia="es-CO"/>
+          <w14:ligatures w14:val="standardContextual"/>
+        </w:rPr>
+      </w:pPr>
+      <w:hyperlink w:anchor="_Toc236395925" w:history="1">
         <w:r>
           <w:rPr>
             <w:rStyle w:val="Hipervnculo"/>
@@ -762,7 +811,7 @@
             <w:noProof/>
             <w:webHidden/>
           </w:rPr>
-          <w:instrText xml:space="preserve"> PAGEREF _Toc236324003 \h </w:instrText>
+          <w:instrText xml:space="preserve"> PAGEREF _Toc236395925 \h </w:instrText>
         </w:r>
         <w:r>
           <w:rPr>
@@ -800,10 +849,17 @@
           <w:tab w:val="right" w:leader="dot" w:pos="9396"/>
         </w:tabs>
         <w:rPr>
+          <w:rFonts w:asciiTheme="minorHAnsi" w:eastAsiaTheme="minorEastAsia" w:hAnsiTheme="minorHAnsi"/>
           <w:noProof/>
-        </w:rPr>
-      </w:pPr>
-      <w:hyperlink w:anchor="_Toc236324004" w:history="1">
+          <w:color w:val="auto"/>
+          <w:kern w:val="2"/>
+          <w:sz w:val="24"/>
+          <w:szCs w:val="24"/>
+          <w:lang w:val="es-CO" w:eastAsia="es-CO"/>
+          <w14:ligatures w14:val="standardContextual"/>
+        </w:rPr>
+      </w:pPr>
+      <w:hyperlink w:anchor="_Toc236395926" w:history="1">
         <w:r>
           <w:rPr>
             <w:rStyle w:val="Hipervnculo"/>
@@ -830,7 +886,7 @@
             <w:noProof/>
             <w:webHidden/>
           </w:rPr>
-          <w:instrText xml:space="preserve"> PAGEREF _Toc236324004 \h </w:instrText>
+          <w:instrText xml:space="preserve"> PAGEREF _Toc236395926 \h </w:instrText>
         </w:r>
         <w:r>
           <w:rPr>
@@ -868,10 +924,17 @@
           <w:tab w:val="right" w:leader="dot" w:pos="9396"/>
         </w:tabs>
         <w:rPr>
+          <w:rFonts w:asciiTheme="minorHAnsi" w:eastAsiaTheme="minorEastAsia" w:hAnsiTheme="minorHAnsi"/>
           <w:noProof/>
-        </w:rPr>
-      </w:pPr>
-      <w:hyperlink w:anchor="_Toc236324005" w:history="1">
+          <w:color w:val="auto"/>
+          <w:kern w:val="2"/>
+          <w:sz w:val="24"/>
+          <w:szCs w:val="24"/>
+          <w:lang w:val="es-CO" w:eastAsia="es-CO"/>
+          <w14:ligatures w14:val="standardContextual"/>
+        </w:rPr>
+      </w:pPr>
+      <w:hyperlink w:anchor="_Toc236395927" w:history="1">
         <w:r>
           <w:rPr>
             <w:rStyle w:val="Hipervnculo"/>
@@ -899,7 +962,7 @@
             <w:noProof/>
             <w:webHidden/>
           </w:rPr>
-          <w:instrText xml:space="preserve"> PAGEREF _Toc236324005 \h </w:instrText>
+          <w:instrText xml:space="preserve"> PAGEREF _Toc236395927 \h </w:instrText>
         </w:r>
         <w:r>
           <w:rPr>
@@ -937,10 +1000,17 @@
           <w:tab w:val="right" w:leader="dot" w:pos="9396"/>
         </w:tabs>
         <w:rPr>
+          <w:rFonts w:asciiTheme="minorHAnsi" w:eastAsiaTheme="minorEastAsia" w:hAnsiTheme="minorHAnsi"/>
           <w:noProof/>
-        </w:rPr>
-      </w:pPr>
-      <w:hyperlink w:anchor="_Toc236324006" w:history="1">
+          <w:color w:val="auto"/>
+          <w:kern w:val="2"/>
+          <w:sz w:val="24"/>
+          <w:szCs w:val="24"/>
+          <w:lang w:val="es-CO" w:eastAsia="es-CO"/>
+          <w14:ligatures w14:val="standardContextual"/>
+        </w:rPr>
+      </w:pPr>
+      <w:hyperlink w:anchor="_Toc236395928" w:history="1">
         <w:r>
           <w:rPr>
             <w:rStyle w:val="Hipervnculo"/>
@@ -967,7 +1037,7 @@
             <w:noProof/>
             <w:webHidden/>
           </w:rPr>
-          <w:instrText xml:space="preserve"> PAGEREF _Toc236324006 \h </w:instrText>
+          <w:instrText xml:space="preserve"> PAGEREF _Toc236395928 \h </w:instrText>
         </w:r>
         <w:r>
           <w:rPr>
@@ -1005,10 +1075,17 @@
           <w:tab w:val="right" w:leader="dot" w:pos="9396"/>
         </w:tabs>
         <w:rPr>
+          <w:rFonts w:asciiTheme="minorHAnsi" w:eastAsiaTheme="minorEastAsia" w:hAnsiTheme="minorHAnsi"/>
           <w:noProof/>
-        </w:rPr>
-      </w:pPr>
-      <w:hyperlink w:anchor="_Toc236324007" w:history="1">
+          <w:color w:val="auto"/>
+          <w:kern w:val="2"/>
+          <w:sz w:val="24"/>
+          <w:szCs w:val="24"/>
+          <w:lang w:val="es-CO" w:eastAsia="es-CO"/>
+          <w14:ligatures w14:val="standardContextual"/>
+        </w:rPr>
+      </w:pPr>
+      <w:hyperlink w:anchor="_Toc236395929" w:history="1">
         <w:r>
           <w:rPr>
             <w:rStyle w:val="Hipervnculo"/>
@@ -1035,7 +1112,7 @@
             <w:noProof/>
             <w:webHidden/>
           </w:rPr>
-          <w:instrText xml:space="preserve"> PAGEREF _Toc236324007 \h </w:instrText>
+          <w:instrText xml:space="preserve"> PAGEREF _Toc236395929 \h </w:instrText>
         </w:r>
         <w:r>
           <w:rPr>
@@ -1073,10 +1150,17 @@
           <w:tab w:val="right" w:leader="dot" w:pos="9396"/>
         </w:tabs>
         <w:rPr>
+          <w:rFonts w:asciiTheme="minorHAnsi" w:eastAsiaTheme="minorEastAsia" w:hAnsiTheme="minorHAnsi"/>
           <w:noProof/>
-        </w:rPr>
-      </w:pPr>
-      <w:hyperlink w:anchor="_Toc236324008" w:history="1">
+          <w:color w:val="auto"/>
+          <w:kern w:val="2"/>
+          <w:sz w:val="24"/>
+          <w:szCs w:val="24"/>
+          <w:lang w:val="es-CO" w:eastAsia="es-CO"/>
+          <w14:ligatures w14:val="standardContextual"/>
+        </w:rPr>
+      </w:pPr>
+      <w:hyperlink w:anchor="_Toc236395930" w:history="1">
         <w:r>
           <w:rPr>
             <w:rStyle w:val="Hipervnculo"/>
@@ -1103,7 +1187,7 @@
             <w:noProof/>
             <w:webHidden/>
           </w:rPr>
-          <w:instrText xml:space="preserve"> PAGEREF _Toc236324008 \h </w:instrText>
+          <w:instrText xml:space="preserve"> PAGEREF _Toc236395930 \h </w:instrText>
         </w:r>
         <w:r>
           <w:rPr>
@@ -1141,10 +1225,17 @@
           <w:tab w:val="right" w:leader="dot" w:pos="9396"/>
         </w:tabs>
         <w:rPr>
+          <w:rFonts w:asciiTheme="minorHAnsi" w:eastAsiaTheme="minorEastAsia" w:hAnsiTheme="minorHAnsi"/>
           <w:noProof/>
-        </w:rPr>
-      </w:pPr>
-      <w:hyperlink w:anchor="_Toc236324009" w:history="1">
+          <w:color w:val="auto"/>
+          <w:kern w:val="2"/>
+          <w:sz w:val="24"/>
+          <w:szCs w:val="24"/>
+          <w:lang w:val="es-CO" w:eastAsia="es-CO"/>
+          <w14:ligatures w14:val="standardContextual"/>
+        </w:rPr>
+      </w:pPr>
+      <w:hyperlink w:anchor="_Toc236395931" w:history="1">
         <w:r>
           <w:rPr>
             <w:rStyle w:val="Hipervnculo"/>
@@ -1171,7 +1262,7 @@
             <w:noProof/>
             <w:webHidden/>
           </w:rPr>
-          <w:instrText xml:space="preserve"> PAGEREF _Toc236324009 \h </w:instrText>
+          <w:instrText xml:space="preserve"> PAGEREF _Toc236395931 \h </w:instrText>
         </w:r>
         <w:r>
           <w:rPr>
@@ -1209,10 +1300,17 @@
           <w:tab w:val="right" w:leader="dot" w:pos="9396"/>
         </w:tabs>
         <w:rPr>
+          <w:rFonts w:asciiTheme="minorHAnsi" w:eastAsiaTheme="minorEastAsia" w:hAnsiTheme="minorHAnsi"/>
           <w:noProof/>
-        </w:rPr>
-      </w:pPr>
-      <w:hyperlink w:anchor="_Toc236324010" w:history="1">
+          <w:color w:val="auto"/>
+          <w:kern w:val="2"/>
+          <w:sz w:val="24"/>
+          <w:szCs w:val="24"/>
+          <w:lang w:val="es-CO" w:eastAsia="es-CO"/>
+          <w14:ligatures w14:val="standardContextual"/>
+        </w:rPr>
+      </w:pPr>
+      <w:hyperlink w:anchor="_Toc236395932" w:history="1">
         <w:r>
           <w:rPr>
             <w:rStyle w:val="Hipervnculo"/>
@@ -1239,7 +1337,7 @@
             <w:noProof/>
             <w:webHidden/>
           </w:rPr>
-          <w:instrText xml:space="preserve"> PAGEREF _Toc236324010 \h </w:instrText>
+          <w:instrText xml:space="preserve"> PAGEREF _Toc236395932 \h </w:instrText>
         </w:r>
         <w:r>
           <w:rPr>
@@ -1277,10 +1375,17 @@
           <w:tab w:val="right" w:leader="dot" w:pos="9396"/>
         </w:tabs>
         <w:rPr>
+          <w:rFonts w:asciiTheme="minorHAnsi" w:eastAsiaTheme="minorEastAsia" w:hAnsiTheme="minorHAnsi"/>
           <w:noProof/>
-        </w:rPr>
-      </w:pPr>
-      <w:hyperlink w:anchor="_Toc236324011" w:history="1">
+          <w:color w:val="auto"/>
+          <w:kern w:val="2"/>
+          <w:sz w:val="24"/>
+          <w:szCs w:val="24"/>
+          <w:lang w:val="es-CO" w:eastAsia="es-CO"/>
+          <w14:ligatures w14:val="standardContextual"/>
+        </w:rPr>
+      </w:pPr>
+      <w:hyperlink w:anchor="_Toc236395933" w:history="1">
         <w:r>
           <w:rPr>
             <w:rStyle w:val="Hipervnculo"/>
@@ -1307,7 +1412,7 @@
             <w:noProof/>
             <w:webHidden/>
           </w:rPr>
-          <w:instrText xml:space="preserve"> PAGEREF _Toc236324011 \h </w:instrText>
+          <w:instrText xml:space="preserve"> PAGEREF _Toc236395933 \h </w:instrText>
         </w:r>
         <w:r>
           <w:rPr>
@@ -1345,10 +1450,17 @@
           <w:tab w:val="right" w:leader="dot" w:pos="9396"/>
         </w:tabs>
         <w:rPr>
+          <w:rFonts w:asciiTheme="minorHAnsi" w:eastAsiaTheme="minorEastAsia" w:hAnsiTheme="minorHAnsi"/>
           <w:noProof/>
-        </w:rPr>
-      </w:pPr>
-      <w:hyperlink w:anchor="_Toc236324012" w:history="1">
+          <w:color w:val="auto"/>
+          <w:kern w:val="2"/>
+          <w:sz w:val="24"/>
+          <w:szCs w:val="24"/>
+          <w:lang w:val="es-CO" w:eastAsia="es-CO"/>
+          <w14:ligatures w14:val="standardContextual"/>
+        </w:rPr>
+      </w:pPr>
+      <w:hyperlink w:anchor="_Toc236395934" w:history="1">
         <w:r>
           <w:rPr>
             <w:rStyle w:val="Hipervnculo"/>
@@ -1375,7 +1487,7 @@
             <w:noProof/>
             <w:webHidden/>
           </w:rPr>
-          <w:instrText xml:space="preserve"> PAGEREF _Toc236324012 \h </w:instrText>
+          <w:instrText xml:space="preserve"> PAGEREF _Toc236395934 \h </w:instrText>
         </w:r>
         <w:r>
           <w:rPr>
@@ -1413,10 +1525,17 @@
           <w:tab w:val="right" w:leader="dot" w:pos="9396"/>
         </w:tabs>
         <w:rPr>
+          <w:rFonts w:asciiTheme="minorHAnsi" w:eastAsiaTheme="minorEastAsia" w:hAnsiTheme="minorHAnsi"/>
           <w:noProof/>
-        </w:rPr>
-      </w:pPr>
-      <w:hyperlink w:anchor="_Toc236324013" w:history="1">
+          <w:color w:val="auto"/>
+          <w:kern w:val="2"/>
+          <w:sz w:val="24"/>
+          <w:szCs w:val="24"/>
+          <w:lang w:val="es-CO" w:eastAsia="es-CO"/>
+          <w14:ligatures w14:val="standardContextual"/>
+        </w:rPr>
+      </w:pPr>
+      <w:hyperlink w:anchor="_Toc236395935" w:history="1">
         <w:r>
           <w:rPr>
             <w:rStyle w:val="Hipervnculo"/>
@@ -1443,7 +1562,7 @@
             <w:noProof/>
             <w:webHidden/>
           </w:rPr>
-          <w:instrText xml:space="preserve"> PAGEREF _Toc236324013 \h </w:instrText>
+          <w:instrText xml:space="preserve"> PAGEREF _Toc236395935 \h </w:instrText>
         </w:r>
         <w:r>
           <w:rPr>
@@ -1481,10 +1600,17 @@
           <w:tab w:val="right" w:leader="dot" w:pos="9396"/>
         </w:tabs>
         <w:rPr>
+          <w:rFonts w:asciiTheme="minorHAnsi" w:eastAsiaTheme="minorEastAsia" w:hAnsiTheme="minorHAnsi"/>
           <w:noProof/>
-        </w:rPr>
-      </w:pPr>
-      <w:hyperlink w:anchor="_Toc236324014" w:history="1">
+          <w:color w:val="auto"/>
+          <w:kern w:val="2"/>
+          <w:sz w:val="24"/>
+          <w:szCs w:val="24"/>
+          <w:lang w:val="es-CO" w:eastAsia="es-CO"/>
+          <w14:ligatures w14:val="standardContextual"/>
+        </w:rPr>
+      </w:pPr>
+      <w:hyperlink w:anchor="_Toc236395936" w:history="1">
         <w:r>
           <w:rPr>
             <w:rStyle w:val="Hipervnculo"/>
@@ -1511,7 +1637,7 @@
             <w:noProof/>
             <w:webHidden/>
           </w:rPr>
-          <w:instrText xml:space="preserve"> PAGEREF _Toc236324014 \h </w:instrText>
+          <w:instrText xml:space="preserve"> PAGEREF _Toc236395936 \h </w:instrText>
         </w:r>
         <w:r>
           <w:rPr>
@@ -1549,10 +1675,17 @@
           <w:tab w:val="right" w:leader="dot" w:pos="9396"/>
         </w:tabs>
         <w:rPr>
+          <w:rFonts w:asciiTheme="minorHAnsi" w:eastAsiaTheme="minorEastAsia" w:hAnsiTheme="minorHAnsi"/>
           <w:noProof/>
-        </w:rPr>
-      </w:pPr>
-      <w:hyperlink w:anchor="_Toc236324015" w:history="1">
+          <w:color w:val="auto"/>
+          <w:kern w:val="2"/>
+          <w:sz w:val="24"/>
+          <w:szCs w:val="24"/>
+          <w:lang w:val="es-CO" w:eastAsia="es-CO"/>
+          <w14:ligatures w14:val="standardContextual"/>
+        </w:rPr>
+      </w:pPr>
+      <w:hyperlink w:anchor="_Toc236395937" w:history="1">
         <w:r>
           <w:rPr>
             <w:rStyle w:val="Hipervnculo"/>
@@ -1580,7 +1713,7 @@
             <w:noProof/>
             <w:webHidden/>
           </w:rPr>
-          <w:instrText xml:space="preserve"> PAGEREF _Toc236324015 \h </w:instrText>
+          <w:instrText xml:space="preserve"> PAGEREF _Toc236395937 \h </w:instrText>
         </w:r>
         <w:r>
           <w:rPr>
@@ -1618,10 +1751,17 @@
           <w:tab w:val="right" w:leader="dot" w:pos="9396"/>
         </w:tabs>
         <w:rPr>
+          <w:rFonts w:asciiTheme="minorHAnsi" w:eastAsiaTheme="minorEastAsia" w:hAnsiTheme="minorHAnsi"/>
           <w:noProof/>
-        </w:rPr>
-      </w:pPr>
-      <w:hyperlink w:anchor="_Toc236324016" w:history="1">
+          <w:color w:val="auto"/>
+          <w:kern w:val="2"/>
+          <w:sz w:val="24"/>
+          <w:szCs w:val="24"/>
+          <w:lang w:val="es-CO" w:eastAsia="es-CO"/>
+          <w14:ligatures w14:val="standardContextual"/>
+        </w:rPr>
+      </w:pPr>
+      <w:hyperlink w:anchor="_Toc236395938" w:history="1">
         <w:r>
           <w:rPr>
             <w:rStyle w:val="Hipervnculo"/>
@@ -1649,7 +1789,7 @@
             <w:noProof/>
             <w:webHidden/>
           </w:rPr>
-          <w:instrText xml:space="preserve"> PAGEREF _Toc236324016 \h </w:instrText>
+          <w:instrText xml:space="preserve"> PAGEREF _Toc236395938 \h </w:instrText>
         </w:r>
         <w:r>
           <w:rPr>
@@ -1687,10 +1827,17 @@
           <w:tab w:val="right" w:leader="dot" w:pos="9396"/>
         </w:tabs>
         <w:rPr>
+          <w:rFonts w:asciiTheme="minorHAnsi" w:eastAsiaTheme="minorEastAsia" w:hAnsiTheme="minorHAnsi"/>
           <w:noProof/>
-        </w:rPr>
-      </w:pPr>
-      <w:hyperlink w:anchor="_Toc236324017" w:history="1">
+          <w:color w:val="auto"/>
+          <w:kern w:val="2"/>
+          <w:sz w:val="24"/>
+          <w:szCs w:val="24"/>
+          <w:lang w:val="es-CO" w:eastAsia="es-CO"/>
+          <w14:ligatures w14:val="standardContextual"/>
+        </w:rPr>
+      </w:pPr>
+      <w:hyperlink w:anchor="_Toc236395939" w:history="1">
         <w:r>
           <w:rPr>
             <w:rStyle w:val="Hipervnculo"/>
@@ -1718,7 +1865,7 @@
             <w:noProof/>
             <w:webHidden/>
           </w:rPr>
-          <w:instrText xml:space="preserve"> PAGEREF _Toc236324017 \h </w:instrText>
+          <w:instrText xml:space="preserve"> PAGEREF _Toc236395939 \h </w:instrText>
         </w:r>
         <w:r>
           <w:rPr>
@@ -1738,7 +1885,7 @@
             <w:noProof/>
             <w:webHidden/>
           </w:rPr>
-          <w:t>9</w:t>
+          <w:t>8</w:t>
         </w:r>
         <w:r>
           <w:rPr>
@@ -1756,10 +1903,17 @@
           <w:tab w:val="right" w:leader="dot" w:pos="9396"/>
         </w:tabs>
         <w:rPr>
+          <w:rFonts w:asciiTheme="minorHAnsi" w:eastAsiaTheme="minorEastAsia" w:hAnsiTheme="minorHAnsi"/>
           <w:noProof/>
-        </w:rPr>
-      </w:pPr>
-      <w:hyperlink w:anchor="_Toc236324018" w:history="1">
+          <w:color w:val="auto"/>
+          <w:kern w:val="2"/>
+          <w:sz w:val="24"/>
+          <w:szCs w:val="24"/>
+          <w:lang w:val="es-CO" w:eastAsia="es-CO"/>
+          <w14:ligatures w14:val="standardContextual"/>
+        </w:rPr>
+      </w:pPr>
+      <w:hyperlink w:anchor="_Toc236395940" w:history="1">
         <w:r>
           <w:rPr>
             <w:rStyle w:val="Hipervnculo"/>
@@ -1786,7 +1940,7 @@
             <w:noProof/>
             <w:webHidden/>
           </w:rPr>
-          <w:instrText xml:space="preserve"> PAGEREF _Toc236324018 \h </w:instrText>
+          <w:instrText xml:space="preserve"> PAGEREF _Toc236395940 \h </w:instrText>
         </w:r>
         <w:r>
           <w:rPr>
@@ -1824,10 +1978,17 @@
           <w:tab w:val="right" w:leader="dot" w:pos="9396"/>
         </w:tabs>
         <w:rPr>
+          <w:rFonts w:asciiTheme="minorHAnsi" w:eastAsiaTheme="minorEastAsia" w:hAnsiTheme="minorHAnsi"/>
           <w:noProof/>
-        </w:rPr>
-      </w:pPr>
-      <w:hyperlink w:anchor="_Toc236324019" w:history="1">
+          <w:color w:val="auto"/>
+          <w:kern w:val="2"/>
+          <w:sz w:val="24"/>
+          <w:szCs w:val="24"/>
+          <w:lang w:val="es-CO" w:eastAsia="es-CO"/>
+          <w14:ligatures w14:val="standardContextual"/>
+        </w:rPr>
+      </w:pPr>
+      <w:hyperlink w:anchor="_Toc236395941" w:history="1">
         <w:r>
           <w:rPr>
             <w:rStyle w:val="Hipervnculo"/>
@@ -1854,7 +2015,7 @@
             <w:noProof/>
             <w:webHidden/>
           </w:rPr>
-          <w:instrText xml:space="preserve"> PAGEREF _Toc236324019 \h </w:instrText>
+          <w:instrText xml:space="preserve"> PAGEREF _Toc236395941 \h </w:instrText>
         </w:r>
         <w:r>
           <w:rPr>
@@ -1892,10 +2053,17 @@
           <w:tab w:val="right" w:leader="dot" w:pos="9396"/>
         </w:tabs>
         <w:rPr>
+          <w:rFonts w:asciiTheme="minorHAnsi" w:eastAsiaTheme="minorEastAsia" w:hAnsiTheme="minorHAnsi"/>
           <w:noProof/>
-        </w:rPr>
-      </w:pPr>
-      <w:hyperlink w:anchor="_Toc236324020" w:history="1">
+          <w:color w:val="auto"/>
+          <w:kern w:val="2"/>
+          <w:sz w:val="24"/>
+          <w:szCs w:val="24"/>
+          <w:lang w:val="es-CO" w:eastAsia="es-CO"/>
+          <w14:ligatures w14:val="standardContextual"/>
+        </w:rPr>
+      </w:pPr>
+      <w:hyperlink w:anchor="_Toc236395942" w:history="1">
         <w:r>
           <w:rPr>
             <w:rStyle w:val="Hipervnculo"/>
@@ -1922,7 +2090,7 @@
             <w:noProof/>
             <w:webHidden/>
           </w:rPr>
-          <w:instrText xml:space="preserve"> PAGEREF _Toc236324020 \h </w:instrText>
+          <w:instrText xml:space="preserve"> PAGEREF _Toc236395942 \h </w:instrText>
         </w:r>
         <w:r>
           <w:rPr>
@@ -1960,10 +2128,17 @@
           <w:tab w:val="right" w:leader="dot" w:pos="9396"/>
         </w:tabs>
         <w:rPr>
+          <w:rFonts w:asciiTheme="minorHAnsi" w:eastAsiaTheme="minorEastAsia" w:hAnsiTheme="minorHAnsi"/>
           <w:noProof/>
-        </w:rPr>
-      </w:pPr>
-      <w:hyperlink w:anchor="_Toc236324021" w:history="1">
+          <w:color w:val="auto"/>
+          <w:kern w:val="2"/>
+          <w:sz w:val="24"/>
+          <w:szCs w:val="24"/>
+          <w:lang w:val="es-CO" w:eastAsia="es-CO"/>
+          <w14:ligatures w14:val="standardContextual"/>
+        </w:rPr>
+      </w:pPr>
+      <w:hyperlink w:anchor="_Toc236395943" w:history="1">
         <w:r>
           <w:rPr>
             <w:rStyle w:val="Hipervnculo"/>
@@ -1990,7 +2165,7 @@
             <w:noProof/>
             <w:webHidden/>
           </w:rPr>
-          <w:instrText xml:space="preserve"> PAGEREF _Toc236324021 \h </w:instrText>
+          <w:instrText xml:space="preserve"> PAGEREF _Toc236395943 \h </w:instrText>
         </w:r>
         <w:r>
           <w:rPr>
@@ -2028,10 +2203,17 @@
           <w:tab w:val="right" w:leader="dot" w:pos="9396"/>
         </w:tabs>
         <w:rPr>
+          <w:rFonts w:asciiTheme="minorHAnsi" w:eastAsiaTheme="minorEastAsia" w:hAnsiTheme="minorHAnsi"/>
           <w:noProof/>
-        </w:rPr>
-      </w:pPr>
-      <w:hyperlink w:anchor="_Toc236324022" w:history="1">
+          <w:color w:val="auto"/>
+          <w:kern w:val="2"/>
+          <w:sz w:val="24"/>
+          <w:szCs w:val="24"/>
+          <w:lang w:val="es-CO" w:eastAsia="es-CO"/>
+          <w14:ligatures w14:val="standardContextual"/>
+        </w:rPr>
+      </w:pPr>
+      <w:hyperlink w:anchor="_Toc236395944" w:history="1">
         <w:r>
           <w:rPr>
             <w:rStyle w:val="Hipervnculo"/>
@@ -2058,7 +2240,7 @@
             <w:noProof/>
             <w:webHidden/>
           </w:rPr>
-          <w:instrText xml:space="preserve"> PAGEREF _Toc236324022 \h </w:instrText>
+          <w:instrText xml:space="preserve"> PAGEREF _Toc236395944 \h </w:instrText>
         </w:r>
         <w:r>
           <w:rPr>
@@ -2096,10 +2278,17 @@
           <w:tab w:val="right" w:leader="dot" w:pos="9396"/>
         </w:tabs>
         <w:rPr>
+          <w:rFonts w:asciiTheme="minorHAnsi" w:eastAsiaTheme="minorEastAsia" w:hAnsiTheme="minorHAnsi"/>
           <w:noProof/>
-        </w:rPr>
-      </w:pPr>
-      <w:hyperlink w:anchor="_Toc236324023" w:history="1">
+          <w:color w:val="auto"/>
+          <w:kern w:val="2"/>
+          <w:sz w:val="24"/>
+          <w:szCs w:val="24"/>
+          <w:lang w:val="es-CO" w:eastAsia="es-CO"/>
+          <w14:ligatures w14:val="standardContextual"/>
+        </w:rPr>
+      </w:pPr>
+      <w:hyperlink w:anchor="_Toc236395945" w:history="1">
         <w:r>
           <w:rPr>
             <w:rStyle w:val="Hipervnculo"/>
@@ -2126,7 +2315,7 @@
             <w:noProof/>
             <w:webHidden/>
           </w:rPr>
-          <w:instrText xml:space="preserve"> PAGEREF _Toc236324023 \h </w:instrText>
+          <w:instrText xml:space="preserve"> PAGEREF _Toc236395945 \h </w:instrText>
         </w:r>
         <w:r>
           <w:rPr>
@@ -2164,10 +2353,17 @@
           <w:tab w:val="right" w:leader="dot" w:pos="9396"/>
         </w:tabs>
         <w:rPr>
+          <w:rFonts w:asciiTheme="minorHAnsi" w:eastAsiaTheme="minorEastAsia" w:hAnsiTheme="minorHAnsi"/>
           <w:noProof/>
-        </w:rPr>
-      </w:pPr>
-      <w:hyperlink w:anchor="_Toc236324024" w:history="1">
+          <w:color w:val="auto"/>
+          <w:kern w:val="2"/>
+          <w:sz w:val="24"/>
+          <w:szCs w:val="24"/>
+          <w:lang w:val="es-CO" w:eastAsia="es-CO"/>
+          <w14:ligatures w14:val="standardContextual"/>
+        </w:rPr>
+      </w:pPr>
+      <w:hyperlink w:anchor="_Toc236395946" w:history="1">
         <w:r>
           <w:rPr>
             <w:rStyle w:val="Hipervnculo"/>
@@ -2194,7 +2390,7 @@
             <w:noProof/>
             <w:webHidden/>
           </w:rPr>
-          <w:instrText xml:space="preserve"> PAGEREF _Toc236324024 \h </w:instrText>
+          <w:instrText xml:space="preserve"> PAGEREF _Toc236395946 \h </w:instrText>
         </w:r>
         <w:r>
           <w:rPr>
@@ -2232,10 +2428,17 @@
           <w:tab w:val="right" w:leader="dot" w:pos="9396"/>
         </w:tabs>
         <w:rPr>
+          <w:rFonts w:asciiTheme="minorHAnsi" w:eastAsiaTheme="minorEastAsia" w:hAnsiTheme="minorHAnsi"/>
           <w:noProof/>
-        </w:rPr>
-      </w:pPr>
-      <w:hyperlink w:anchor="_Toc236324025" w:history="1">
+          <w:color w:val="auto"/>
+          <w:kern w:val="2"/>
+          <w:sz w:val="24"/>
+          <w:szCs w:val="24"/>
+          <w:lang w:val="es-CO" w:eastAsia="es-CO"/>
+          <w14:ligatures w14:val="standardContextual"/>
+        </w:rPr>
+      </w:pPr>
+      <w:hyperlink w:anchor="_Toc236395947" w:history="1">
         <w:r>
           <w:rPr>
             <w:rStyle w:val="Hipervnculo"/>
@@ -2262,7 +2465,7 @@
             <w:noProof/>
             <w:webHidden/>
           </w:rPr>
-          <w:instrText xml:space="preserve"> PAGEREF _Toc236324025 \h </w:instrText>
+          <w:instrText xml:space="preserve"> PAGEREF _Toc236395947 \h </w:instrText>
         </w:r>
         <w:r>
           <w:rPr>
@@ -2300,10 +2503,17 @@
           <w:tab w:val="right" w:leader="dot" w:pos="9396"/>
         </w:tabs>
         <w:rPr>
+          <w:rFonts w:asciiTheme="minorHAnsi" w:eastAsiaTheme="minorEastAsia" w:hAnsiTheme="minorHAnsi"/>
           <w:noProof/>
-        </w:rPr>
-      </w:pPr>
-      <w:hyperlink w:anchor="_Toc236324026" w:history="1">
+          <w:color w:val="auto"/>
+          <w:kern w:val="2"/>
+          <w:sz w:val="24"/>
+          <w:szCs w:val="24"/>
+          <w:lang w:val="es-CO" w:eastAsia="es-CO"/>
+          <w14:ligatures w14:val="standardContextual"/>
+        </w:rPr>
+      </w:pPr>
+      <w:hyperlink w:anchor="_Toc236395948" w:history="1">
         <w:r>
           <w:rPr>
             <w:rStyle w:val="Hipervnculo"/>
@@ -2330,7 +2540,7 @@
             <w:noProof/>
             <w:webHidden/>
           </w:rPr>
-          <w:instrText xml:space="preserve"> PAGEREF _Toc236324026 \h </w:instrText>
+          <w:instrText xml:space="preserve"> PAGEREF _Toc236395948 \h </w:instrText>
         </w:r>
         <w:r>
           <w:rPr>
@@ -2368,10 +2578,17 @@
           <w:tab w:val="right" w:leader="dot" w:pos="9396"/>
         </w:tabs>
         <w:rPr>
+          <w:rFonts w:asciiTheme="minorHAnsi" w:eastAsiaTheme="minorEastAsia" w:hAnsiTheme="minorHAnsi"/>
           <w:noProof/>
-        </w:rPr>
-      </w:pPr>
-      <w:hyperlink w:anchor="_Toc236324027" w:history="1">
+          <w:color w:val="auto"/>
+          <w:kern w:val="2"/>
+          <w:sz w:val="24"/>
+          <w:szCs w:val="24"/>
+          <w:lang w:val="es-CO" w:eastAsia="es-CO"/>
+          <w14:ligatures w14:val="standardContextual"/>
+        </w:rPr>
+      </w:pPr>
+      <w:hyperlink w:anchor="_Toc236395949" w:history="1">
         <w:r>
           <w:rPr>
             <w:rStyle w:val="Hipervnculo"/>
@@ -2398,7 +2615,7 @@
             <w:noProof/>
             <w:webHidden/>
           </w:rPr>
-          <w:instrText xml:space="preserve"> PAGEREF _Toc236324027 \h </w:instrText>
+          <w:instrText xml:space="preserve"> PAGEREF _Toc236395949 \h </w:instrText>
         </w:r>
         <w:r>
           <w:rPr>
@@ -2418,7 +2635,7 @@
             <w:noProof/>
             <w:webHidden/>
           </w:rPr>
-          <w:t>13</w:t>
+          <w:t>12</w:t>
         </w:r>
         <w:r>
           <w:rPr>
@@ -2436,10 +2653,17 @@
           <w:tab w:val="right" w:leader="dot" w:pos="9396"/>
         </w:tabs>
         <w:rPr>
+          <w:rFonts w:asciiTheme="minorHAnsi" w:eastAsiaTheme="minorEastAsia" w:hAnsiTheme="minorHAnsi"/>
           <w:noProof/>
-        </w:rPr>
-      </w:pPr>
-      <w:hyperlink w:anchor="_Toc236324028" w:history="1">
+          <w:color w:val="auto"/>
+          <w:kern w:val="2"/>
+          <w:sz w:val="24"/>
+          <w:szCs w:val="24"/>
+          <w:lang w:val="es-CO" w:eastAsia="es-CO"/>
+          <w14:ligatures w14:val="standardContextual"/>
+        </w:rPr>
+      </w:pPr>
+      <w:hyperlink w:anchor="_Toc236395950" w:history="1">
         <w:r>
           <w:rPr>
             <w:rStyle w:val="Hipervnculo"/>
@@ -2466,7 +2690,7 @@
             <w:noProof/>
             <w:webHidden/>
           </w:rPr>
-          <w:instrText xml:space="preserve"> PAGEREF _Toc236324028 \h </w:instrText>
+          <w:instrText xml:space="preserve"> PAGEREF _Toc236395950 \h </w:instrText>
         </w:r>
         <w:r>
           <w:rPr>
@@ -2486,7 +2710,7 @@
             <w:noProof/>
             <w:webHidden/>
           </w:rPr>
-          <w:t>13</w:t>
+          <w:t>12</w:t>
         </w:r>
         <w:r>
           <w:rPr>
@@ -2504,10 +2728,17 @@
           <w:tab w:val="right" w:leader="dot" w:pos="9396"/>
         </w:tabs>
         <w:rPr>
+          <w:rFonts w:asciiTheme="minorHAnsi" w:eastAsiaTheme="minorEastAsia" w:hAnsiTheme="minorHAnsi"/>
           <w:noProof/>
-        </w:rPr>
-      </w:pPr>
-      <w:hyperlink w:anchor="_Toc236324029" w:history="1">
+          <w:color w:val="auto"/>
+          <w:kern w:val="2"/>
+          <w:sz w:val="24"/>
+          <w:szCs w:val="24"/>
+          <w:lang w:val="es-CO" w:eastAsia="es-CO"/>
+          <w14:ligatures w14:val="standardContextual"/>
+        </w:rPr>
+      </w:pPr>
+      <w:hyperlink w:anchor="_Toc236395951" w:history="1">
         <w:r>
           <w:rPr>
             <w:rStyle w:val="Hipervnculo"/>
@@ -2534,7 +2765,7 @@
             <w:noProof/>
             <w:webHidden/>
           </w:rPr>
-          <w:instrText xml:space="preserve"> PAGEREF _Toc236324029 \h </w:instrText>
+          <w:instrText xml:space="preserve"> PAGEREF _Toc236395951 \h </w:instrText>
         </w:r>
         <w:r>
           <w:rPr>
@@ -2554,7 +2785,7 @@
             <w:noProof/>
             <w:webHidden/>
           </w:rPr>
-          <w:t>13</w:t>
+          <w:t>12</w:t>
         </w:r>
         <w:r>
           <w:rPr>
@@ -2572,10 +2803,17 @@
           <w:tab w:val="right" w:leader="dot" w:pos="9396"/>
         </w:tabs>
         <w:rPr>
+          <w:rFonts w:asciiTheme="minorHAnsi" w:eastAsiaTheme="minorEastAsia" w:hAnsiTheme="minorHAnsi"/>
           <w:noProof/>
-        </w:rPr>
-      </w:pPr>
-      <w:hyperlink w:anchor="_Toc236324030" w:history="1">
+          <w:color w:val="auto"/>
+          <w:kern w:val="2"/>
+          <w:sz w:val="24"/>
+          <w:szCs w:val="24"/>
+          <w:lang w:val="es-CO" w:eastAsia="es-CO"/>
+          <w14:ligatures w14:val="standardContextual"/>
+        </w:rPr>
+      </w:pPr>
+      <w:hyperlink w:anchor="_Toc236395952" w:history="1">
         <w:r>
           <w:rPr>
             <w:rStyle w:val="Hipervnculo"/>
@@ -2602,7 +2840,7 @@
             <w:noProof/>
             <w:webHidden/>
           </w:rPr>
-          <w:instrText xml:space="preserve"> PAGEREF _Toc236324030 \h </w:instrText>
+          <w:instrText xml:space="preserve"> PAGEREF _Toc236395952 \h </w:instrText>
         </w:r>
         <w:r>
           <w:rPr>
@@ -2622,7 +2860,7 @@
             <w:noProof/>
             <w:webHidden/>
           </w:rPr>
-          <w:t>13</w:t>
+          <w:t>12</w:t>
         </w:r>
         <w:r>
           <w:rPr>
@@ -2640,10 +2878,17 @@
           <w:tab w:val="right" w:leader="dot" w:pos="9396"/>
         </w:tabs>
         <w:rPr>
+          <w:rFonts w:asciiTheme="minorHAnsi" w:eastAsiaTheme="minorEastAsia" w:hAnsiTheme="minorHAnsi"/>
           <w:noProof/>
-        </w:rPr>
-      </w:pPr>
-      <w:hyperlink w:anchor="_Toc236324031" w:history="1">
+          <w:color w:val="auto"/>
+          <w:kern w:val="2"/>
+          <w:sz w:val="24"/>
+          <w:szCs w:val="24"/>
+          <w:lang w:val="es-CO" w:eastAsia="es-CO"/>
+          <w14:ligatures w14:val="standardContextual"/>
+        </w:rPr>
+      </w:pPr>
+      <w:hyperlink w:anchor="_Toc236395953" w:history="1">
         <w:r>
           <w:rPr>
             <w:rStyle w:val="Hipervnculo"/>
@@ -2670,7 +2915,7 @@
             <w:noProof/>
             <w:webHidden/>
           </w:rPr>
-          <w:instrText xml:space="preserve"> PAGEREF _Toc236324031 \h </w:instrText>
+          <w:instrText xml:space="preserve"> PAGEREF _Toc236395953 \h </w:instrText>
         </w:r>
         <w:r>
           <w:rPr>
@@ -2690,7 +2935,82 @@
             <w:noProof/>
             <w:webHidden/>
           </w:rPr>
-          <w:t>13</w:t>
+          <w:t>12</w:t>
+        </w:r>
+        <w:r>
+          <w:rPr>
+            <w:noProof/>
+            <w:webHidden/>
+          </w:rPr>
+          <w:fldChar w:fldCharType="end"/>
+        </w:r>
+      </w:hyperlink>
+    </w:p>
+    <w:p>
+      <w:pPr>
+        <w:pStyle w:val="TDC2"/>
+        <w:tabs>
+          <w:tab w:val="right" w:leader="dot" w:pos="9396"/>
+        </w:tabs>
+        <w:rPr>
+          <w:rFonts w:asciiTheme="minorHAnsi" w:eastAsiaTheme="minorEastAsia" w:hAnsiTheme="minorHAnsi"/>
+          <w:noProof/>
+          <w:color w:val="auto"/>
+          <w:kern w:val="2"/>
+          <w:sz w:val="24"/>
+          <w:szCs w:val="24"/>
+          <w:lang w:val="es-CO" w:eastAsia="es-CO"/>
+          <w14:ligatures w14:val="standardContextual"/>
+        </w:rPr>
+      </w:pPr>
+      <w:hyperlink w:anchor="_Toc236395954" w:history="1">
+        <w:r>
+          <w:rPr>
+            <w:rStyle w:val="Hipervnculo"/>
+            <w:noProof/>
+          </w:rPr>
+          <w:t>Uso de herramientas de IA en el desarrollo</w:t>
+        </w:r>
+        <w:r>
+          <w:rPr>
+            <w:noProof/>
+            <w:webHidden/>
+          </w:rPr>
+          <w:tab/>
+        </w:r>
+        <w:r>
+          <w:rPr>
+            <w:noProof/>
+            <w:webHidden/>
+          </w:rPr>
+          <w:fldChar w:fldCharType="begin"/>
+        </w:r>
+        <w:r>
+          <w:rPr>
+            <w:noProof/>
+            <w:webHidden/>
+          </w:rPr>
+          <w:instrText xml:space="preserve"> PAGEREF _Toc236395954 \h </w:instrText>
+        </w:r>
+        <w:r>
+          <w:rPr>
+            <w:noProof/>
+            <w:webHidden/>
+          </w:rPr>
+        </w:r>
+        <w:r>
+          <w:rPr>
+            <w:noProof/>
+            <w:webHidden/>
+          </w:rPr>
+          <w:fldChar w:fldCharType="separate"/>
+        </w:r>
+        <w:r>
+          <w:rPr>
+            <w:noProof/>
+            <w:webHidden/>
+          </w:rPr>
+          <w:t>12</w:t>
         </w:r>
         <w:r>
           <w:rPr>
@@ -2708,10 +3028,17 @@
           <w:tab w:val="right" w:leader="dot" w:pos="9396"/>
         </w:tabs>
         <w:rPr>
+          <w:rFonts w:asciiTheme="minorHAnsi" w:eastAsiaTheme="minorEastAsia" w:hAnsiTheme="minorHAnsi"/>
           <w:noProof/>
-        </w:rPr>
-      </w:pPr>
-      <w:hyperlink w:anchor="_Toc236324032" w:history="1">
+          <w:color w:val="auto"/>
+          <w:kern w:val="2"/>
+          <w:sz w:val="24"/>
+          <w:szCs w:val="24"/>
+          <w:lang w:val="es-CO" w:eastAsia="es-CO"/>
+          <w14:ligatures w14:val="standardContextual"/>
+        </w:rPr>
+      </w:pPr>
+      <w:hyperlink w:anchor="_Toc236395955" w:history="1">
         <w:r>
           <w:rPr>
             <w:rStyle w:val="Hipervnculo"/>
@@ -2738,7 +3065,7 @@
             <w:noProof/>
             <w:webHidden/>
           </w:rPr>
-          <w:instrText xml:space="preserve"> PAGEREF _Toc236324032 \h </w:instrText>
+          <w:instrText xml:space="preserve"> PAGEREF _Toc236395955 \h </w:instrText>
         </w:r>
         <w:r>
           <w:rPr>
@@ -2758,7 +3085,7 @@
             <w:noProof/>
             <w:webHidden/>
           </w:rPr>
-          <w:t>13</w:t>
+          <w:t>12</w:t>
         </w:r>
         <w:r>
           <w:rPr>
@@ -2776,10 +3103,17 @@
           <w:tab w:val="right" w:leader="dot" w:pos="9396"/>
         </w:tabs>
         <w:rPr>
+          <w:rFonts w:asciiTheme="minorHAnsi" w:eastAsiaTheme="minorEastAsia" w:hAnsiTheme="minorHAnsi"/>
           <w:noProof/>
-        </w:rPr>
-      </w:pPr>
-      <w:hyperlink w:anchor="_Toc236324033" w:history="1">
+          <w:color w:val="auto"/>
+          <w:kern w:val="2"/>
+          <w:sz w:val="24"/>
+          <w:szCs w:val="24"/>
+          <w:lang w:val="es-CO" w:eastAsia="es-CO"/>
+          <w14:ligatures w14:val="standardContextual"/>
+        </w:rPr>
+      </w:pPr>
+      <w:hyperlink w:anchor="_Toc236395956" w:history="1">
         <w:r>
           <w:rPr>
             <w:rStyle w:val="Hipervnculo"/>
@@ -2806,7 +3140,7 @@
             <w:noProof/>
             <w:webHidden/>
           </w:rPr>
-          <w:instrText xml:space="preserve"> PAGEREF _Toc236324033 \h </w:instrText>
+          <w:instrText xml:space="preserve"> PAGEREF _Toc236395956 \h </w:instrText>
         </w:r>
         <w:r>
           <w:rPr>
@@ -2844,10 +3178,17 @@
           <w:tab w:val="right" w:leader="dot" w:pos="9396"/>
         </w:tabs>
         <w:rPr>
+          <w:rFonts w:asciiTheme="minorHAnsi" w:eastAsiaTheme="minorEastAsia" w:hAnsiTheme="minorHAnsi"/>
           <w:noProof/>
-        </w:rPr>
-      </w:pPr>
-      <w:hyperlink w:anchor="_Toc236324034" w:history="1">
+          <w:color w:val="auto"/>
+          <w:kern w:val="2"/>
+          <w:sz w:val="24"/>
+          <w:szCs w:val="24"/>
+          <w:lang w:val="es-CO" w:eastAsia="es-CO"/>
+          <w14:ligatures w14:val="standardContextual"/>
+        </w:rPr>
+      </w:pPr>
+      <w:hyperlink w:anchor="_Toc236395957" w:history="1">
         <w:r>
           <w:rPr>
             <w:rStyle w:val="Hipervnculo"/>
@@ -2874,7 +3215,7 @@
             <w:noProof/>
             <w:webHidden/>
           </w:rPr>
-          <w:instrText xml:space="preserve"> PAGEREF _Toc236324034 \h </w:instrText>
+          <w:instrText xml:space="preserve"> PAGEREF _Toc236395957 \h </w:instrText>
         </w:r>
         <w:r>
           <w:rPr>
@@ -2894,7 +3235,7 @@
             <w:noProof/>
             <w:webHidden/>
           </w:rPr>
-          <w:t>14</w:t>
+          <w:t>13</w:t>
         </w:r>
         <w:r>
           <w:rPr>
@@ -2912,10 +3253,17 @@
           <w:tab w:val="right" w:leader="dot" w:pos="9396"/>
         </w:tabs>
         <w:rPr>
+          <w:rFonts w:asciiTheme="minorHAnsi" w:eastAsiaTheme="minorEastAsia" w:hAnsiTheme="minorHAnsi"/>
           <w:noProof/>
-        </w:rPr>
-      </w:pPr>
-      <w:hyperlink w:anchor="_Toc236324035" w:history="1">
+          <w:color w:val="auto"/>
+          <w:kern w:val="2"/>
+          <w:sz w:val="24"/>
+          <w:szCs w:val="24"/>
+          <w:lang w:val="es-CO" w:eastAsia="es-CO"/>
+          <w14:ligatures w14:val="standardContextual"/>
+        </w:rPr>
+      </w:pPr>
+      <w:hyperlink w:anchor="_Toc236395958" w:history="1">
         <w:r>
           <w:rPr>
             <w:rStyle w:val="Hipervnculo"/>
@@ -2942,7 +3290,7 @@
             <w:noProof/>
             <w:webHidden/>
           </w:rPr>
-          <w:instrText xml:space="preserve"> PAGEREF _Toc236324035 \h </w:instrText>
+          <w:instrText xml:space="preserve"> PAGEREF _Toc236395958 \h </w:instrText>
         </w:r>
         <w:r>
           <w:rPr>
@@ -2962,7 +3310,7 @@
             <w:noProof/>
             <w:webHidden/>
           </w:rPr>
-          <w:t>14</w:t>
+          <w:t>13</w:t>
         </w:r>
         <w:r>
           <w:rPr>
@@ -2980,10 +3328,17 @@
           <w:tab w:val="right" w:leader="dot" w:pos="9396"/>
         </w:tabs>
         <w:rPr>
+          <w:rFonts w:asciiTheme="minorHAnsi" w:eastAsiaTheme="minorEastAsia" w:hAnsiTheme="minorHAnsi"/>
           <w:noProof/>
-        </w:rPr>
-      </w:pPr>
-      <w:hyperlink w:anchor="_Toc236324036" w:history="1">
+          <w:color w:val="auto"/>
+          <w:kern w:val="2"/>
+          <w:sz w:val="24"/>
+          <w:szCs w:val="24"/>
+          <w:lang w:val="es-CO" w:eastAsia="es-CO"/>
+          <w14:ligatures w14:val="standardContextual"/>
+        </w:rPr>
+      </w:pPr>
+      <w:hyperlink w:anchor="_Toc236395959" w:history="1">
         <w:r>
           <w:rPr>
             <w:rStyle w:val="Hipervnculo"/>
@@ -3010,7 +3365,7 @@
             <w:noProof/>
             <w:webHidden/>
           </w:rPr>
-          <w:instrText xml:space="preserve"> PAGEREF _Toc236324036 \h </w:instrText>
+          <w:instrText xml:space="preserve"> PAGEREF _Toc236395959 \h </w:instrText>
         </w:r>
         <w:r>
           <w:rPr>
@@ -3048,10 +3403,17 @@
           <w:tab w:val="right" w:leader="dot" w:pos="9396"/>
         </w:tabs>
         <w:rPr>
+          <w:rFonts w:asciiTheme="minorHAnsi" w:eastAsiaTheme="minorEastAsia" w:hAnsiTheme="minorHAnsi"/>
           <w:noProof/>
-        </w:rPr>
-      </w:pPr>
-      <w:hyperlink w:anchor="_Toc236324037" w:history="1">
+          <w:color w:val="auto"/>
+          <w:kern w:val="2"/>
+          <w:sz w:val="24"/>
+          <w:szCs w:val="24"/>
+          <w:lang w:val="es-CO" w:eastAsia="es-CO"/>
+          <w14:ligatures w14:val="standardContextual"/>
+        </w:rPr>
+      </w:pPr>
+      <w:hyperlink w:anchor="_Toc236395960" w:history="1">
         <w:r>
           <w:rPr>
             <w:rStyle w:val="Hipervnculo"/>
@@ -3078,7 +3440,7 @@
             <w:noProof/>
             <w:webHidden/>
           </w:rPr>
-          <w:instrText xml:space="preserve"> PAGEREF _Toc236324037 \h </w:instrText>
+          <w:instrText xml:space="preserve"> PAGEREF _Toc236395960 \h </w:instrText>
         </w:r>
         <w:r>
           <w:rPr>
@@ -3116,10 +3478,17 @@
           <w:tab w:val="right" w:leader="dot" w:pos="9396"/>
         </w:tabs>
         <w:rPr>
+          <w:rFonts w:asciiTheme="minorHAnsi" w:eastAsiaTheme="minorEastAsia" w:hAnsiTheme="minorHAnsi"/>
           <w:noProof/>
-        </w:rPr>
-      </w:pPr>
-      <w:hyperlink w:anchor="_Toc236324038" w:history="1">
+          <w:color w:val="auto"/>
+          <w:kern w:val="2"/>
+          <w:sz w:val="24"/>
+          <w:szCs w:val="24"/>
+          <w:lang w:val="es-CO" w:eastAsia="es-CO"/>
+          <w14:ligatures w14:val="standardContextual"/>
+        </w:rPr>
+      </w:pPr>
+      <w:hyperlink w:anchor="_Toc236395961" w:history="1">
         <w:r>
           <w:rPr>
             <w:rStyle w:val="Hipervnculo"/>
@@ -3146,7 +3515,7 @@
             <w:noProof/>
             <w:webHidden/>
           </w:rPr>
-          <w:instrText xml:space="preserve"> PAGEREF _Toc236324038 \h </w:instrText>
+          <w:instrText xml:space="preserve"> PAGEREF _Toc236395961 \h </w:instrText>
         </w:r>
         <w:r>
           <w:rPr>
@@ -3184,10 +3553,17 @@
           <w:tab w:val="right" w:leader="dot" w:pos="9396"/>
         </w:tabs>
         <w:rPr>
+          <w:rFonts w:asciiTheme="minorHAnsi" w:eastAsiaTheme="minorEastAsia" w:hAnsiTheme="minorHAnsi"/>
           <w:noProof/>
-        </w:rPr>
-      </w:pPr>
-      <w:hyperlink w:anchor="_Toc236324039" w:history="1">
+          <w:color w:val="auto"/>
+          <w:kern w:val="2"/>
+          <w:sz w:val="24"/>
+          <w:szCs w:val="24"/>
+          <w:lang w:val="es-CO" w:eastAsia="es-CO"/>
+          <w14:ligatures w14:val="standardContextual"/>
+        </w:rPr>
+      </w:pPr>
+      <w:hyperlink w:anchor="_Toc236395962" w:history="1">
         <w:r>
           <w:rPr>
             <w:rStyle w:val="Hipervnculo"/>
@@ -3214,7 +3590,7 @@
             <w:noProof/>
             <w:webHidden/>
           </w:rPr>
-          <w:instrText xml:space="preserve"> PAGEREF _Toc236324039 \h </w:instrText>
+          <w:instrText xml:space="preserve"> PAGEREF _Toc236395962 \h </w:instrText>
         </w:r>
         <w:r>
           <w:rPr>
@@ -3252,10 +3628,17 @@
           <w:tab w:val="right" w:leader="dot" w:pos="9396"/>
         </w:tabs>
         <w:rPr>
+          <w:rFonts w:asciiTheme="minorHAnsi" w:eastAsiaTheme="minorEastAsia" w:hAnsiTheme="minorHAnsi"/>
           <w:noProof/>
-        </w:rPr>
-      </w:pPr>
-      <w:hyperlink w:anchor="_Toc236324040" w:history="1">
+          <w:color w:val="auto"/>
+          <w:kern w:val="2"/>
+          <w:sz w:val="24"/>
+          <w:szCs w:val="24"/>
+          <w:lang w:val="es-CO" w:eastAsia="es-CO"/>
+          <w14:ligatures w14:val="standardContextual"/>
+        </w:rPr>
+      </w:pPr>
+      <w:hyperlink w:anchor="_Toc236395963" w:history="1">
         <w:r>
           <w:rPr>
             <w:rStyle w:val="Hipervnculo"/>
@@ -3282,7 +3665,7 @@
             <w:noProof/>
             <w:webHidden/>
           </w:rPr>
-          <w:instrText xml:space="preserve"> PAGEREF _Toc236324040 \h </w:instrText>
+          <w:instrText xml:space="preserve"> PAGEREF _Toc236395963 \h </w:instrText>
         </w:r>
         <w:r>
           <w:rPr>
@@ -3320,10 +3703,17 @@
           <w:tab w:val="right" w:leader="dot" w:pos="9396"/>
         </w:tabs>
         <w:rPr>
+          <w:rFonts w:asciiTheme="minorHAnsi" w:eastAsiaTheme="minorEastAsia" w:hAnsiTheme="minorHAnsi"/>
           <w:noProof/>
-        </w:rPr>
-      </w:pPr>
-      <w:hyperlink w:anchor="_Toc236324041" w:history="1">
+          <w:color w:val="auto"/>
+          <w:kern w:val="2"/>
+          <w:sz w:val="24"/>
+          <w:szCs w:val="24"/>
+          <w:lang w:val="es-CO" w:eastAsia="es-CO"/>
+          <w14:ligatures w14:val="standardContextual"/>
+        </w:rPr>
+      </w:pPr>
+      <w:hyperlink w:anchor="_Toc236395964" w:history="1">
         <w:r>
           <w:rPr>
             <w:rStyle w:val="Hipervnculo"/>
@@ -3350,7 +3740,7 @@
             <w:noProof/>
             <w:webHidden/>
           </w:rPr>
-          <w:instrText xml:space="preserve"> PAGEREF _Toc236324041 \h </w:instrText>
+          <w:instrText xml:space="preserve"> PAGEREF _Toc236395964 \h </w:instrText>
         </w:r>
         <w:r>
           <w:rPr>
@@ -3388,10 +3778,17 @@
           <w:tab w:val="right" w:leader="dot" w:pos="9396"/>
         </w:tabs>
         <w:rPr>
+          <w:rFonts w:asciiTheme="minorHAnsi" w:eastAsiaTheme="minorEastAsia" w:hAnsiTheme="minorHAnsi"/>
           <w:noProof/>
-        </w:rPr>
-      </w:pPr>
-      <w:hyperlink w:anchor="_Toc236324042" w:history="1">
+          <w:color w:val="auto"/>
+          <w:kern w:val="2"/>
+          <w:sz w:val="24"/>
+          <w:szCs w:val="24"/>
+          <w:lang w:val="es-CO" w:eastAsia="es-CO"/>
+          <w14:ligatures w14:val="standardContextual"/>
+        </w:rPr>
+      </w:pPr>
+      <w:hyperlink w:anchor="_Toc236395965" w:history="1">
         <w:r>
           <w:rPr>
             <w:rStyle w:val="Hipervnculo"/>
@@ -3418,7 +3815,7 @@
             <w:noProof/>
             <w:webHidden/>
           </w:rPr>
-          <w:instrText xml:space="preserve"> PAGEREF _Toc236324042 \h </w:instrText>
+          <w:instrText xml:space="preserve"> PAGEREF _Toc236395965 \h </w:instrText>
         </w:r>
         <w:r>
           <w:rPr>
@@ -3456,10 +3853,17 @@
           <w:tab w:val="right" w:leader="dot" w:pos="9396"/>
         </w:tabs>
         <w:rPr>
+          <w:rFonts w:asciiTheme="minorHAnsi" w:eastAsiaTheme="minorEastAsia" w:hAnsiTheme="minorHAnsi"/>
           <w:noProof/>
-        </w:rPr>
-      </w:pPr>
-      <w:hyperlink w:anchor="_Toc236324043" w:history="1">
+          <w:color w:val="auto"/>
+          <w:kern w:val="2"/>
+          <w:sz w:val="24"/>
+          <w:szCs w:val="24"/>
+          <w:lang w:val="es-CO" w:eastAsia="es-CO"/>
+          <w14:ligatures w14:val="standardContextual"/>
+        </w:rPr>
+      </w:pPr>
+      <w:hyperlink w:anchor="_Toc236395966" w:history="1">
         <w:r>
           <w:rPr>
             <w:rStyle w:val="Hipervnculo"/>
@@ -3486,7 +3890,7 @@
             <w:noProof/>
             <w:webHidden/>
           </w:rPr>
-          <w:instrText xml:space="preserve"> PAGEREF _Toc236324043 \h </w:instrText>
+          <w:instrText xml:space="preserve"> PAGEREF _Toc236395966 \h </w:instrText>
         </w:r>
         <w:r>
           <w:rPr>
@@ -3524,10 +3928,17 @@
           <w:tab w:val="right" w:leader="dot" w:pos="9396"/>
         </w:tabs>
         <w:rPr>
+          <w:rFonts w:asciiTheme="minorHAnsi" w:eastAsiaTheme="minorEastAsia" w:hAnsiTheme="minorHAnsi"/>
           <w:noProof/>
-        </w:rPr>
-      </w:pPr>
-      <w:hyperlink w:anchor="_Toc236324044" w:history="1">
+          <w:color w:val="auto"/>
+          <w:kern w:val="2"/>
+          <w:sz w:val="24"/>
+          <w:szCs w:val="24"/>
+          <w:lang w:val="es-CO" w:eastAsia="es-CO"/>
+          <w14:ligatures w14:val="standardContextual"/>
+        </w:rPr>
+      </w:pPr>
+      <w:hyperlink w:anchor="_Toc236395967" w:history="1">
         <w:r>
           <w:rPr>
             <w:rStyle w:val="Hipervnculo"/>
@@ -3554,7 +3965,7 @@
             <w:noProof/>
             <w:webHidden/>
           </w:rPr>
-          <w:instrText xml:space="preserve"> PAGEREF _Toc236324044 \h </w:instrText>
+          <w:instrText xml:space="preserve"> PAGEREF _Toc236395967 \h </w:instrText>
         </w:r>
         <w:r>
           <w:rPr>
@@ -3592,10 +4003,17 @@
           <w:tab w:val="right" w:leader="dot" w:pos="9396"/>
         </w:tabs>
         <w:rPr>
+          <w:rFonts w:asciiTheme="minorHAnsi" w:eastAsiaTheme="minorEastAsia" w:hAnsiTheme="minorHAnsi"/>
           <w:noProof/>
-        </w:rPr>
-      </w:pPr>
-      <w:hyperlink w:anchor="_Toc236324045" w:history="1">
+          <w:color w:val="auto"/>
+          <w:kern w:val="2"/>
+          <w:sz w:val="24"/>
+          <w:szCs w:val="24"/>
+          <w:lang w:val="es-CO" w:eastAsia="es-CO"/>
+          <w14:ligatures w14:val="standardContextual"/>
+        </w:rPr>
+      </w:pPr>
+      <w:hyperlink w:anchor="_Toc236395968" w:history="1">
         <w:r>
           <w:rPr>
             <w:rStyle w:val="Hipervnculo"/>
@@ -3622,7 +4040,7 @@
             <w:noProof/>
             <w:webHidden/>
           </w:rPr>
-          <w:instrText xml:space="preserve"> PAGEREF _Toc236324045 \h </w:instrText>
+          <w:instrText xml:space="preserve"> PAGEREF _Toc236395968 \h </w:instrText>
         </w:r>
         <w:r>
           <w:rPr>
@@ -3660,10 +4078,17 @@
           <w:tab w:val="right" w:leader="dot" w:pos="9396"/>
         </w:tabs>
         <w:rPr>
+          <w:rFonts w:asciiTheme="minorHAnsi" w:eastAsiaTheme="minorEastAsia" w:hAnsiTheme="minorHAnsi"/>
           <w:noProof/>
-        </w:rPr>
-      </w:pPr>
-      <w:hyperlink w:anchor="_Toc236324046" w:history="1">
+          <w:color w:val="auto"/>
+          <w:kern w:val="2"/>
+          <w:sz w:val="24"/>
+          <w:szCs w:val="24"/>
+          <w:lang w:val="es-CO" w:eastAsia="es-CO"/>
+          <w14:ligatures w14:val="standardContextual"/>
+        </w:rPr>
+      </w:pPr>
+      <w:hyperlink w:anchor="_Toc236395969" w:history="1">
         <w:r>
           <w:rPr>
             <w:rStyle w:val="Hipervnculo"/>
@@ -3690,7 +4115,7 @@
             <w:noProof/>
             <w:webHidden/>
           </w:rPr>
-          <w:instrText xml:space="preserve"> PAGEREF _Toc236324046 \h </w:instrText>
+          <w:instrText xml:space="preserve"> PAGEREF _Toc236395969 \h </w:instrText>
         </w:r>
         <w:r>
           <w:rPr>
@@ -3728,10 +4153,17 @@
           <w:tab w:val="right" w:leader="dot" w:pos="9396"/>
         </w:tabs>
         <w:rPr>
+          <w:rFonts w:asciiTheme="minorHAnsi" w:eastAsiaTheme="minorEastAsia" w:hAnsiTheme="minorHAnsi"/>
           <w:noProof/>
-        </w:rPr>
-      </w:pPr>
-      <w:hyperlink w:anchor="_Toc236324047" w:history="1">
+          <w:color w:val="auto"/>
+          <w:kern w:val="2"/>
+          <w:sz w:val="24"/>
+          <w:szCs w:val="24"/>
+          <w:lang w:val="es-CO" w:eastAsia="es-CO"/>
+          <w14:ligatures w14:val="standardContextual"/>
+        </w:rPr>
+      </w:pPr>
+      <w:hyperlink w:anchor="_Toc236395970" w:history="1">
         <w:r>
           <w:rPr>
             <w:rStyle w:val="Hipervnculo"/>
@@ -3758,7 +4190,7 @@
             <w:noProof/>
             <w:webHidden/>
           </w:rPr>
-          <w:instrText xml:space="preserve"> PAGEREF _Toc236324047 \h </w:instrText>
+          <w:instrText xml:space="preserve"> PAGEREF _Toc236395970 \h </w:instrText>
         </w:r>
         <w:r>
           <w:rPr>
@@ -3796,10 +4228,17 @@
           <w:tab w:val="right" w:leader="dot" w:pos="9396"/>
         </w:tabs>
         <w:rPr>
+          <w:rFonts w:asciiTheme="minorHAnsi" w:eastAsiaTheme="minorEastAsia" w:hAnsiTheme="minorHAnsi"/>
           <w:noProof/>
-        </w:rPr>
-      </w:pPr>
-      <w:hyperlink w:anchor="_Toc236324048" w:history="1">
+          <w:color w:val="auto"/>
+          <w:kern w:val="2"/>
+          <w:sz w:val="24"/>
+          <w:szCs w:val="24"/>
+          <w:lang w:val="es-CO" w:eastAsia="es-CO"/>
+          <w14:ligatures w14:val="standardContextual"/>
+        </w:rPr>
+      </w:pPr>
+      <w:hyperlink w:anchor="_Toc236395971" w:history="1">
         <w:r>
           <w:rPr>
             <w:rStyle w:val="Hipervnculo"/>
@@ -3826,7 +4265,7 @@
             <w:noProof/>
             <w:webHidden/>
           </w:rPr>
-          <w:instrText xml:space="preserve"> PAGEREF _Toc236324048 \h </w:instrText>
+          <w:instrText xml:space="preserve"> PAGEREF _Toc236395971 \h </w:instrText>
         </w:r>
         <w:r>
           <w:rPr>
@@ -3864,10 +4303,17 @@
           <w:tab w:val="right" w:leader="dot" w:pos="9396"/>
         </w:tabs>
         <w:rPr>
+          <w:rFonts w:asciiTheme="minorHAnsi" w:eastAsiaTheme="minorEastAsia" w:hAnsiTheme="minorHAnsi"/>
           <w:noProof/>
-        </w:rPr>
-      </w:pPr>
-      <w:hyperlink w:anchor="_Toc236324049" w:history="1">
+          <w:color w:val="auto"/>
+          <w:kern w:val="2"/>
+          <w:sz w:val="24"/>
+          <w:szCs w:val="24"/>
+          <w:lang w:val="es-CO" w:eastAsia="es-CO"/>
+          <w14:ligatures w14:val="standardContextual"/>
+        </w:rPr>
+      </w:pPr>
+      <w:hyperlink w:anchor="_Toc236395972" w:history="1">
         <w:r>
           <w:rPr>
             <w:rStyle w:val="Hipervnculo"/>
@@ -3894,7 +4340,7 @@
             <w:noProof/>
             <w:webHidden/>
           </w:rPr>
-          <w:instrText xml:space="preserve"> PAGEREF _Toc236324049 \h </w:instrText>
+          <w:instrText xml:space="preserve"> PAGEREF _Toc236395972 \h </w:instrText>
         </w:r>
         <w:r>
           <w:rPr>
@@ -3932,10 +4378,17 @@
           <w:tab w:val="right" w:leader="dot" w:pos="9396"/>
         </w:tabs>
         <w:rPr>
+          <w:rFonts w:asciiTheme="minorHAnsi" w:eastAsiaTheme="minorEastAsia" w:hAnsiTheme="minorHAnsi"/>
           <w:noProof/>
-        </w:rPr>
-      </w:pPr>
-      <w:hyperlink w:anchor="_Toc236324050" w:history="1">
+          <w:color w:val="auto"/>
+          <w:kern w:val="2"/>
+          <w:sz w:val="24"/>
+          <w:szCs w:val="24"/>
+          <w:lang w:val="es-CO" w:eastAsia="es-CO"/>
+          <w14:ligatures w14:val="standardContextual"/>
+        </w:rPr>
+      </w:pPr>
+      <w:hyperlink w:anchor="_Toc236395973" w:history="1">
         <w:r>
           <w:rPr>
             <w:rStyle w:val="Hipervnculo"/>
@@ -3962,7 +4415,7 @@
             <w:noProof/>
             <w:webHidden/>
           </w:rPr>
-          <w:instrText xml:space="preserve"> PAGEREF _Toc236324050 \h </w:instrText>
+          <w:instrText xml:space="preserve"> PAGEREF _Toc236395973 \h </w:instrText>
         </w:r>
         <w:r>
           <w:rPr>
@@ -4044,7 +4497,7 @@
           <w:color w:val="auto"/>
         </w:rPr>
       </w:pPr>
-      <w:bookmarkStart w:id="1" w:name="_Toc236323998"/>
+      <w:bookmarkStart w:id="1" w:name="_Toc236395920"/>
       <w:r>
         <w:rPr>
           <w:color w:val="auto"/>
@@ -4061,7 +4514,7 @@
           <w:color w:val="auto"/>
         </w:rPr>
       </w:pPr>
-      <w:bookmarkStart w:id="2" w:name="_Toc236323999"/>
+      <w:bookmarkStart w:id="2" w:name="_Toc236395921"/>
       <w:r>
         <w:rPr>
           <w:color w:val="auto"/>
@@ -4133,7 +4586,7 @@
           <w:color w:val="auto"/>
         </w:rPr>
       </w:pPr>
-      <w:bookmarkStart w:id="3" w:name="_Toc236324000"/>
+      <w:bookmarkStart w:id="3" w:name="_Toc236395922"/>
       <w:r>
         <w:rPr>
           <w:color w:val="auto"/>
@@ -4162,7 +4615,7 @@
           <w:color w:val="auto"/>
         </w:rPr>
       </w:pPr>
-      <w:bookmarkStart w:id="4" w:name="_Toc236324001"/>
+      <w:bookmarkStart w:id="4" w:name="_Toc236395923"/>
       <w:r>
         <w:rPr>
           <w:color w:val="auto"/>
@@ -4241,7 +4694,7 @@
           <w:color w:val="auto"/>
         </w:rPr>
       </w:pPr>
-      <w:bookmarkStart w:id="5" w:name="_Toc236324002"/>
+      <w:bookmarkStart w:id="5" w:name="_Toc236395924"/>
       <w:r>
         <w:rPr>
           <w:color w:val="auto"/>
@@ -4257,7 +4710,7 @@
           <w:color w:val="auto"/>
         </w:rPr>
       </w:pPr>
-      <w:bookmarkStart w:id="6" w:name="_Toc236324003"/>
+      <w:bookmarkStart w:id="6" w:name="_Toc236395925"/>
       <w:r>
         <w:rPr>
           <w:color w:val="auto"/>
@@ -4707,7 +5160,7 @@
           <w:color w:val="auto"/>
         </w:rPr>
       </w:pPr>
-      <w:bookmarkStart w:id="7" w:name="_Toc236324004"/>
+      <w:bookmarkStart w:id="7" w:name="_Toc236395926"/>
       <w:r>
         <w:rPr>
           <w:color w:val="auto"/>
@@ -4781,7 +5234,7 @@
           <w:color w:val="auto"/>
         </w:rPr>
       </w:pPr>
-      <w:bookmarkStart w:id="8" w:name="_Toc236324005"/>
+      <w:bookmarkStart w:id="8" w:name="_Toc236395927"/>
       <w:r>
         <w:rPr>
           <w:i/>
@@ -4811,7 +5264,7 @@
           <w:color w:val="auto"/>
         </w:rPr>
       </w:pPr>
-      <w:bookmarkStart w:id="9" w:name="_Toc236324006"/>
+      <w:bookmarkStart w:id="9" w:name="_Toc236395928"/>
       <w:r>
         <w:rPr>
           <w:color w:val="auto"/>
@@ -4933,7 +5386,7 @@
           <w:color w:val="auto"/>
         </w:rPr>
       </w:pPr>
-      <w:bookmarkStart w:id="10" w:name="_Toc236324007"/>
+      <w:bookmarkStart w:id="10" w:name="_Toc236395929"/>
       <w:r>
         <w:rPr>
           <w:color w:val="auto"/>
@@ -4963,7 +5416,7 @@
           <w:color w:val="auto"/>
         </w:rPr>
       </w:pPr>
-      <w:bookmarkStart w:id="11" w:name="_Toc236324008"/>
+      <w:bookmarkStart w:id="11" w:name="_Toc236395930"/>
       <w:r>
         <w:rPr>
           <w:color w:val="auto"/>
@@ -5018,7 +5471,7 @@
           <w:color w:val="auto"/>
         </w:rPr>
       </w:pPr>
-      <w:bookmarkStart w:id="12" w:name="_Toc236324009"/>
+      <w:bookmarkStart w:id="12" w:name="_Toc236395931"/>
       <w:r>
         <w:rPr>
           <w:color w:val="auto"/>
@@ -5060,7 +5513,7 @@
           <w:color w:val="auto"/>
         </w:rPr>
       </w:pPr>
-      <w:bookmarkStart w:id="13" w:name="_Toc236324010"/>
+      <w:bookmarkStart w:id="13" w:name="_Toc236395932"/>
       <w:r>
         <w:rPr>
           <w:color w:val="auto"/>
@@ -5109,7 +5562,7 @@
           <w:color w:val="auto"/>
         </w:rPr>
       </w:pPr>
-      <w:bookmarkStart w:id="14" w:name="_Toc236324011"/>
+      <w:bookmarkStart w:id="14" w:name="_Toc236395933"/>
       <w:r>
         <w:rPr>
           <w:color w:val="auto"/>
@@ -5167,7 +5620,7 @@
           <w:color w:val="auto"/>
         </w:rPr>
       </w:pPr>
-      <w:bookmarkStart w:id="15" w:name="_Toc236324012"/>
+      <w:bookmarkStart w:id="15" w:name="_Toc236395934"/>
       <w:r>
         <w:rPr>
           <w:color w:val="auto"/>
@@ -5184,7 +5637,7 @@
           <w:color w:val="auto"/>
         </w:rPr>
       </w:pPr>
-      <w:bookmarkStart w:id="16" w:name="_Toc236324013"/>
+      <w:bookmarkStart w:id="16" w:name="_Toc236395935"/>
       <w:r>
         <w:rPr>
           <w:color w:val="auto"/>
@@ -5695,7 +6148,7 @@
           <w:color w:val="auto"/>
         </w:rPr>
       </w:pPr>
-      <w:bookmarkStart w:id="17" w:name="_Toc236324014"/>
+      <w:bookmarkStart w:id="17" w:name="_Toc236395936"/>
       <w:r>
         <w:rPr>
           <w:color w:val="auto"/>
@@ -5724,7 +6177,7 @@
           <w:color w:val="auto"/>
         </w:rPr>
       </w:pPr>
-      <w:bookmarkStart w:id="18" w:name="_Toc236324015"/>
+      <w:bookmarkStart w:id="18" w:name="_Toc236395937"/>
       <w:r>
         <w:rPr>
           <w:i/>
@@ -5816,7 +6269,7 @@
           <w:color w:val="auto"/>
         </w:rPr>
       </w:pPr>
-      <w:bookmarkStart w:id="19" w:name="_Toc236324016"/>
+      <w:bookmarkStart w:id="19" w:name="_Toc236395938"/>
       <w:r>
         <w:rPr>
           <w:i/>
@@ -5908,13 +6361,12 @@
           <w:color w:val="auto"/>
         </w:rPr>
       </w:pPr>
-      <w:bookmarkStart w:id="20" w:name="_Toc236324017"/>
+      <w:bookmarkStart w:id="20" w:name="_Toc236395939"/>
       <w:r>
         <w:rPr>
           <w:i/>
           <w:color w:val="auto"/>
         </w:rPr>
-        <w:lastRenderedPageBreak/>
         <w:t>Selector de modelos y navegación</w:t>
       </w:r>
       <w:bookmarkEnd w:id="20"/>
@@ -5929,8 +6381,15 @@
         <w:rPr>
           <w:color w:val="auto"/>
         </w:rPr>
-        <w:t>La interfaz permite alternar entre CNN local (MobileNetV2), XGBoost y NVIDIA Nemotron, con el selector sincronizado entre la barra lateral y la pantalla de importación masiva. La navegación incluye las secciones de validación (análisis individual), importación masiva y soporte, con estados activos sincronizados.</w:t>
+        <w:t xml:space="preserve">La interfaz permite alternar entre CNN local (MobileNetV2), XGBoost y NVIDIA Nemotron, con el selector sincronizado entre la barra lateral y la pantalla de importación masiva. La navegación incluye las </w:t>
       </w:r>
+      <w:r>
+        <w:rPr>
+          <w:color w:val="auto"/>
+        </w:rPr>
+        <w:lastRenderedPageBreak/>
+        <w:t>secciones de validación (análisis individual), importación masiva y soporte, con estados activos sincronizados.</w:t>
+      </w:r>
     </w:p>
     <w:p>
       <w:pPr>
@@ -5939,7 +6398,7 @@
           <w:color w:val="auto"/>
         </w:rPr>
       </w:pPr>
-      <w:bookmarkStart w:id="21" w:name="_Toc236324018"/>
+      <w:bookmarkStart w:id="21" w:name="_Toc236395940"/>
       <w:r>
         <w:rPr>
           <w:color w:val="auto"/>
@@ -6003,7 +6462,7 @@
           <w:color w:val="auto"/>
         </w:rPr>
       </w:pPr>
-      <w:bookmarkStart w:id="22" w:name="_Toc236324019"/>
+      <w:bookmarkStart w:id="22" w:name="_Toc236395941"/>
       <w:r>
         <w:rPr>
           <w:color w:val="auto"/>
@@ -6020,7 +6479,7 @@
           <w:color w:val="auto"/>
         </w:rPr>
       </w:pPr>
-      <w:bookmarkStart w:id="23" w:name="_Toc236324020"/>
+      <w:bookmarkStart w:id="23" w:name="_Toc236395942"/>
       <w:r>
         <w:rPr>
           <w:color w:val="auto"/>
@@ -6335,7 +6794,7 @@
           <w:color w:val="auto"/>
         </w:rPr>
       </w:pPr>
-      <w:bookmarkStart w:id="24" w:name="_Toc236324021"/>
+      <w:bookmarkStart w:id="24" w:name="_Toc236395943"/>
       <w:r>
         <w:rPr>
           <w:color w:val="auto"/>
@@ -6650,7 +7109,7 @@
           <w:color w:val="auto"/>
         </w:rPr>
       </w:pPr>
-      <w:bookmarkStart w:id="25" w:name="_Toc236324022"/>
+      <w:bookmarkStart w:id="25" w:name="_Toc236395944"/>
       <w:r>
         <w:rPr>
           <w:color w:val="auto"/>
@@ -6711,7 +7170,7 @@
           <w:color w:val="auto"/>
         </w:rPr>
       </w:pPr>
-      <w:bookmarkStart w:id="26" w:name="_Toc236324023"/>
+      <w:bookmarkStart w:id="26" w:name="_Toc236395945"/>
       <w:r>
         <w:rPr>
           <w:color w:val="auto"/>
@@ -6730,29 +7189,23 @@
         <w:rPr>
           <w:color w:val="auto"/>
         </w:rPr>
-        <w:t xml:space="preserve">La Tabla 5 resume el desempeño de los tres modelos evaluados sobre el conjunto de prueba (30% estratificado, semilla fija). Las métricas de la CNN corresponden a la fase de fine-tuning con umbral ajustado para recall; las de XGBoost corresponden al modelo final tras la búsqueda de hiperparámetros y </w:t>
+        <w:t>La Tabla 5 resume el desempeño de los tres modelos evaluados sobre el conjunto de prueba (30% estratificado, semilla fija). Las métricas de la CNN corresponden a la fase de fine-tuning con umbral ajustado para recall; las de XGBoost corresponden al modelo final tras la búsqueda de hiperparámetros y la validación cruzada de 5 particiones (AUC promedio en validación cruzada = 0.881, DE = 0.011, sin señales de sobreajuste).</w:t>
       </w:r>
+    </w:p>
+    <w:p>
+      <w:pPr>
+        <w:spacing w:before="200" w:after="80"/>
+        <w:rPr>
+          <w:color w:val="auto"/>
+        </w:rPr>
+      </w:pPr>
       <w:r>
         <w:rPr>
-          <w:color w:val="auto"/>
+          <w:i/>
+          <w:color w:val="auto"/>
+          <w:sz w:val="20"/>
         </w:rPr>
         <w:lastRenderedPageBreak/>
-        <w:t>la validación cruzada de 5 particiones (AUC promedio en validación cruzada = 0.881, DE = 0.011, sin señales de sobreajuste).</w:t>
-      </w:r>
-    </w:p>
-    <w:p>
-      <w:pPr>
-        <w:spacing w:before="200" w:after="80"/>
-        <w:rPr>
-          <w:color w:val="auto"/>
-        </w:rPr>
-      </w:pPr>
-      <w:r>
-        <w:rPr>
-          <w:i/>
-          <w:color w:val="auto"/>
-          <w:sz w:val="20"/>
-        </w:rPr>
         <w:t>Tabla 5. Comparación de desempeño entre modelos</w:t>
       </w:r>
     </w:p>
@@ -7311,7 +7764,7 @@
           <w:color w:val="auto"/>
         </w:rPr>
       </w:pPr>
-      <w:bookmarkStart w:id="27" w:name="_Toc236324024"/>
+      <w:bookmarkStart w:id="27" w:name="_Toc236395946"/>
       <w:r>
         <w:rPr>
           <w:color w:val="auto"/>
@@ -7353,7 +7806,7 @@
           <w:color w:val="auto"/>
         </w:rPr>
       </w:pPr>
-      <w:bookmarkStart w:id="28" w:name="_Toc236324025"/>
+      <w:bookmarkStart w:id="28" w:name="_Toc236395947"/>
       <w:r>
         <w:rPr>
           <w:color w:val="auto"/>
@@ -7382,7 +7835,7 @@
           <w:color w:val="auto"/>
         </w:rPr>
       </w:pPr>
-      <w:bookmarkStart w:id="29" w:name="_Toc236324026"/>
+      <w:bookmarkStart w:id="29" w:name="_Toc236395948"/>
       <w:r>
         <w:rPr>
           <w:color w:val="auto"/>
@@ -7401,14 +7854,7 @@
         <w:rPr>
           <w:color w:val="auto"/>
         </w:rPr>
-        <w:t xml:space="preserve">La implementación del sistema permitirá reducir las glosas mediante la detección temprana de servicios sin soporte, recuperar ingresos por la identificación de procedimientos no facturados y optimizar los </w:t>
-      </w:r>
-      <w:r>
-        <w:rPr>
-          <w:color w:val="auto"/>
-        </w:rPr>
-        <w:lastRenderedPageBreak/>
-        <w:t>recursos del equipo de auditoría al priorizar automáticamente los casos de mayor riesgo mediante el modelo XGBoost, en lugar de revisar la totalidad de las prefacturas de forma manual.</w:t>
+        <w:t>La implementación del sistema permitirá reducir las glosas mediante la detección temprana de servicios sin soporte, recuperar ingresos por la identificación de procedimientos no facturados y optimizar los recursos del equipo de auditoría al priorizar automáticamente los casos de mayor riesgo mediante el modelo XGBoost, en lugar de revisar la totalidad de las prefacturas de forma manual.</w:t>
       </w:r>
     </w:p>
     <w:p>
@@ -7434,7 +7880,7 @@
           <w:color w:val="auto"/>
         </w:rPr>
       </w:pPr>
-      <w:bookmarkStart w:id="30" w:name="_Toc236324027"/>
+      <w:bookmarkStart w:id="30" w:name="_Toc236395949"/>
       <w:r>
         <w:rPr>
           <w:color w:val="auto"/>
@@ -7451,7 +7897,7 @@
           <w:color w:val="auto"/>
         </w:rPr>
       </w:pPr>
-      <w:bookmarkStart w:id="31" w:name="_Toc236324028"/>
+      <w:bookmarkStart w:id="31" w:name="_Toc236395950"/>
       <w:r>
         <w:rPr>
           <w:color w:val="auto"/>
@@ -7480,7 +7926,7 @@
           <w:color w:val="auto"/>
         </w:rPr>
       </w:pPr>
-      <w:bookmarkStart w:id="32" w:name="_Toc236324029"/>
+      <w:bookmarkStart w:id="32" w:name="_Toc236395951"/>
       <w:r>
         <w:rPr>
           <w:color w:val="auto"/>
@@ -7509,7 +7955,7 @@
           <w:color w:val="auto"/>
         </w:rPr>
       </w:pPr>
-      <w:bookmarkStart w:id="33" w:name="_Toc236324030"/>
+      <w:bookmarkStart w:id="33" w:name="_Toc236395952"/>
       <w:r>
         <w:rPr>
           <w:color w:val="auto"/>
@@ -7538,7 +7984,7 @@
           <w:color w:val="auto"/>
         </w:rPr>
       </w:pPr>
-      <w:bookmarkStart w:id="34" w:name="_Toc236324031"/>
+      <w:bookmarkStart w:id="34" w:name="_Toc236395953"/>
       <w:r>
         <w:rPr>
           <w:color w:val="auto"/>
@@ -7561,32 +8007,31 @@
       </w:r>
     </w:p>
     <w:p>
-      <w:pPr/>
+      <w:pPr>
+        <w:pStyle w:val="Ttulo2"/>
+        <w:rPr>
+          <w:bCs w:val="0"/>
+          <w:color w:val="auto"/>
+        </w:rPr>
+      </w:pPr>
+      <w:bookmarkStart w:id="35" w:name="_Toc236395954"/>
       <w:r>
         <w:rPr>
-          <w:b w:val="0"/>
-        </w:rPr>
+          <w:bCs w:val="0"/>
+          <w:color w:val="auto"/>
+        </w:rPr>
+        <w:t>Uso de herramientas de IA en el desarrollo</w:t>
+      </w:r>
+      <w:bookmarkEnd w:id="35"/>
+    </w:p>
+    <w:p>
+      <w:r>
         <w:t>El uso de estas herramientas no estaba prohibido por la institución educativa y se realizó en cumplimiento de las normas de integridad académica: todo el código, los análisis y las decisiones finales fueron revisados, corregidos y asumidos por el equipo.</w:t>
       </w:r>
     </w:p>
     <w:p>
-      <w:pPr/>
       <w:r>
-        <w:rPr>
-          <w:b w:val="0"/>
-        </w:rPr>
         <w:t>Durante el desarrollo del sistema se utilizaron herramientas de inteligencia artificial generativa como apoyo para el diseño de la interfaz, la revisión de código y la corrección de errores. Estas herramientas no participaron en la definición del alcance clínico, en el diseño metodológico de los modelos ni en la interpretación de los resultados, los cuales fueron definidos y validados por el equipo del proyecto.</w:t>
-      </w:r>
-    </w:p>
-    <w:p>
-      <w:pPr>
-        <w:pStyle w:val="Ttulo2"/>
-      </w:pPr>
-      <w:r>
-        <w:rPr>
-          <w:b w:val="0"/>
-        </w:rPr>
-        <w:t>Uso de herramientas de IA en el desarrollo</w:t>
       </w:r>
     </w:p>
     <w:p>
@@ -7599,14 +8044,14 @@
           <w:color w:val="auto"/>
         </w:rPr>
       </w:pPr>
-      <w:bookmarkStart w:id="35" w:name="_Toc236324032"/>
+      <w:bookmarkStart w:id="36" w:name="_Toc236395955"/>
       <w:r>
         <w:rPr>
           <w:color w:val="auto"/>
         </w:rPr>
         <w:t>Cumplimiento normativo (Ley 1581/2012 e ISO/IEC 27001:2022)</w:t>
       </w:r>
-      <w:bookmarkEnd w:id="35"/>
+      <w:bookmarkEnd w:id="36"/>
     </w:p>
     <w:p>
       <w:pPr>
@@ -7628,14 +8073,15 @@
           <w:color w:val="auto"/>
         </w:rPr>
       </w:pPr>
-      <w:bookmarkStart w:id="36" w:name="_Toc236324033"/>
+      <w:bookmarkStart w:id="37" w:name="_Toc236395956"/>
       <w:r>
         <w:rPr>
           <w:color w:val="auto"/>
         </w:rPr>
+        <w:lastRenderedPageBreak/>
         <w:t>Documentación de cumplimiento</w:t>
       </w:r>
-      <w:bookmarkEnd w:id="36"/>
+      <w:bookmarkEnd w:id="37"/>
     </w:p>
     <w:p>
       <w:pPr>
@@ -7707,7 +8153,6 @@
         <w:rPr>
           <w:color w:val="auto"/>
         </w:rPr>
-        <w:lastRenderedPageBreak/>
         <w:t>Política de Retención y Supresión (POLITICA_RETENCION.md) — Plazos de retención por tipo de dato y mecanismos de eliminación segura.</w:t>
       </w:r>
     </w:p>
@@ -7748,14 +8193,14 @@
           <w:color w:val="auto"/>
         </w:rPr>
       </w:pPr>
-      <w:bookmarkStart w:id="37" w:name="_Toc236324034"/>
+      <w:bookmarkStart w:id="38" w:name="_Toc236395957"/>
       <w:r>
         <w:rPr>
           <w:color w:val="auto"/>
         </w:rPr>
         <w:t>Controles técnicos implementados</w:t>
       </w:r>
-      <w:bookmarkEnd w:id="37"/>
+      <w:bookmarkEnd w:id="38"/>
     </w:p>
     <w:p>
       <w:pPr>
@@ -7837,14 +8282,14 @@
           <w:color w:val="auto"/>
         </w:rPr>
       </w:pPr>
-      <w:bookmarkStart w:id="38" w:name="_Toc236324035"/>
+      <w:bookmarkStart w:id="39" w:name="_Toc236395958"/>
       <w:r>
         <w:rPr>
           <w:color w:val="auto"/>
         </w:rPr>
         <w:t>Actualizaciones en el frontend</w:t>
       </w:r>
-      <w:bookmarkEnd w:id="38"/>
+      <w:bookmarkEnd w:id="39"/>
     </w:p>
     <w:p>
       <w:pPr>
@@ -7911,14 +8356,15 @@
           <w:color w:val="auto"/>
         </w:rPr>
       </w:pPr>
-      <w:bookmarkStart w:id="39" w:name="_Toc236324036"/>
+      <w:bookmarkStart w:id="40" w:name="_Toc236395959"/>
       <w:r>
         <w:rPr>
           <w:color w:val="auto"/>
         </w:rPr>
+        <w:lastRenderedPageBreak/>
         <w:t>Estado actual y próximos pasos</w:t>
       </w:r>
-      <w:bookmarkEnd w:id="39"/>
+      <w:bookmarkEnd w:id="40"/>
     </w:p>
     <w:p>
       <w:pPr>
@@ -7969,7 +8415,7 @@
           <w:color w:val="auto"/>
         </w:rPr>
       </w:pPr>
-      <w:bookmarkStart w:id="40" w:name="_Toc236324037"/>
+      <w:bookmarkStart w:id="41" w:name="_Toc236395960"/>
       <w:r>
         <w:rPr>
           <w:color w:val="auto"/>
@@ -7977,7 +8423,7 @@
         <w:lastRenderedPageBreak/>
         <w:t>Enlaces y recursos</w:t>
       </w:r>
-      <w:bookmarkEnd w:id="40"/>
+      <w:bookmarkEnd w:id="41"/>
     </w:p>
     <w:p>
       <w:pPr>
@@ -8068,14 +8514,14 @@
           <w:color w:val="auto"/>
         </w:rPr>
       </w:pPr>
-      <w:bookmarkStart w:id="41" w:name="_Toc236324038"/>
+      <w:bookmarkStart w:id="42" w:name="_Toc236395961"/>
       <w:r>
         <w:rPr>
           <w:color w:val="auto"/>
         </w:rPr>
         <w:t>Equipo SICortex</w:t>
       </w:r>
-      <w:bookmarkEnd w:id="41"/>
+      <w:bookmarkEnd w:id="42"/>
     </w:p>
     <w:p>
       <w:pPr>
@@ -8084,14 +8530,14 @@
           <w:color w:val="auto"/>
         </w:rPr>
       </w:pPr>
-      <w:bookmarkStart w:id="42" w:name="_Toc236324039"/>
+      <w:bookmarkStart w:id="43" w:name="_Toc236395962"/>
       <w:r>
         <w:rPr>
           <w:color w:val="auto"/>
         </w:rPr>
         <w:t>Jefersson Aldair Oliveros (líder del proyecto)</w:t>
       </w:r>
-      <w:bookmarkEnd w:id="42"/>
+      <w:bookmarkEnd w:id="43"/>
     </w:p>
     <w:p>
       <w:pPr>
@@ -8113,14 +8559,14 @@
           <w:color w:val="auto"/>
         </w:rPr>
       </w:pPr>
-      <w:bookmarkStart w:id="43" w:name="_Toc236324040"/>
+      <w:bookmarkStart w:id="44" w:name="_Toc236395963"/>
       <w:r>
         <w:rPr>
           <w:color w:val="auto"/>
         </w:rPr>
         <w:t>Jazmine Acosta</w:t>
       </w:r>
-      <w:bookmarkEnd w:id="43"/>
+      <w:bookmarkEnd w:id="44"/>
     </w:p>
     <w:p>
       <w:pPr>
@@ -8142,14 +8588,14 @@
           <w:color w:val="auto"/>
         </w:rPr>
       </w:pPr>
-      <w:bookmarkStart w:id="44" w:name="_Toc236324041"/>
+      <w:bookmarkStart w:id="45" w:name="_Toc236395964"/>
       <w:r>
         <w:rPr>
           <w:color w:val="auto"/>
         </w:rPr>
         <w:t>Isabella Andrea Cuesta Niebles</w:t>
       </w:r>
-      <w:bookmarkEnd w:id="44"/>
+      <w:bookmarkEnd w:id="45"/>
     </w:p>
     <w:p>
       <w:pPr>
@@ -8171,14 +8617,14 @@
           <w:color w:val="auto"/>
         </w:rPr>
       </w:pPr>
-      <w:bookmarkStart w:id="45" w:name="_Toc236324042"/>
+      <w:bookmarkStart w:id="46" w:name="_Toc236395965"/>
       <w:r>
         <w:rPr>
           <w:color w:val="auto"/>
         </w:rPr>
         <w:t>Catalina del Rocío Pantoja Ordóñez</w:t>
       </w:r>
-      <w:bookmarkEnd w:id="45"/>
+      <w:bookmarkEnd w:id="46"/>
     </w:p>
     <w:p>
       <w:pPr>
@@ -8200,14 +8646,14 @@
           <w:color w:val="auto"/>
         </w:rPr>
       </w:pPr>
-      <w:bookmarkStart w:id="46" w:name="_Toc236324043"/>
+      <w:bookmarkStart w:id="47" w:name="_Toc236395966"/>
       <w:r>
         <w:rPr>
           <w:color w:val="auto"/>
         </w:rPr>
         <w:t>Iván Yesid Cristancho Plata</w:t>
       </w:r>
-      <w:bookmarkEnd w:id="46"/>
+      <w:bookmarkEnd w:id="47"/>
     </w:p>
     <w:p>
       <w:pPr>
@@ -8245,7 +8691,7 @@
           <w:color w:val="auto"/>
         </w:rPr>
       </w:pPr>
-      <w:bookmarkStart w:id="47" w:name="_Toc236324044"/>
+      <w:bookmarkStart w:id="48" w:name="_Toc236395967"/>
       <w:r>
         <w:rPr>
           <w:color w:val="auto"/>
@@ -8253,7 +8699,7 @@
         <w:lastRenderedPageBreak/>
         <w:t>Cronograma de ejecución</w:t>
       </w:r>
-      <w:bookmarkEnd w:id="47"/>
+      <w:bookmarkEnd w:id="48"/>
     </w:p>
     <w:p>
       <w:pPr>
@@ -8262,14 +8708,14 @@
           <w:color w:val="auto"/>
         </w:rPr>
       </w:pPr>
-      <w:bookmarkStart w:id="48" w:name="_Toc236324045"/>
+      <w:bookmarkStart w:id="49" w:name="_Toc236395968"/>
       <w:r>
         <w:rPr>
           <w:color w:val="auto"/>
         </w:rPr>
         <w:t>Fase 1 (13-19 de julio): datos y modelos base — completado</w:t>
       </w:r>
-      <w:bookmarkEnd w:id="48"/>
+      <w:bookmarkEnd w:id="49"/>
     </w:p>
     <w:p>
       <w:pPr>
@@ -8338,14 +8784,14 @@
           <w:color w:val="auto"/>
         </w:rPr>
       </w:pPr>
-      <w:bookmarkStart w:id="49" w:name="_Toc236324046"/>
+      <w:bookmarkStart w:id="50" w:name="_Toc236395969"/>
       <w:r>
         <w:rPr>
           <w:color w:val="auto"/>
         </w:rPr>
         <w:t>Fase 2 (20-24 de julio): modelado avanzado — completado</w:t>
       </w:r>
-      <w:bookmarkEnd w:id="49"/>
+      <w:bookmarkEnd w:id="50"/>
     </w:p>
     <w:p>
       <w:pPr>
@@ -8384,14 +8830,14 @@
           <w:color w:val="auto"/>
         </w:rPr>
       </w:pPr>
-      <w:bookmarkStart w:id="50" w:name="_Toc236324047"/>
+      <w:bookmarkStart w:id="51" w:name="_Toc236395970"/>
       <w:r>
         <w:rPr>
           <w:color w:val="auto"/>
         </w:rPr>
         <w:t>Fase 3 (24-26 de julio): interfaz y batch — completado</w:t>
       </w:r>
-      <w:bookmarkEnd w:id="50"/>
+      <w:bookmarkEnd w:id="51"/>
     </w:p>
     <w:p>
       <w:pPr>
@@ -8445,14 +8891,14 @@
           <w:color w:val="auto"/>
         </w:rPr>
       </w:pPr>
-      <w:bookmarkStart w:id="51" w:name="_Toc236324048"/>
+      <w:bookmarkStart w:id="52" w:name="_Toc236395971"/>
       <w:r>
         <w:rPr>
           <w:color w:val="auto"/>
         </w:rPr>
         <w:t>Fase 4 (27 de julio - 2 de agosto): consolidación — completado</w:t>
       </w:r>
-      <w:bookmarkEnd w:id="51"/>
+      <w:bookmarkEnd w:id="52"/>
     </w:p>
     <w:p>
       <w:pPr>
@@ -8476,14 +8922,14 @@
           <w:color w:val="auto"/>
         </w:rPr>
       </w:pPr>
-      <w:bookmarkStart w:id="52" w:name="_Toc236324049"/>
+      <w:bookmarkStart w:id="53" w:name="_Toc236395972"/>
       <w:r>
         <w:rPr>
           <w:color w:val="auto"/>
         </w:rPr>
         <w:t>Fase 5 (3-4 de agosto): cierre — en progreso</w:t>
       </w:r>
-      <w:bookmarkEnd w:id="52"/>
+      <w:bookmarkEnd w:id="53"/>
     </w:p>
     <w:p>
       <w:pPr>
@@ -8510,14 +8956,14 @@
           <w:color w:val="auto"/>
         </w:rPr>
       </w:pPr>
-      <w:bookmarkStart w:id="53" w:name="_Toc236324050"/>
+      <w:bookmarkStart w:id="54" w:name="_Toc236395973"/>
       <w:r>
         <w:rPr>
           <w:color w:val="auto"/>
         </w:rPr>
         <w:t>Conclusiones</w:t>
       </w:r>
-      <w:bookmarkEnd w:id="53"/>
+      <w:bookmarkEnd w:id="54"/>
     </w:p>
     <w:p>
       <w:pPr>

</xml_diff>

<commit_message>
docs: licencia MIT en espanol en LICENSE, landing e informe
- LICENSE traducido al espanol (MIT, copyright 2026 Equipo LINE)
- Landing: enlace 'Licencia MIT' en el footer
- Informe: nota de licencia en la seccion Enlaces y recursos
</commit_message>
<xml_diff>
--- a/documentacion/Informe_Tecnico_LINE_APA.docx
+++ b/documentacion/Informe_Tecnico_LINE_APA.docx
@@ -8502,6 +8502,11 @@
           <w:color w:val="auto"/>
         </w:rPr>
         <w:t>La documentación técnica incluye docs/README.md (documentación técnica completa), docs/workflow.html (diagrama visual del flujo de trabajo) y docs/MIGRATION.md (guía de migración a producción). El código fuente incluye server.py (backend FastAPI), frontend/index.html y frontend/app.js (interfaz de usuario), preprocesamiento.py (pipeline tabular-to-image para la CNN) y backend/xgboost_inferencia.py (inferencia del modelo XGBoost).</w:t>
+      </w:r>
+    </w:p>
+    <w:p>
+      <w:r>
+        <w:t>Licencia: el proyecto se distribuye bajo la Licencia MIT (copyright 2026, Equipo LINE — Auditor Médico Digital). El texto completo está disponible en el archivo LICENSE de los repositorios GitHub del proyecto.</w:t>
       </w:r>
     </w:p>
     <w:p>

</xml_diff>

<commit_message>
feat: actualiza informe con cifras de fuga, agrega validadores y uniforma metadatos de entrega
- Informe_Tecnico_LINE_APA.docx: incluye $78,046,000 COP y 152 procedimientos sin facturar
  en Contexto del problema e Impacto económico estimado (fuente: eda_hallazgos.md)
- Agrega scripts/: validate_cifras.py (consistencia de cifras entre landing/README/informe),
  uniformizar_metadatos.py (autor Jefersson, fechas de la semana, títulos/descripciones),
  actualizar_informe_cifras.py (inserción de cifras en el informe)
- Documento_Enlaces_Entrega.docx y Guion para video capstone: agregados a documentacion
- Metadatos Office uniformados (creator/lastModifiedBy Jefersson, created 2026-07-31)
- CUMPLIMIENTO_LEY1581_ISO27001.md: autor Jefersson, sección 6 refleja docs existentes en LINE/docs
- Elimina LINE-Auditor-Medico-Digital.pdf (export PPT con datos desactualizados)
</commit_message>
<xml_diff>
--- a/documentacion/Informe_Tecnico_LINE_APA.docx
+++ b/documentacion/Informe_Tecnico_LINE_APA.docx
@@ -18,20 +18,6 @@
     </w:p>
     <w:p>
       <w:pPr>
-        <w:rPr>
-          <w:color w:val="auto"/>
-        </w:rPr>
-      </w:pPr>
-    </w:p>
-    <w:p>
-      <w:pPr>
-        <w:rPr>
-          <w:color w:val="auto"/>
-        </w:rPr>
-      </w:pPr>
-    </w:p>
-    <w:p>
-      <w:pPr>
         <w:spacing w:after="600"/>
         <w:jc w:val="center"/>
         <w:rPr>
@@ -127,7 +113,7 @@
           <w:color w:val="auto"/>
           <w:sz w:val="23"/>
         </w:rPr>
-        <w:t>Jefersson Aldair Oliveros (líder)</w:t>
+        <w:t>Jefersson Aldair Oliveros Monroy (líder)</w:t>
       </w:r>
     </w:p>
     <w:p>
@@ -4563,7 +4549,7 @@
         <w:rPr>
           <w:color w:val="auto"/>
         </w:rPr>
-        <w:t>Fugas de ingresos: procedimientos realizados y registrados en HC que no aparecen en la prefactura.</w:t>
+        <w:t>Fugas de ingresos: procedimientos realizados y registrados en HC que no aparecen en la prefactura. En la base analizada (3,126 cruces) se identificaron 152 procedimientos con soporte clínico sin facturar, con una pérdida estimada de $78,046,000 COP (valoración con el precio de referencia de cada CUPS multiplicado por la cantidad realizada).</w:t>
       </w:r>
     </w:p>
     <w:p>
@@ -4971,6 +4957,7 @@
                 <w:color w:val="auto"/>
                 <w:sz w:val="21"/>
               </w:rPr>
+              <w:lastRenderedPageBreak/>
               <w:t>Historia clínica</w:t>
             </w:r>
           </w:p>
@@ -5098,7 +5085,6 @@
                 <w:color w:val="auto"/>
                 <w:sz w:val="21"/>
               </w:rPr>
-              <w:lastRenderedPageBreak/>
               <w:t>Tabla de cruce</w:t>
             </w:r>
           </w:p>
@@ -7867,6 +7853,26 @@
         <w:rPr>
           <w:color w:val="auto"/>
         </w:rPr>
+        <w:t xml:space="preserve">Sobre el conjunto de datos analizado (3,126 cruces, 649 inconsistentes, 20.8 %), la aplicación detectó 152 procedimientos con soporte clínico sin facturar, cuya pérdida estimada asciende a $78,046,000 COP </w:t>
+      </w:r>
+      <w:r>
+        <w:rPr>
+          <w:color w:val="auto"/>
+        </w:rPr>
+        <w:lastRenderedPageBreak/>
+        <w:t>(precio de referencia por CUPS × cantidad realizada). La detección temprana de estas fugas antes del envío a cobro permite a Health &amp; Life IPS SAS recuperar ingresos que actualmente se pierden en la auditoría retrospectiva.</w:t>
+      </w:r>
+    </w:p>
+    <w:p>
+      <w:pPr>
+        <w:rPr>
+          <w:color w:val="auto"/>
+        </w:rPr>
+      </w:pPr>
+      <w:r>
+        <w:rPr>
+          <w:color w:val="auto"/>
+        </w:rPr>
         <w:br w:type="page"/>
       </w:r>
     </w:p>
@@ -8389,20 +8395,49 @@
         <w:rPr>
           <w:color w:val="auto"/>
         </w:rPr>
-        <w:t>Para mayor detalle, consultar el documento completo en docs/CUMPLIMIENTO_LEY1581_ISO27001.md.</w:t>
-      </w:r>
-    </w:p>
-    <w:p>
-      <w:pPr>
-        <w:rPr>
-          <w:color w:val="auto"/>
-        </w:rPr>
-      </w:pPr>
-      <w:r>
-        <w:rPr>
-          <w:color w:val="auto"/>
-        </w:rPr>
-        <w:br w:type="page"/>
+        <w:t xml:space="preserve">Para mayor detalle, consultar el </w:t>
+      </w:r>
+      <w:proofErr w:type="spellStart"/>
+      <w:r>
+        <w:rPr>
+          <w:color w:val="auto"/>
+        </w:rPr>
+        <w:t>documento</w:t>
+      </w:r>
+      <w:proofErr w:type="spellEnd"/>
+      <w:r>
+        <w:rPr>
+          <w:color w:val="auto"/>
+        </w:rPr>
+        <w:t xml:space="preserve"> </w:t>
+      </w:r>
+      <w:proofErr w:type="spellStart"/>
+      <w:r>
+        <w:rPr>
+          <w:color w:val="auto"/>
+        </w:rPr>
+        <w:t>completo</w:t>
+      </w:r>
+      <w:proofErr w:type="spellEnd"/>
+      <w:r>
+        <w:rPr>
+          <w:color w:val="auto"/>
+        </w:rPr>
+        <w:t xml:space="preserve"> </w:t>
+      </w:r>
+      <w:proofErr w:type="spellStart"/>
+      <w:r>
+        <w:rPr>
+          <w:color w:val="auto"/>
+        </w:rPr>
+        <w:t>en</w:t>
+      </w:r>
+      <w:proofErr w:type="spellEnd"/>
+      <w:r>
+        <w:rPr>
+          <w:color w:val="auto"/>
+        </w:rPr>
+        <w:t xml:space="preserve"> docs/CUMPLIMIENTO_LEY1581_ISO27001.md.</w:t>
       </w:r>
     </w:p>
     <w:p>
@@ -8420,7 +8455,6 @@
         <w:rPr>
           <w:color w:val="auto"/>
         </w:rPr>
-        <w:lastRenderedPageBreak/>
         <w:t>Enlaces y recursos</w:t>
       </w:r>
       <w:bookmarkEnd w:id="41"/>
@@ -8479,16 +8513,21 @@
       </w:r>
     </w:p>
     <w:p>
-      <w:pPr>
-        <w:rPr>
-          <w:color w:val="auto"/>
-        </w:rPr>
-      </w:pPr>
-      <w:r>
-        <w:rPr>
-          <w:color w:val="auto"/>
-        </w:rPr>
-        <w:t>Workflow visual interactivo: https://jaoliverosm.github.io/LINE/workflow.html</w:t>
+      <w:r>
+        <w:t>Repositorio del proyecto completo (notebooks, modelos, datasets sintéticos): https://github.com/jaoliverosm/Capstone-</w:t>
+      </w:r>
+    </w:p>
+    <w:p>
+      <w:pPr>
+        <w:rPr>
+          <w:color w:val="auto"/>
+        </w:rPr>
+      </w:pPr>
+      <w:r>
+        <w:rPr>
+          <w:color w:val="auto"/>
+        </w:rPr>
+        <w:t>Workflow visual interactivo: https://jaoliverosm.github.io/Capstone-/</w:t>
       </w:r>
     </w:p>
     <w:p>
@@ -8506,9 +8545,29 @@
     </w:p>
     <w:p>
       <w:r>
-        <w:t>Licencia: el proyecto se distribuye bajo la Licencia MIT (copyright 2026, Equipo LINE — Auditor Médico Digital). El texto completo está disponible en el archivo LICENSE de los repositorios GitHub del proyecto.</w:t>
-      </w:r>
-    </w:p>
+        <w:t xml:space="preserve">Licencia: el proyecto se distribuye bajo la Licencia MIT (copyright 2026, Equipo LINE — Auditor Médico Digital). El texto completo está disponible en el archivo LICENSE de los </w:t>
+      </w:r>
+      <w:proofErr w:type="spellStart"/>
+      <w:r>
+        <w:t>repositorios</w:t>
+      </w:r>
+      <w:proofErr w:type="spellEnd"/>
+      <w:r>
+        <w:t xml:space="preserve"> GitHub del </w:t>
+      </w:r>
+      <w:proofErr w:type="spellStart"/>
+      <w:r>
+        <w:t>proyecto</w:t>
+      </w:r>
+      <w:proofErr w:type="spellEnd"/>
+      <w:r>
+        <w:t>.</w:t>
+      </w:r>
+    </w:p>
+    <w:p/>
+    <w:p/>
+    <w:p/>
+    <w:p/>
     <w:p>
       <w:pPr>
         <w:pStyle w:val="Ttulo1"/>
@@ -8524,9 +8583,18 @@
         <w:rPr>
           <w:color w:val="auto"/>
         </w:rPr>
-        <w:t>Equipo SICortex</w:t>
+        <w:lastRenderedPageBreak/>
+        <w:t xml:space="preserve">Equipo </w:t>
+      </w:r>
+      <w:proofErr w:type="spellStart"/>
+      <w:r>
+        <w:rPr>
+          <w:color w:val="auto"/>
+        </w:rPr>
+        <w:t>SICortex</w:t>
       </w:r>
       <w:bookmarkEnd w:id="42"/>
+      <w:proofErr w:type="spellEnd"/>
     </w:p>
     <w:p>
       <w:pPr>
@@ -8540,7 +8608,7 @@
         <w:rPr>
           <w:color w:val="auto"/>
         </w:rPr>
-        <w:t>Jefersson Aldair Oliveros (líder del proyecto)</w:t>
+        <w:t>Jefersson Aldair Oliveros Monroy (líder del proyecto)</w:t>
       </w:r>
       <w:bookmarkEnd w:id="43"/>
     </w:p>
@@ -8948,8 +9016,134 @@
         <w:rPr>
           <w:color w:val="auto"/>
         </w:rPr>
-        <w:t>Guion y grabación del video pitch (3 minutos), checklist final y entrega en la plataforma del Capstone.</w:t>
-      </w:r>
+        <w:t xml:space="preserve">Guion y grabación del video pitch (3 minutos), checklist final y entrega en la </w:t>
+      </w:r>
+      <w:proofErr w:type="spellStart"/>
+      <w:r>
+        <w:rPr>
+          <w:color w:val="auto"/>
+        </w:rPr>
+        <w:t>plataforma</w:t>
+      </w:r>
+      <w:proofErr w:type="spellEnd"/>
+      <w:r>
+        <w:rPr>
+          <w:color w:val="auto"/>
+        </w:rPr>
+        <w:t xml:space="preserve"> del Capstone.</w:t>
+      </w:r>
+    </w:p>
+    <w:p>
+      <w:pPr>
+        <w:pStyle w:val="Listaconvietas"/>
+        <w:numPr>
+          <w:ilvl w:val="0"/>
+          <w:numId w:val="0"/>
+        </w:numPr>
+        <w:spacing w:after="80"/>
+        <w:ind w:left="360" w:hanging="360"/>
+        <w:rPr>
+          <w:color w:val="auto"/>
+        </w:rPr>
+      </w:pPr>
+    </w:p>
+    <w:p>
+      <w:pPr>
+        <w:pStyle w:val="Listaconvietas"/>
+        <w:numPr>
+          <w:ilvl w:val="0"/>
+          <w:numId w:val="0"/>
+        </w:numPr>
+        <w:spacing w:after="80"/>
+        <w:ind w:left="360" w:hanging="360"/>
+        <w:rPr>
+          <w:color w:val="auto"/>
+        </w:rPr>
+      </w:pPr>
+    </w:p>
+    <w:p>
+      <w:pPr>
+        <w:pStyle w:val="Listaconvietas"/>
+        <w:numPr>
+          <w:ilvl w:val="0"/>
+          <w:numId w:val="0"/>
+        </w:numPr>
+        <w:spacing w:after="80"/>
+        <w:ind w:left="360" w:hanging="360"/>
+        <w:rPr>
+          <w:color w:val="auto"/>
+        </w:rPr>
+      </w:pPr>
+    </w:p>
+    <w:p>
+      <w:pPr>
+        <w:pStyle w:val="Listaconvietas"/>
+        <w:numPr>
+          <w:ilvl w:val="0"/>
+          <w:numId w:val="0"/>
+        </w:numPr>
+        <w:spacing w:after="80"/>
+        <w:ind w:left="360" w:hanging="360"/>
+        <w:rPr>
+          <w:color w:val="auto"/>
+        </w:rPr>
+      </w:pPr>
+    </w:p>
+    <w:p>
+      <w:pPr>
+        <w:pStyle w:val="Listaconvietas"/>
+        <w:numPr>
+          <w:ilvl w:val="0"/>
+          <w:numId w:val="0"/>
+        </w:numPr>
+        <w:spacing w:after="80"/>
+        <w:ind w:left="360" w:hanging="360"/>
+        <w:rPr>
+          <w:color w:val="auto"/>
+        </w:rPr>
+      </w:pPr>
+    </w:p>
+    <w:p>
+      <w:pPr>
+        <w:pStyle w:val="Listaconvietas"/>
+        <w:numPr>
+          <w:ilvl w:val="0"/>
+          <w:numId w:val="0"/>
+        </w:numPr>
+        <w:spacing w:after="80"/>
+        <w:ind w:left="360" w:hanging="360"/>
+        <w:rPr>
+          <w:color w:val="auto"/>
+        </w:rPr>
+      </w:pPr>
+    </w:p>
+    <w:p>
+      <w:pPr>
+        <w:pStyle w:val="Listaconvietas"/>
+        <w:numPr>
+          <w:ilvl w:val="0"/>
+          <w:numId w:val="0"/>
+        </w:numPr>
+        <w:spacing w:after="80"/>
+        <w:ind w:left="360" w:hanging="360"/>
+        <w:rPr>
+          <w:color w:val="auto"/>
+        </w:rPr>
+      </w:pPr>
+    </w:p>
+    <w:p>
+      <w:pPr>
+        <w:pStyle w:val="Listaconvietas"/>
+        <w:numPr>
+          <w:ilvl w:val="0"/>
+          <w:numId w:val="0"/>
+        </w:numPr>
+        <w:spacing w:after="80"/>
+        <w:ind w:left="360" w:hanging="360"/>
+        <w:rPr>
+          <w:color w:val="auto"/>
+        </w:rPr>
+      </w:pPr>
     </w:p>
     <w:p>
       <w:pPr>
@@ -8966,6 +9160,7 @@
         <w:rPr>
           <w:color w:val="auto"/>
         </w:rPr>
+        <w:lastRenderedPageBreak/>
         <w:t>Conclusiones</w:t>
       </w:r>
       <w:bookmarkEnd w:id="54"/>
@@ -8993,14 +9188,7 @@
         <w:rPr>
           <w:color w:val="auto"/>
         </w:rPr>
-        <w:t xml:space="preserve">Entre los logros principales se destacan el entrenamiento de una CNN MobileNetV2 mediante transfer learning como requisito del curso; la implementación de Random Forest como modelo de comparación para evaluar la conveniencia de un enfoque tabular; la optimización de XGBoost como modelo final de producción, con el mejor desempeño de los cuatro enfoques (AUC-ROC = 0.898); la integración de NVIDIA Nemotron como capa de validación cualitativa y razonamiento clínico; el desarrollo de una interfaz visual completa con análisis individual e importación masiva de hasta 20,000 registros; un </w:t>
-      </w:r>
-      <w:r>
-        <w:rPr>
-          <w:color w:val="auto"/>
-        </w:rPr>
-        <w:lastRenderedPageBreak/>
-        <w:t>selector de modelos sincronizado en toda la aplicación; filtros de resultados por recomendación; y una documentación técnica completa acompañada de un flujo de trabajo visual interactivo.</w:t>
+        <w:t>Entre los logros principales se destacan el entrenamiento de una CNN MobileNetV2 mediante transfer learning como requisito del curso; la implementación de Random Forest como modelo de comparación para evaluar la conveniencia de un enfoque tabular; la optimización de XGBoost como modelo final de producción, con el mejor desempeño de los cuatro enfoques (AUC-ROC = 0.898); la integración de NVIDIA Nemotron como capa de validación cualitativa y razonamiento clínico; el desarrollo de una interfaz visual completa con análisis individual e importación masiva de hasta 20,000 registros; un selector de modelos sincronizado en toda la aplicación; filtros de resultados por recomendación; y una documentación técnica completa acompañada de un flujo de trabajo visual interactivo.</w:t>
       </w:r>
     </w:p>
     <w:p>

</xml_diff>

<commit_message>
Actualizar documentación  para la entrega final de LINE
</commit_message>
<xml_diff>
--- a/documentacion/Informe_Tecnico_LINE_APA.docx
+++ b/documentacion/Informe_Tecnico_LINE_APA.docx
@@ -5914,7 +5914,6 @@
           <w:i/>
           <w:color w:val="auto"/>
         </w:rPr>
-        <w:lastRenderedPageBreak/>
         <w:t>Selector de modelos y navegación</w:t>
       </w:r>
       <w:bookmarkEnd w:id="20"/>
@@ -5929,7 +5928,14 @@
         <w:rPr>
           <w:color w:val="auto"/>
         </w:rPr>
-        <w:t>La interfaz permite alternar entre CNN local (MobileNetV2), XGBoost y NVIDIA Nemotron, con el selector sincronizado entre la barra lateral y la pantalla de importación masiva. La navegación incluye las secciones de validación (análisis individual), importación masiva y soporte, con estados activos sincronizados.</w:t>
+        <w:t xml:space="preserve">La interfaz permite alternar entre CNN local (MobileNetV2), XGBoost y NVIDIA Nemotron, con el selector sincronizado entre la barra lateral y la pantalla de importación masiva. La navegación incluye las </w:t>
+      </w:r>
+      <w:r>
+        <w:rPr>
+          <w:color w:val="auto"/>
+        </w:rPr>
+        <w:lastRenderedPageBreak/>
+        <w:t>secciones de validación (análisis individual), importación masiva y soporte, con estados activos sincronizados.</w:t>
       </w:r>
     </w:p>
     <w:p>
@@ -6730,29 +6736,23 @@
         <w:rPr>
           <w:color w:val="auto"/>
         </w:rPr>
-        <w:t xml:space="preserve">La Tabla 5 resume el desempeño de los tres modelos evaluados sobre el conjunto de prueba (30% estratificado, semilla fija). Las métricas de la CNN corresponden a la fase de fine-tuning con umbral ajustado para recall; las de XGBoost corresponden al modelo final tras la búsqueda de hiperparámetros y </w:t>
+        <w:t>La Tabla 5 resume el desempeño de los tres modelos evaluados sobre el conjunto de prueba (30% estratificado, semilla fija). Las métricas de la CNN corresponden a la fase de fine-tuning con umbral ajustado para recall; las de XGBoost corresponden al modelo final tras la búsqueda de hiperparámetros y la validación cruzada de 5 particiones (AUC promedio en validación cruzada = 0.881, DE = 0.011, sin señales de sobreajuste).</w:t>
       </w:r>
+    </w:p>
+    <w:p>
+      <w:pPr>
+        <w:spacing w:before="200" w:after="80"/>
+        <w:rPr>
+          <w:color w:val="auto"/>
+        </w:rPr>
+      </w:pPr>
       <w:r>
         <w:rPr>
-          <w:color w:val="auto"/>
+          <w:i/>
+          <w:color w:val="auto"/>
+          <w:sz w:val="20"/>
         </w:rPr>
         <w:lastRenderedPageBreak/>
-        <w:t>la validación cruzada de 5 particiones (AUC promedio en validación cruzada = 0.881, DE = 0.011, sin señales de sobreajuste).</w:t>
-      </w:r>
-    </w:p>
-    <w:p>
-      <w:pPr>
-        <w:spacing w:before="200" w:after="80"/>
-        <w:rPr>
-          <w:color w:val="auto"/>
-        </w:rPr>
-      </w:pPr>
-      <w:r>
-        <w:rPr>
-          <w:i/>
-          <w:color w:val="auto"/>
-          <w:sz w:val="20"/>
-        </w:rPr>
         <w:t>Tabla 5. Comparación de desempeño entre modelos</w:t>
       </w:r>
     </w:p>
@@ -7401,14 +7401,7 @@
         <w:rPr>
           <w:color w:val="auto"/>
         </w:rPr>
-        <w:t xml:space="preserve">La implementación del sistema permitirá reducir las glosas mediante la detección temprana de servicios sin soporte, recuperar ingresos por la identificación de procedimientos no facturados y optimizar los </w:t>
-      </w:r>
-      <w:r>
-        <w:rPr>
-          <w:color w:val="auto"/>
-        </w:rPr>
-        <w:lastRenderedPageBreak/>
-        <w:t>recursos del equipo de auditoría al priorizar automáticamente los casos de mayor riesgo mediante el modelo XGBoost, en lugar de revisar la totalidad de las prefacturas de forma manual.</w:t>
+        <w:t>La implementación del sistema permitirá reducir las glosas mediante la detección temprana de servicios sin soporte, recuperar ingresos por la identificación de procedimientos no facturados y optimizar los recursos del equipo de auditoría al priorizar automáticamente los casos de mayor riesgo mediante el modelo XGBoost, en lugar de revisar la totalidad de las prefacturas de forma manual.</w:t>
       </w:r>
     </w:p>
     <w:p>
@@ -7960,7 +7953,7 @@
         <w:rPr>
           <w:color w:val="auto"/>
         </w:rPr>
-        <w:t>La documentación completa del proyecto está disponible en Google Drive, y el código fuente en el repositorio de GitHub del equipo.</w:t>
+        <w:t>La documentación completa del proyecto está disponible en el repositorio de GitHub del equipo.</w:t>
       </w:r>
     </w:p>
     <w:p>
@@ -7979,54 +7972,103 @@
     </w:p>
     <w:p>
       <w:pPr>
-        <w:rPr>
-          <w:color w:val="auto"/>
-        </w:rPr>
-      </w:pPr>
+        <w:pStyle w:val="font-claude-response-body"/>
+      </w:pPr>
+      <w:bookmarkStart w:id="41" w:name="_Toc236324038"/>
       <w:r>
         <w:rPr>
-          <w:color w:val="auto"/>
-        </w:rPr>
-        <w:t>https://drive.google.com/drive/folders/13w78m3a5kGRROesVvLmLKQmGVsA5aUqv?usp=drive_link</w:t>
+          <w:rStyle w:val="Fuerte"/>
+        </w:rPr>
+        <w:t>Enlaces y recursos</w:t>
       </w:r>
     </w:p>
     <w:p>
       <w:pPr>
-        <w:rPr>
-          <w:color w:val="auto"/>
-        </w:rPr>
+        <w:pStyle w:val="font-claude-response-body"/>
       </w:pPr>
       <w:r>
-        <w:rPr>
-          <w:color w:val="auto"/>
-        </w:rPr>
-        <w:t>Repositorio: https://github.com/jaoliverosm/LINE</w:t>
+        <w:t>La documentación completa del proyecto, el código fuente y la landing interactiva están disponibles públicamente en GitHub, sin necesidad de iniciar sesión.</w:t>
       </w:r>
     </w:p>
     <w:p>
       <w:pPr>
-        <w:rPr>
-          <w:color w:val="auto"/>
-        </w:rPr>
+        <w:pStyle w:val="font-claude-response-body"/>
+        <w:numPr>
+          <w:ilvl w:val="0"/>
+          <w:numId w:val="10"/>
+        </w:numPr>
       </w:pPr>
       <w:r>
-        <w:rPr>
-          <w:color w:val="auto"/>
-        </w:rPr>
-        <w:t>Workflow visual interactivo: https://jaoliverosm.github.io/LINE/workflow.html</w:t>
+        <w:t xml:space="preserve">Landing interactiva del proyecto (workflow, métricas, documentación): </w:t>
       </w:r>
-    </w:p>
-    <w:p>
-      <w:pPr>
-        <w:rPr>
-          <w:color w:val="auto"/>
-        </w:rPr>
+      <w:hyperlink r:id="rId8" w:history="1">
+        <w:r>
+          <w:rPr>
+            <w:rStyle w:val="Hipervnculo"/>
+          </w:rPr>
+          <w:t>https://jaoliverosm.github.io/Capstone-/</w:t>
+        </w:r>
+      </w:hyperlink>
+    </w:p>
+    <w:p>
+      <w:pPr>
+        <w:pStyle w:val="font-claude-response-body"/>
+        <w:numPr>
+          <w:ilvl w:val="0"/>
+          <w:numId w:val="10"/>
+        </w:numPr>
       </w:pPr>
       <w:r>
-        <w:rPr>
-          <w:color w:val="auto"/>
-        </w:rPr>
-        <w:t>La documentación técnica incluye docs/README.md (documentación técnica completa), docs/workflow.html (diagrama visual del flujo de trabajo) y docs/MIGRATION.md (guía de migración a producción). El código fuente incluye server.py (backend FastAPI), frontend/index.html y frontend/app.js (interfaz de usuario), preprocesamiento.py (pipeline tabular-to-image para la CNN) y backend/xgboost_inferencia.py (inferencia del modelo XGBoost).</w:t>
+        <w:t xml:space="preserve">Repositorio de la aplicación LINE (backend FastAPI, frontend, modelos): </w:t>
+      </w:r>
+      <w:hyperlink r:id="rId9" w:history="1">
+        <w:r>
+          <w:rPr>
+            <w:rStyle w:val="Hipervnculo"/>
+          </w:rPr>
+          <w:t>https://github.com/jaoliverosm/LINE</w:t>
+        </w:r>
+      </w:hyperlink>
+    </w:p>
+    <w:p>
+      <w:pPr>
+        <w:pStyle w:val="font-claude-response-body"/>
+        <w:numPr>
+          <w:ilvl w:val="0"/>
+          <w:numId w:val="10"/>
+        </w:numPr>
+      </w:pPr>
+      <w:r>
+        <w:t xml:space="preserve">Repositorio completo del proyecto (notebooks, modelos, datasets sintéticos, informes): </w:t>
+      </w:r>
+      <w:hyperlink r:id="rId10" w:history="1">
+        <w:r>
+          <w:rPr>
+            <w:rStyle w:val="Hipervnculo"/>
+          </w:rPr>
+          <w:t>https://github.com/jaoliverosm/Capstone-</w:t>
+        </w:r>
+      </w:hyperlink>
+    </w:p>
+    <w:p>
+      <w:pPr>
+        <w:pStyle w:val="font-claude-response-body"/>
+        <w:numPr>
+          <w:ilvl w:val="0"/>
+          <w:numId w:val="10"/>
+        </w:numPr>
+      </w:pPr>
+      <w:r>
+        <w:t xml:space="preserve">Documentación completa: carpeta </w:t>
+      </w:r>
+      <w:r>
+        <w:rPr>
+          <w:rStyle w:val="CdigoHTML"/>
+        </w:rPr>
+        <w:t>documentacion</w:t>
+      </w:r>
+      <w:r>
+        <w:t xml:space="preserve"> dentro del repositorio Capstone-</w:t>
       </w:r>
     </w:p>
     <w:p>
@@ -8039,7 +8081,6 @@
           <w:color w:val="auto"/>
         </w:rPr>
       </w:pPr>
-      <w:bookmarkStart w:id="41" w:name="_Toc236324038"/>
       <w:r>
         <w:rPr>
           <w:color w:val="auto"/>
@@ -8579,10 +8620,10 @@
       </w:r>
     </w:p>
     <w:sectPr>
-      <w:headerReference w:type="default" r:id="rId8"/>
-      <w:footerReference w:type="default" r:id="rId9"/>
-      <w:headerReference w:type="first" r:id="rId10"/>
-      <w:footerReference w:type="first" r:id="rId11"/>
+      <w:headerReference w:type="default" r:id="rId11"/>
+      <w:footerReference w:type="default" r:id="rId12"/>
+      <w:headerReference w:type="first" r:id="rId13"/>
+      <w:footerReference w:type="first" r:id="rId14"/>
       <w:pgSz w:w="12240" w:h="15840"/>
       <w:pgMar w:top="1247" w:right="1417" w:bottom="1247" w:left="1417" w:header="720" w:footer="720" w:gutter="0"/>
       <w:cols w:space="720"/>
@@ -8715,23 +8756,7 @@
         <w:color w:val="404040"/>
         <w:sz w:val="18"/>
       </w:rPr>
-      <w:t xml:space="preserve">LINE — Auditor Médico </w:t>
-    </w:r>
-    <w:proofErr w:type="gramStart"/>
-    <w:r>
-      <w:rPr>
-        <w:color w:val="404040"/>
-        <w:sz w:val="18"/>
-      </w:rPr>
-      <w:t>Digital  |</w:t>
-    </w:r>
-    <w:proofErr w:type="gramEnd"/>
-    <w:r>
-      <w:rPr>
-        <w:color w:val="404040"/>
-        <w:sz w:val="18"/>
-      </w:rPr>
-      <w:t xml:space="preserve">  Informe Técnico</w:t>
+      <w:t>LINE — Auditor Médico Digital  |  Informe Técnico</w:t>
     </w:r>
   </w:p>
 </w:hdr>
@@ -8917,6 +8942,155 @@
       </w:pPr>
       <w:rPr>
         <w:rFonts w:ascii="Symbol" w:hAnsi="Symbol" w:hint="default"/>
+      </w:rPr>
+    </w:lvl>
+  </w:abstractNum>
+  <w:abstractNum w:abstractNumId="9" w15:restartNumberingAfterBreak="0">
+    <w:nsid w:val="6E9518F7"/>
+    <w:multiLevelType w:val="multilevel"/>
+    <w:tmpl w:val="C99E6BD6"/>
+    <w:lvl w:ilvl="0">
+      <w:start w:val="1"/>
+      <w:numFmt w:val="bullet"/>
+      <w:lvlText w:val=""/>
+      <w:lvlJc w:val="left"/>
+      <w:pPr>
+        <w:tabs>
+          <w:tab w:val="num" w:pos="720"/>
+        </w:tabs>
+        <w:ind w:left="720" w:hanging="360"/>
+      </w:pPr>
+      <w:rPr>
+        <w:rFonts w:ascii="Symbol" w:hAnsi="Symbol" w:hint="default"/>
+        <w:sz w:val="20"/>
+      </w:rPr>
+    </w:lvl>
+    <w:lvl w:ilvl="1" w:tentative="1">
+      <w:start w:val="1"/>
+      <w:numFmt w:val="bullet"/>
+      <w:lvlText w:val="o"/>
+      <w:lvlJc w:val="left"/>
+      <w:pPr>
+        <w:tabs>
+          <w:tab w:val="num" w:pos="1440"/>
+        </w:tabs>
+        <w:ind w:left="1440" w:hanging="360"/>
+      </w:pPr>
+      <w:rPr>
+        <w:rFonts w:ascii="Courier New" w:hAnsi="Courier New" w:hint="default"/>
+        <w:sz w:val="20"/>
+      </w:rPr>
+    </w:lvl>
+    <w:lvl w:ilvl="2" w:tentative="1">
+      <w:start w:val="1"/>
+      <w:numFmt w:val="bullet"/>
+      <w:lvlText w:val=""/>
+      <w:lvlJc w:val="left"/>
+      <w:pPr>
+        <w:tabs>
+          <w:tab w:val="num" w:pos="2160"/>
+        </w:tabs>
+        <w:ind w:left="2160" w:hanging="360"/>
+      </w:pPr>
+      <w:rPr>
+        <w:rFonts w:ascii="Wingdings" w:hAnsi="Wingdings" w:hint="default"/>
+        <w:sz w:val="20"/>
+      </w:rPr>
+    </w:lvl>
+    <w:lvl w:ilvl="3" w:tentative="1">
+      <w:start w:val="1"/>
+      <w:numFmt w:val="bullet"/>
+      <w:lvlText w:val=""/>
+      <w:lvlJc w:val="left"/>
+      <w:pPr>
+        <w:tabs>
+          <w:tab w:val="num" w:pos="2880"/>
+        </w:tabs>
+        <w:ind w:left="2880" w:hanging="360"/>
+      </w:pPr>
+      <w:rPr>
+        <w:rFonts w:ascii="Wingdings" w:hAnsi="Wingdings" w:hint="default"/>
+        <w:sz w:val="20"/>
+      </w:rPr>
+    </w:lvl>
+    <w:lvl w:ilvl="4" w:tentative="1">
+      <w:start w:val="1"/>
+      <w:numFmt w:val="bullet"/>
+      <w:lvlText w:val=""/>
+      <w:lvlJc w:val="left"/>
+      <w:pPr>
+        <w:tabs>
+          <w:tab w:val="num" w:pos="3600"/>
+        </w:tabs>
+        <w:ind w:left="3600" w:hanging="360"/>
+      </w:pPr>
+      <w:rPr>
+        <w:rFonts w:ascii="Wingdings" w:hAnsi="Wingdings" w:hint="default"/>
+        <w:sz w:val="20"/>
+      </w:rPr>
+    </w:lvl>
+    <w:lvl w:ilvl="5" w:tentative="1">
+      <w:start w:val="1"/>
+      <w:numFmt w:val="bullet"/>
+      <w:lvlText w:val=""/>
+      <w:lvlJc w:val="left"/>
+      <w:pPr>
+        <w:tabs>
+          <w:tab w:val="num" w:pos="4320"/>
+        </w:tabs>
+        <w:ind w:left="4320" w:hanging="360"/>
+      </w:pPr>
+      <w:rPr>
+        <w:rFonts w:ascii="Wingdings" w:hAnsi="Wingdings" w:hint="default"/>
+        <w:sz w:val="20"/>
+      </w:rPr>
+    </w:lvl>
+    <w:lvl w:ilvl="6" w:tentative="1">
+      <w:start w:val="1"/>
+      <w:numFmt w:val="bullet"/>
+      <w:lvlText w:val=""/>
+      <w:lvlJc w:val="left"/>
+      <w:pPr>
+        <w:tabs>
+          <w:tab w:val="num" w:pos="5040"/>
+        </w:tabs>
+        <w:ind w:left="5040" w:hanging="360"/>
+      </w:pPr>
+      <w:rPr>
+        <w:rFonts w:ascii="Wingdings" w:hAnsi="Wingdings" w:hint="default"/>
+        <w:sz w:val="20"/>
+      </w:rPr>
+    </w:lvl>
+    <w:lvl w:ilvl="7" w:tentative="1">
+      <w:start w:val="1"/>
+      <w:numFmt w:val="bullet"/>
+      <w:lvlText w:val=""/>
+      <w:lvlJc w:val="left"/>
+      <w:pPr>
+        <w:tabs>
+          <w:tab w:val="num" w:pos="5760"/>
+        </w:tabs>
+        <w:ind w:left="5760" w:hanging="360"/>
+      </w:pPr>
+      <w:rPr>
+        <w:rFonts w:ascii="Wingdings" w:hAnsi="Wingdings" w:hint="default"/>
+        <w:sz w:val="20"/>
+      </w:rPr>
+    </w:lvl>
+    <w:lvl w:ilvl="8" w:tentative="1">
+      <w:start w:val="1"/>
+      <w:numFmt w:val="bullet"/>
+      <w:lvlText w:val=""/>
+      <w:lvlJc w:val="left"/>
+      <w:pPr>
+        <w:tabs>
+          <w:tab w:val="num" w:pos="6480"/>
+        </w:tabs>
+        <w:ind w:left="6480" w:hanging="360"/>
+      </w:pPr>
+      <w:rPr>
+        <w:rFonts w:ascii="Wingdings" w:hAnsi="Wingdings" w:hint="default"/>
+        <w:sz w:val="20"/>
       </w:rPr>
     </w:lvl>
   </w:abstractNum>
@@ -8946,6 +9120,9 @@
   </w:num>
   <w:num w:numId="9" w16cid:durableId="155608405">
     <w:abstractNumId w:val="0"/>
+  </w:num>
+  <w:num w:numId="10" w16cid:durableId="1200509312">
+    <w:abstractNumId w:val="9"/>
   </w:num>
 </w:numbering>
 </file>
@@ -20583,6 +20760,34 @@
       </w:tcPr>
     </w:tblStylePr>
   </w:style>
+  <w:style w:type="paragraph" w:customStyle="1" w:styleId="font-claude-response-body">
+    <w:name w:val="font-claude-response-body"/>
+    <w:basedOn w:val="Normal"/>
+    <w:rsid w:val="00BD2E69"/>
+    <w:pPr>
+      <w:spacing w:before="100" w:beforeAutospacing="1" w:after="100" w:afterAutospacing="1" w:line="240" w:lineRule="auto"/>
+    </w:pPr>
+    <w:rPr>
+      <w:rFonts w:ascii="Times New Roman" w:eastAsia="Times New Roman" w:hAnsi="Times New Roman" w:cs="Times New Roman"/>
+      <w:color w:val="auto"/>
+      <w:sz w:val="24"/>
+      <w:szCs w:val="24"/>
+      <w:lang w:val="es-CO" w:eastAsia="es-CO"/>
+    </w:rPr>
+  </w:style>
+  <w:style w:type="character" w:styleId="CdigoHTML">
+    <w:name w:val="HTML Code"/>
+    <w:basedOn w:val="Fuentedeprrafopredeter"/>
+    <w:uiPriority w:val="99"/>
+    <w:semiHidden/>
+    <w:unhideWhenUsed/>
+    <w:rsid w:val="00BD2E69"/>
+    <w:rPr>
+      <w:rFonts w:ascii="Courier New" w:eastAsia="Times New Roman" w:hAnsi="Courier New" w:cs="Courier New"/>
+      <w:sz w:val="20"/>
+      <w:szCs w:val="20"/>
+    </w:rPr>
+  </w:style>
 </w:styles>
 </file>
 

</xml_diff>